<commit_message>
feat: add task 2
</commit_message>
<xml_diff>
--- a/lab1.docx
+++ b/lab1.docx
@@ -740,6 +740,150 @@
     <w:p>
       <w:pPr>
         <w:pStyle w:val="Normal"/>
+        <w:widowControl/>
+        <w:tabs>
+          <w:tab w:val="clear" w:pos="567"/>
+        </w:tabs>
+        <w:suppressAutoHyphens w:val="true"/>
+        <w:bidi w:val="0"/>
+        <w:spacing w:lineRule="auto" w:line="360" w:before="0" w:after="0"/>
+        <w:ind w:firstLine="850" w:start="0" w:end="0"/>
+        <w:jc w:val="both"/>
+        <w:rPr/>
+      </w:pPr>
+      <w:r>
+        <w:rPr>
+          <w:rStyle w:val="qv3wpe"/>
+          <w:rFonts w:eastAsia="Helvetica-Bold"/>
+          <w:b/>
+          <w:bCs/>
+          <w:sz w:val="28"/>
+          <w:szCs w:val="28"/>
+          <w:lang w:val="en-US"/>
+        </w:rPr>
+        <w:t>Завдання 2.</w:t>
+      </w:r>
+      <w:r>
+        <w:rPr>
+          <w:rStyle w:val="qv3wpe"/>
+          <w:rFonts w:eastAsia="Helvetica-Bold"/>
+          <w:sz w:val="28"/>
+          <w:szCs w:val="28"/>
+          <w:lang w:val="en-US"/>
+        </w:rPr>
+        <w:t xml:space="preserve"> Навести приклади 3-х систем різної фізичної природи і пояснити, що обрані об’єкти, процеси, явища, ситуації тощо, представляють собою систему (згідно з визначенням категорії «система»).</w:t>
+      </w:r>
+    </w:p>
+    <w:p>
+      <w:pPr>
+        <w:pStyle w:val="Normal"/>
+        <w:widowControl/>
+        <w:tabs>
+          <w:tab w:val="clear" w:pos="567"/>
+        </w:tabs>
+        <w:suppressAutoHyphens w:val="true"/>
+        <w:bidi w:val="0"/>
+        <w:spacing w:lineRule="auto" w:line="360" w:before="0" w:after="0"/>
+        <w:ind w:firstLine="850" w:start="0" w:end="0"/>
+        <w:jc w:val="both"/>
+        <w:rPr/>
+      </w:pPr>
+      <w:r>
+        <w:rPr>
+          <w:rFonts w:eastAsia="Helvetica-Bold"/>
+          <w:b/>
+          <w:sz w:val="28"/>
+          <w:szCs w:val="28"/>
+          <w:lang w:val="en-US"/>
+        </w:rPr>
+        <w:t>Квітка.</w:t>
+      </w:r>
+      <w:r>
+        <w:rPr>
+          <w:rFonts w:eastAsia="Helvetica-Bold"/>
+          <w:sz w:val="28"/>
+          <w:szCs w:val="28"/>
+          <w:lang w:val="en-US"/>
+        </w:rPr>
+        <w:t xml:space="preserve"> Складається з коріння, стебла та пелюсток. Ціль - це розмноження та фотосинтез. Всі органи взаємозалежні для виживання цілого.</w:t>
+      </w:r>
+    </w:p>
+    <w:p>
+      <w:pPr>
+        <w:pStyle w:val="Normal"/>
+        <w:widowControl/>
+        <w:tabs>
+          <w:tab w:val="clear" w:pos="567"/>
+        </w:tabs>
+        <w:suppressAutoHyphens w:val="true"/>
+        <w:bidi w:val="0"/>
+        <w:spacing w:lineRule="auto" w:line="360" w:before="0" w:after="0"/>
+        <w:ind w:firstLine="850" w:start="0" w:end="0"/>
+        <w:jc w:val="both"/>
+        <w:rPr/>
+      </w:pPr>
+      <w:r>
+        <w:rPr>
+          <w:rFonts w:eastAsia="Helvetica-Bold"/>
+          <w:b/>
+          <w:sz w:val="28"/>
+          <w:szCs w:val="28"/>
+          <w:lang w:val="en-US"/>
+        </w:rPr>
+        <w:t>Сім'я.</w:t>
+      </w:r>
+      <w:r>
+        <w:rPr>
+          <w:rFonts w:eastAsia="Helvetica-Bold"/>
+          <w:sz w:val="28"/>
+          <w:szCs w:val="28"/>
+          <w:lang w:val="en-US"/>
+        </w:rPr>
+        <w:t xml:space="preserve"> Колектив людей, пов'язаних родинними зв'язками та спільним побутом. Ціль - це виховання дітей та взаємопідтримка.</w:t>
+      </w:r>
+    </w:p>
+    <w:p>
+      <w:pPr>
+        <w:pStyle w:val="BodyText"/>
+        <w:widowControl/>
+        <w:tabs>
+          <w:tab w:val="clear" w:pos="567"/>
+        </w:tabs>
+        <w:suppressAutoHyphens w:val="true"/>
+        <w:bidi w:val="0"/>
+        <w:spacing w:lineRule="auto" w:line="360" w:before="0" w:after="140"/>
+        <w:ind w:firstLine="850" w:start="0" w:end="0"/>
+        <w:jc w:val="both"/>
+        <w:rPr>
+          <w:rFonts w:eastAsia="Helvetica-Bold"/>
+          <w:sz w:val="28"/>
+          <w:szCs w:val="28"/>
+          <w:lang w:val="en-US"/>
+        </w:rPr>
+      </w:pPr>
+      <w:r>
+        <w:rPr>
+          <w:rFonts w:eastAsia="Helvetica-Bold"/>
+          <w:b/>
+          <w:sz w:val="28"/>
+          <w:szCs w:val="28"/>
+          <w:lang w:val="en-US"/>
+        </w:rPr>
+        <w:t>Сонячна система.</w:t>
+      </w:r>
+      <w:r>
+        <w:rPr>
+          <w:rFonts w:eastAsia="Helvetica-Bold"/>
+          <w:sz w:val="28"/>
+          <w:szCs w:val="28"/>
+          <w:lang w:val="en-US"/>
+        </w:rPr>
+        <w:t xml:space="preserve"> Сукупність Сонця, планет, їхніх супутників та астероїдів. Ціль - це гравітаційна рівновага та рух космічних тіл.</w:t>
+      </w:r>
+    </w:p>
+    <w:p>
+      <w:pPr>
+        <w:pStyle w:val="Normal"/>
         <w:tabs>
           <w:tab w:val="clear" w:pos="567"/>
         </w:tabs>
@@ -824,7 +968,7 @@
       <mc:AlternateContent>
         <mc:Choice Requires="wpg">
           <w:drawing>
-            <wp:anchor behindDoc="1" distT="13335" distB="12065" distL="13335" distR="12065" simplePos="0" locked="0" layoutInCell="1" allowOverlap="1" relativeHeight="2" wp14:anchorId="10994A40">
+            <wp:anchor behindDoc="1" distT="13335" distB="12065" distL="13335" distR="12065" simplePos="0" locked="0" layoutInCell="1" allowOverlap="1" relativeHeight="13" wp14:anchorId="10994A40">
               <wp:simplePos x="0" y="0"/>
               <wp:positionH relativeFrom="column">
                 <wp:posOffset>-229235</wp:posOffset>
@@ -832,7 +976,7 @@
               <wp:positionV relativeFrom="paragraph">
                 <wp:posOffset>-266065</wp:posOffset>
               </wp:positionV>
-              <wp:extent cx="6658610" cy="10294620"/>
+              <wp:extent cx="6657340" cy="10293350"/>
               <wp:effectExtent l="13335" t="13335" r="12065" b="12065"/>
               <wp:wrapNone/>
               <wp:docPr id="1" name="Группа 60"/>
@@ -843,9 +987,9 @@
                     <wpg:grpSpPr>
                       <a:xfrm>
                         <a:off x="0" y="0"/>
-                        <a:ext cx="6658560" cy="10294560"/>
+                        <a:ext cx="6657480" cy="10293480"/>
                         <a:chOff x="0" y="0"/>
-                        <a:chExt cx="6658560" cy="10294560"/>
+                        <a:chExt cx="6657480" cy="10293480"/>
                       </a:xfrm>
                     </wpg:grpSpPr>
                     <wps:wsp>
@@ -854,7 +998,7 @@
                       <wps:spPr>
                         <a:xfrm>
                           <a:off x="748080" y="9753120"/>
-                          <a:ext cx="867960" cy="179640"/>
+                          <a:ext cx="866880" cy="178560"/>
                         </a:xfrm>
                         <a:prstGeom prst="rect">
                           <a:avLst/>
@@ -931,7 +1075,7 @@
                       <wpg:grpSpPr>
                         <a:xfrm>
                           <a:off x="0" y="0"/>
-                          <a:ext cx="6658560" cy="10294560"/>
+                          <a:ext cx="6657480" cy="10293480"/>
                         </a:xfrm>
                       </wpg:grpSpPr>
                       <wpg:grpSp>
@@ -939,7 +1083,7 @@
                         <wpg:grpSpPr>
                           <a:xfrm>
                             <a:off x="0" y="0"/>
-                            <a:ext cx="6658560" cy="10294560"/>
+                            <a:ext cx="6657480" cy="10293480"/>
                           </a:xfrm>
                         </wpg:grpSpPr>
                         <wps:wsp>
@@ -948,7 +1092,7 @@
                           <wps:spPr>
                             <a:xfrm>
                               <a:off x="0" y="0"/>
-                              <a:ext cx="6658560" cy="10294560"/>
+                              <a:ext cx="6657480" cy="10293480"/>
                             </a:xfrm>
                             <a:prstGeom prst="rect">
                               <a:avLst/>
@@ -1225,7 +1369,7 @@
                           <wps:spPr>
                             <a:xfrm>
                               <a:off x="17640" y="10120680"/>
-                              <a:ext cx="332280" cy="158040"/>
+                              <a:ext cx="330840" cy="156960"/>
                             </a:xfrm>
                             <a:prstGeom prst="rect">
                               <a:avLst/>
@@ -1272,7 +1416,7 @@
                           <wps:spPr>
                             <a:xfrm>
                               <a:off x="379080" y="10120680"/>
-                              <a:ext cx="332280" cy="158040"/>
+                              <a:ext cx="330840" cy="156960"/>
                             </a:xfrm>
                             <a:prstGeom prst="rect">
                               <a:avLst/>
@@ -1319,7 +1463,7 @@
                           <wps:spPr>
                             <a:xfrm>
                               <a:off x="754920" y="10120680"/>
-                              <a:ext cx="855360" cy="158040"/>
+                              <a:ext cx="853920" cy="156960"/>
                             </a:xfrm>
                             <a:prstGeom prst="rect">
                               <a:avLst/>
@@ -1453,7 +1597,7 @@
                           <wps:spPr>
                             <a:xfrm>
                               <a:off x="1659240" y="10120680"/>
-                              <a:ext cx="509760" cy="158040"/>
+                              <a:ext cx="508680" cy="156960"/>
                             </a:xfrm>
                             <a:prstGeom prst="rect">
                               <a:avLst/>
@@ -1500,7 +1644,7 @@
                           <wps:spPr>
                             <a:xfrm>
                               <a:off x="2198880" y="10120680"/>
-                              <a:ext cx="332280" cy="158040"/>
+                              <a:ext cx="330840" cy="156960"/>
                             </a:xfrm>
                             <a:prstGeom prst="rect">
                               <a:avLst/>
@@ -1547,7 +1691,7 @@
                           <wps:spPr>
                             <a:xfrm>
                               <a:off x="6310080" y="9769320"/>
-                              <a:ext cx="332280" cy="157320"/>
+                              <a:ext cx="330840" cy="156240"/>
                             </a:xfrm>
                             <a:prstGeom prst="rect">
                               <a:avLst/>
@@ -1594,7 +1738,7 @@
                           <wps:spPr>
                             <a:xfrm>
                               <a:off x="6310080" y="10005120"/>
-                              <a:ext cx="332280" cy="216360"/>
+                              <a:ext cx="330840" cy="215280"/>
                             </a:xfrm>
                             <a:prstGeom prst="rect">
                               <a:avLst/>
@@ -1659,7 +1803,7 @@
                                     <w:sz w:val="24"/>
                                     <w:lang w:val="ru-RU"/>
                                   </w:rPr>
-                                  <w:t>2</w:t>
+                                  <w:t>3</w:t>
                                 </w:r>
                                 <w:r>
                                   <w:rPr>
@@ -1682,7 +1826,7 @@
                           <wps:spPr>
                             <a:xfrm>
                               <a:off x="2578680" y="9894600"/>
-                              <a:ext cx="3686760" cy="244440"/>
+                              <a:ext cx="3685680" cy="243360"/>
                             </a:xfrm>
                             <a:prstGeom prst="rect">
                               <a:avLst/>
@@ -1834,7 +1978,7 @@
                         <wps:spPr>
                           <a:xfrm>
                             <a:off x="748080" y="9928080"/>
-                            <a:ext cx="882720" cy="176040"/>
+                            <a:ext cx="881280" cy="174600"/>
                           </a:xfrm>
                           <a:prstGeom prst="rect">
                             <a:avLst/>
@@ -1883,8 +2027,8 @@
         </mc:Choice>
         <mc:Fallback>
           <w:pict>
-            <v:group id="shape_0" alt="Группа 60" style="position:absolute;margin-left:-18.05pt;margin-top:-20.95pt;width:524.3pt;height:810.6pt" coordorigin="-361,-419" coordsize="10486,16212">
-              <v:rect id="shape_0" stroked="f" o:allowincell="f" style="position:absolute;left:817;top:14940;width:1366;height:282;mso-wrap-style:square;v-text-anchor:top">
+            <v:group id="shape_0" alt="Группа 60" style="position:absolute;margin-left:-18.05pt;margin-top:-20.95pt;width:524.2pt;height:810.5pt" coordorigin="-361,-419" coordsize="10484,16210">
+              <v:rect id="shape_0" stroked="f" o:allowincell="f" style="position:absolute;left:817;top:14940;width:1364;height:280;mso-wrap-style:square;v-text-anchor:top">
                 <v:fill o:detectmouseclick="t" on="false"/>
                 <v:stroke color="#3465a4" joinstyle="round" endcap="flat"/>
                 <v:textbox>
@@ -1941,9 +2085,9 @@
                 </v:textbox>
                 <w10:wrap type="none"/>
               </v:rect>
-              <v:group id="shape_0" style="position:absolute;left:-361;top:-419;width:10486;height:16212">
-                <v:group id="shape_0" style="position:absolute;left:-361;top:-419;width:10486;height:16212">
-                  <v:rect id="shape_0" stroked="t" o:allowincell="f" style="position:absolute;left:-361;top:-419;width:10485;height:16211;mso-wrap-style:none;v-text-anchor:middle">
+              <v:group id="shape_0" style="position:absolute;left:-361;top:-419;width:10484;height:16210">
+                <v:group id="shape_0" style="position:absolute;left:-361;top:-419;width:10484;height:16210">
+                  <v:rect id="shape_0" stroked="t" o:allowincell="f" style="position:absolute;left:-361;top:-419;width:10483;height:16209;mso-wrap-style:none;v-text-anchor:middle">
                     <v:fill o:detectmouseclick="t" on="false"/>
                     <v:stroke color="black" weight="25560" joinstyle="miter" endcap="flat"/>
                     <w10:wrap type="none"/>
@@ -1998,7 +2142,7 @@
                     <v:fill o:detectmouseclick="t" on="false"/>
                     <w10:wrap type="none"/>
                   </v:line>
-                  <v:rect id="shape_0" stroked="f" o:allowincell="f" style="position:absolute;left:-333;top:15519;width:522;height:248;mso-wrap-style:square;v-text-anchor:top">
+                  <v:rect id="shape_0" stroked="f" o:allowincell="f" style="position:absolute;left:-333;top:15519;width:520;height:246;mso-wrap-style:square;v-text-anchor:top">
                     <v:fill o:detectmouseclick="t" on="false"/>
                     <v:stroke color="#3465a4" joinstyle="round" endcap="flat"/>
                     <v:textbox>
@@ -2024,7 +2168,7 @@
                     </v:textbox>
                     <w10:wrap type="none"/>
                   </v:rect>
-                  <v:rect id="shape_0" stroked="f" o:allowincell="f" style="position:absolute;left:236;top:15519;width:522;height:248;mso-wrap-style:square;v-text-anchor:top">
+                  <v:rect id="shape_0" stroked="f" o:allowincell="f" style="position:absolute;left:236;top:15519;width:520;height:246;mso-wrap-style:square;v-text-anchor:top">
                     <v:fill o:detectmouseclick="t" on="false"/>
                     <v:stroke color="#3465a4" joinstyle="round" endcap="flat"/>
                     <v:textbox>
@@ -2050,7 +2194,7 @@
                     </v:textbox>
                     <w10:wrap type="none"/>
                   </v:rect>
-                  <v:rect id="shape_0" stroked="f" o:allowincell="f" style="position:absolute;left:828;top:15519;width:1346;height:248;mso-wrap-style:square;v-text-anchor:top">
+                  <v:rect id="shape_0" stroked="f" o:allowincell="f" style="position:absolute;left:828;top:15519;width:1344;height:246;mso-wrap-style:square;v-text-anchor:top">
                     <v:fill o:detectmouseclick="t" on="false"/>
                     <v:stroke color="#3465a4" joinstyle="round" endcap="flat"/>
                     <v:textbox>
@@ -2163,7 +2307,7 @@
                     </v:textbox>
                     <w10:wrap type="none"/>
                   </v:rect>
-                  <v:rect id="shape_0" stroked="f" o:allowincell="f" style="position:absolute;left:2252;top:15519;width:802;height:248;mso-wrap-style:square;v-text-anchor:top">
+                  <v:rect id="shape_0" stroked="f" o:allowincell="f" style="position:absolute;left:2252;top:15519;width:800;height:246;mso-wrap-style:square;v-text-anchor:top">
                     <v:fill o:detectmouseclick="t" on="false"/>
                     <v:stroke color="#3465a4" joinstyle="round" endcap="flat"/>
                     <v:textbox>
@@ -2189,7 +2333,7 @@
                     </v:textbox>
                     <w10:wrap type="none"/>
                   </v:rect>
-                  <v:rect id="shape_0" stroked="f" o:allowincell="f" style="position:absolute;left:3102;top:15519;width:522;height:248;mso-wrap-style:square;v-text-anchor:top">
+                  <v:rect id="shape_0" stroked="f" o:allowincell="f" style="position:absolute;left:3102;top:15519;width:520;height:246;mso-wrap-style:square;v-text-anchor:top">
                     <v:fill o:detectmouseclick="t" on="false"/>
                     <v:stroke color="#3465a4" joinstyle="round" endcap="flat"/>
                     <v:textbox>
@@ -2215,7 +2359,7 @@
                     </v:textbox>
                     <w10:wrap type="none"/>
                   </v:rect>
-                  <v:rect id="shape_0" stroked="f" o:allowincell="f" style="position:absolute;left:9576;top:14966;width:522;height:247;mso-wrap-style:square;v-text-anchor:top">
+                  <v:rect id="shape_0" stroked="f" o:allowincell="f" style="position:absolute;left:9576;top:14966;width:520;height:245;mso-wrap-style:square;v-text-anchor:top">
                     <v:fill o:detectmouseclick="t" on="false"/>
                     <v:stroke color="#3465a4" joinstyle="round" endcap="flat"/>
                     <v:textbox>
@@ -2241,7 +2385,7 @@
                     </v:textbox>
                     <w10:wrap type="none"/>
                   </v:rect>
-                  <v:rect id="shape_0" stroked="f" o:allowincell="f" style="position:absolute;left:9576;top:15337;width:522;height:340;mso-wrap-style:square;v-text-anchor:top">
+                  <v:rect id="shape_0" stroked="f" o:allowincell="f" style="position:absolute;left:9576;top:15337;width:520;height:338;mso-wrap-style:square;v-text-anchor:top">
                     <v:fill o:detectmouseclick="t" on="false"/>
                     <v:stroke color="#3465a4" joinstyle="round" endcap="flat"/>
                     <v:textbox>
@@ -2293,7 +2437,7 @@
                               <w:sz w:val="24"/>
                               <w:lang w:val="ru-RU"/>
                             </w:rPr>
-                            <w:t>2</w:t>
+                            <w:t>3</w:t>
                           </w:r>
                           <w:r>
                             <w:rPr>
@@ -2308,7 +2452,7 @@
                     </v:textbox>
                     <w10:wrap type="none"/>
                   </v:rect>
-                  <v:rect id="shape_0" stroked="f" o:allowincell="f" style="position:absolute;left:3700;top:15163;width:5805;height:384;mso-wrap-style:square;v-text-anchor:top">
+                  <v:rect id="shape_0" stroked="f" o:allowincell="f" style="position:absolute;left:3700;top:15163;width:5803;height:382;mso-wrap-style:square;v-text-anchor:top">
                     <v:fill o:detectmouseclick="t" on="false"/>
                     <v:stroke color="#3465a4" joinstyle="round" endcap="flat"/>
                     <v:textbox>
@@ -2439,7 +2583,7 @@
                     <w10:wrap type="none"/>
                   </v:rect>
                 </v:group>
-                <v:rect id="shape_0" stroked="f" o:allowincell="f" style="position:absolute;left:817;top:15216;width:1389;height:276;mso-wrap-style:none;v-text-anchor:middle">
+                <v:rect id="shape_0" stroked="f" o:allowincell="f" style="position:absolute;left:817;top:15216;width:1387;height:274;mso-wrap-style:none;v-text-anchor:middle">
                   <v:fill o:detectmouseclick="t" on="false"/>
                   <v:stroke color="#3465a4" joinstyle="round" endcap="flat"/>
                   <v:textbox>
@@ -2486,7 +2630,7 @@
       <mc:AlternateContent>
         <mc:Choice Requires="wpg">
           <w:drawing>
-            <wp:anchor behindDoc="1" distT="13335" distB="12065" distL="13335" distR="12065" simplePos="0" locked="0" layoutInCell="1" allowOverlap="1" relativeHeight="13" wp14:anchorId="10994A42">
+            <wp:anchor behindDoc="1" distT="13335" distB="12065" distL="13335" distR="12065" simplePos="0" locked="0" layoutInCell="1" allowOverlap="1" relativeHeight="24" wp14:anchorId="10994A42">
               <wp:simplePos x="0" y="0"/>
               <wp:positionH relativeFrom="column">
                 <wp:posOffset>-229870</wp:posOffset>
@@ -2494,7 +2638,7 @@
               <wp:positionV relativeFrom="paragraph">
                 <wp:posOffset>-244475</wp:posOffset>
               </wp:positionV>
-              <wp:extent cx="6658610" cy="10294620"/>
+              <wp:extent cx="6657340" cy="10293350"/>
               <wp:effectExtent l="13335" t="13335" r="12065" b="12065"/>
               <wp:wrapNone/>
               <wp:docPr id="13" name="Группа 10"/>
@@ -2505,9 +2649,9 @@
                     <wpg:grpSpPr>
                       <a:xfrm>
                         <a:off x="0" y="0"/>
-                        <a:ext cx="6658560" cy="10294560"/>
+                        <a:ext cx="6657480" cy="10293480"/>
                         <a:chOff x="0" y="0"/>
-                        <a:chExt cx="6658560" cy="10294560"/>
+                        <a:chExt cx="6657480" cy="10293480"/>
                       </a:xfrm>
                     </wpg:grpSpPr>
                     <wps:wsp>
@@ -2516,7 +2660,7 @@
                       <wps:spPr>
                         <a:xfrm>
                           <a:off x="0" y="0"/>
-                          <a:ext cx="6658560" cy="10294560"/>
+                          <a:ext cx="6657480" cy="10293480"/>
                         </a:xfrm>
                         <a:prstGeom prst="rect">
                           <a:avLst/>
@@ -2768,7 +2912,7 @@
                       <wps:spPr>
                         <a:xfrm>
                           <a:off x="17640" y="9220680"/>
-                          <a:ext cx="292680" cy="158040"/>
+                          <a:ext cx="291600" cy="156960"/>
                         </a:xfrm>
                         <a:prstGeom prst="rect">
                           <a:avLst/>
@@ -2823,7 +2967,7 @@
                       <wps:spPr>
                         <a:xfrm>
                           <a:off x="349920" y="9220680"/>
-                          <a:ext cx="365040" cy="158040"/>
+                          <a:ext cx="363960" cy="156960"/>
                         </a:xfrm>
                         <a:prstGeom prst="rect">
                           <a:avLst/>
@@ -2872,7 +3016,7 @@
                       <wps:spPr>
                         <a:xfrm>
                           <a:off x="754920" y="9220680"/>
-                          <a:ext cx="855360" cy="158040"/>
+                          <a:ext cx="853920" cy="156960"/>
                         </a:xfrm>
                         <a:prstGeom prst="rect">
                           <a:avLst/>
@@ -2929,7 +3073,7 @@
                       <wps:spPr>
                         <a:xfrm>
                           <a:off x="1659240" y="9220680"/>
-                          <a:ext cx="509760" cy="158040"/>
+                          <a:ext cx="508680" cy="156960"/>
                         </a:xfrm>
                         <a:prstGeom prst="rect">
                           <a:avLst/>
@@ -2978,7 +3122,7 @@
                       <wps:spPr>
                         <a:xfrm>
                           <a:off x="2198880" y="9220680"/>
-                          <a:ext cx="332280" cy="158040"/>
+                          <a:ext cx="330840" cy="156960"/>
                         </a:xfrm>
                         <a:prstGeom prst="rect">
                           <a:avLst/>
@@ -3027,7 +3171,7 @@
                       <wps:spPr>
                         <a:xfrm>
                           <a:off x="5304240" y="9399240"/>
-                          <a:ext cx="490320" cy="157320"/>
+                          <a:ext cx="488880" cy="156240"/>
                         </a:xfrm>
                         <a:prstGeom prst="rect">
                           <a:avLst/>
@@ -3073,7 +3217,7 @@
                       <wps:spPr>
                         <a:xfrm>
                           <a:off x="5304240" y="9587160"/>
-                          <a:ext cx="490320" cy="158040"/>
+                          <a:ext cx="488880" cy="156960"/>
                         </a:xfrm>
                         <a:prstGeom prst="rect">
                           <a:avLst/>
@@ -3120,7 +3264,7 @@
                       <wps:spPr>
                         <a:xfrm>
                           <a:off x="2585880" y="8977680"/>
-                          <a:ext cx="3991680" cy="241920"/>
+                          <a:ext cx="3990240" cy="240840"/>
                         </a:xfrm>
                         <a:prstGeom prst="rect">
                           <a:avLst/>
@@ -3373,7 +3517,7 @@
                       <wpg:grpSpPr>
                         <a:xfrm>
                           <a:off x="12600" y="9387720"/>
-                          <a:ext cx="1616760" cy="182880"/>
+                          <a:ext cx="1615320" cy="181440"/>
                         </a:xfrm>
                       </wpg:grpSpPr>
                       <wps:wsp>
@@ -3382,7 +3526,7 @@
                         <wps:spPr>
                           <a:xfrm>
                             <a:off x="0" y="15840"/>
-                            <a:ext cx="706680" cy="158040"/>
+                            <a:ext cx="705600" cy="156960"/>
                           </a:xfrm>
                           <a:prstGeom prst="rect">
                             <a:avLst/>
@@ -3440,7 +3584,7 @@
                         <wps:spPr>
                           <a:xfrm>
                             <a:off x="734040" y="0"/>
-                            <a:ext cx="882720" cy="182880"/>
+                            <a:ext cx="881280" cy="181440"/>
                           </a:xfrm>
                           <a:prstGeom prst="rect">
                             <a:avLst/>
@@ -3506,7 +3650,7 @@
                       <wpg:grpSpPr>
                         <a:xfrm>
                           <a:off x="12600" y="9582120"/>
-                          <a:ext cx="1596960" cy="158040"/>
+                          <a:ext cx="1595880" cy="156960"/>
                         </a:xfrm>
                       </wpg:grpSpPr>
                       <wps:wsp>
@@ -3515,7 +3659,7 @@
                         <wps:spPr>
                           <a:xfrm>
                             <a:off x="0" y="0"/>
-                            <a:ext cx="706680" cy="158040"/>
+                            <a:ext cx="705600" cy="156960"/>
                           </a:xfrm>
                           <a:prstGeom prst="rect">
                             <a:avLst/>
@@ -3568,7 +3712,7 @@
                         <wps:spPr>
                           <a:xfrm>
                             <a:off x="741960" y="0"/>
-                            <a:ext cx="855360" cy="158040"/>
+                            <a:ext cx="853920" cy="156960"/>
                           </a:xfrm>
                           <a:prstGeom prst="rect">
                             <a:avLst/>
@@ -3619,7 +3763,7 @@
                       <wpg:grpSpPr>
                         <a:xfrm>
                           <a:off x="12600" y="9765000"/>
-                          <a:ext cx="1596960" cy="158040"/>
+                          <a:ext cx="1595880" cy="156960"/>
                         </a:xfrm>
                       </wpg:grpSpPr>
                       <wps:wsp>
@@ -3628,7 +3772,7 @@
                         <wps:spPr>
                           <a:xfrm>
                             <a:off x="0" y="0"/>
-                            <a:ext cx="706680" cy="158040"/>
+                            <a:ext cx="705600" cy="156960"/>
                           </a:xfrm>
                           <a:prstGeom prst="rect">
                             <a:avLst/>
@@ -3678,7 +3822,7 @@
                         <wps:spPr>
                           <a:xfrm>
                             <a:off x="741960" y="0"/>
-                            <a:ext cx="855360" cy="158040"/>
+                            <a:ext cx="853920" cy="156960"/>
                           </a:xfrm>
                           <a:prstGeom prst="rect">
                             <a:avLst/>
@@ -3717,7 +3861,7 @@
                       <wpg:grpSpPr>
                         <a:xfrm>
                           <a:off x="12600" y="9942840"/>
-                          <a:ext cx="1596960" cy="158040"/>
+                          <a:ext cx="1595880" cy="156960"/>
                         </a:xfrm>
                       </wpg:grpSpPr>
                       <wps:wsp>
@@ -3726,7 +3870,7 @@
                         <wps:spPr>
                           <a:xfrm>
                             <a:off x="0" y="0"/>
-                            <a:ext cx="706680" cy="158040"/>
+                            <a:ext cx="705600" cy="156960"/>
                           </a:xfrm>
                           <a:prstGeom prst="rect">
                             <a:avLst/>
@@ -3776,7 +3920,7 @@
                         <wps:spPr>
                           <a:xfrm>
                             <a:off x="741960" y="0"/>
-                            <a:ext cx="855360" cy="158040"/>
+                            <a:ext cx="853920" cy="156960"/>
                           </a:xfrm>
                           <a:prstGeom prst="rect">
                             <a:avLst/>
@@ -3815,7 +3959,7 @@
                       <wpg:grpSpPr>
                         <a:xfrm>
                           <a:off x="12600" y="10120680"/>
-                          <a:ext cx="1596960" cy="158040"/>
+                          <a:ext cx="1595880" cy="156960"/>
                         </a:xfrm>
                       </wpg:grpSpPr>
                       <wps:wsp>
@@ -3824,7 +3968,7 @@
                         <wps:spPr>
                           <a:xfrm>
                             <a:off x="0" y="0"/>
-                            <a:ext cx="706680" cy="158040"/>
+                            <a:ext cx="705600" cy="156960"/>
                           </a:xfrm>
                           <a:prstGeom prst="rect">
                             <a:avLst/>
@@ -3874,7 +4018,7 @@
                         <wps:spPr>
                           <a:xfrm>
                             <a:off x="741960" y="0"/>
-                            <a:ext cx="855360" cy="158040"/>
+                            <a:ext cx="853920" cy="156960"/>
                           </a:xfrm>
                           <a:prstGeom prst="rect">
                             <a:avLst/>
@@ -3947,7 +4091,7 @@
                       <wps:spPr>
                         <a:xfrm>
                           <a:off x="2593440" y="9523800"/>
-                          <a:ext cx="2101680" cy="731520"/>
+                          <a:ext cx="2100600" cy="730080"/>
                         </a:xfrm>
                         <a:prstGeom prst="rect">
                           <a:avLst/>
@@ -4095,7 +4239,7 @@
                       <wps:spPr>
                         <a:xfrm>
                           <a:off x="4759920" y="9399240"/>
-                          <a:ext cx="489600" cy="157320"/>
+                          <a:ext cx="488160" cy="156240"/>
                         </a:xfrm>
                         <a:prstGeom prst="rect">
                           <a:avLst/>
@@ -4140,7 +4284,7 @@
                       <wps:spPr>
                         <a:xfrm>
                           <a:off x="5852880" y="9399240"/>
-                          <a:ext cx="774000" cy="157320"/>
+                          <a:ext cx="772920" cy="156240"/>
                         </a:xfrm>
                         <a:prstGeom prst="rect">
                           <a:avLst/>
@@ -4186,7 +4330,7 @@
                       <wps:spPr>
                         <a:xfrm>
                           <a:off x="5857920" y="9582120"/>
-                          <a:ext cx="772920" cy="157320"/>
+                          <a:ext cx="771480" cy="156240"/>
                         </a:xfrm>
                         <a:prstGeom prst="rect">
                           <a:avLst/>
@@ -4218,7 +4362,7 @@
                                 <w:sz w:val="20"/>
                                 <w:lang w:val="en-US"/>
                               </w:rPr>
-                              <w:t>2</w:t>
+                              <w:t>3</w:t>
                             </w:r>
                           </w:p>
                         </w:txbxContent>
@@ -4283,7 +4427,7 @@
                       <wps:spPr>
                         <a:xfrm>
                           <a:off x="4759920" y="9864720"/>
-                          <a:ext cx="1866960" cy="341640"/>
+                          <a:ext cx="1865520" cy="340200"/>
                         </a:xfrm>
                         <a:prstGeom prst="rect">
                           <a:avLst/>
@@ -4342,8 +4486,8 @@
         </mc:Choice>
         <mc:Fallback>
           <w:pict>
-            <v:group id="shape_0" alt="Группа 10" style="position:absolute;margin-left:-18.1pt;margin-top:-19.25pt;width:524.3pt;height:810.6pt" coordorigin="-362,-385" coordsize="10486,16212">
-              <v:rect id="shape_0" stroked="t" o:allowincell="f" style="position:absolute;left:-362;top:-385;width:10485;height:16211;mso-wrap-style:none;v-text-anchor:middle">
+            <v:group id="shape_0" alt="Группа 10" style="position:absolute;margin-left:-18.1pt;margin-top:-19.25pt;width:524.2pt;height:810.5pt" coordorigin="-362,-385" coordsize="10484,16210">
+              <v:rect id="shape_0" stroked="t" o:allowincell="f" style="position:absolute;left:-362;top:-385;width:10483;height:16209;mso-wrap-style:none;v-text-anchor:middle">
                 <v:fill o:detectmouseclick="t" on="false"/>
                 <v:stroke color="black" weight="25560" joinstyle="miter" endcap="flat"/>
                 <w10:wrap type="none"/>
@@ -4393,7 +4537,7 @@
                 <v:fill o:detectmouseclick="t" on="false"/>
                 <w10:wrap type="none"/>
               </v:line>
-              <v:rect id="shape_0" stroked="f" o:allowincell="f" style="position:absolute;left:-334;top:14136;width:460;height:248;mso-wrap-style:square;v-text-anchor:top">
+              <v:rect id="shape_0" stroked="f" o:allowincell="f" style="position:absolute;left:-334;top:14136;width:458;height:246;mso-wrap-style:square;v-text-anchor:top">
                 <v:fill o:detectmouseclick="t" on="false"/>
                 <v:stroke color="#3465a4" joinstyle="round" endcap="flat"/>
                 <v:textbox>
@@ -4427,7 +4571,7 @@
                 </v:textbox>
                 <w10:wrap type="none"/>
               </v:rect>
-              <v:rect id="shape_0" stroked="f" o:allowincell="f" style="position:absolute;left:189;top:14136;width:574;height:248;mso-wrap-style:square;v-text-anchor:top">
+              <v:rect id="shape_0" stroked="f" o:allowincell="f" style="position:absolute;left:189;top:14136;width:572;height:246;mso-wrap-style:square;v-text-anchor:top">
                 <v:fill o:detectmouseclick="t" on="false"/>
                 <v:stroke color="#3465a4" joinstyle="round" endcap="flat"/>
                 <v:textbox>
@@ -4455,7 +4599,7 @@
                 </v:textbox>
                 <w10:wrap type="none"/>
               </v:rect>
-              <v:rect id="shape_0" stroked="f" o:allowincell="f" style="position:absolute;left:827;top:14136;width:1346;height:248;mso-wrap-style:square;v-text-anchor:top">
+              <v:rect id="shape_0" stroked="f" o:allowincell="f" style="position:absolute;left:827;top:14136;width:1344;height:246;mso-wrap-style:square;v-text-anchor:top">
                 <v:fill o:detectmouseclick="t" on="false"/>
                 <v:stroke color="#3465a4" joinstyle="round" endcap="flat"/>
                 <v:textbox>
@@ -4491,7 +4635,7 @@
                 </v:textbox>
                 <w10:wrap type="none"/>
               </v:rect>
-              <v:rect id="shape_0" stroked="f" o:allowincell="f" style="position:absolute;left:2251;top:14136;width:802;height:248;mso-wrap-style:square;v-text-anchor:top">
+              <v:rect id="shape_0" stroked="f" o:allowincell="f" style="position:absolute;left:2251;top:14136;width:800;height:246;mso-wrap-style:square;v-text-anchor:top">
                 <v:fill o:detectmouseclick="t" on="false"/>
                 <v:stroke color="#3465a4" joinstyle="round" endcap="flat"/>
                 <v:textbox>
@@ -4519,7 +4663,7 @@
                 </v:textbox>
                 <w10:wrap type="none"/>
               </v:rect>
-              <v:rect id="shape_0" stroked="f" o:allowincell="f" style="position:absolute;left:3101;top:14136;width:522;height:248;mso-wrap-style:square;v-text-anchor:top">
+              <v:rect id="shape_0" stroked="f" o:allowincell="f" style="position:absolute;left:3101;top:14136;width:520;height:246;mso-wrap-style:square;v-text-anchor:top">
                 <v:fill o:detectmouseclick="t" on="false"/>
                 <v:stroke color="#3465a4" joinstyle="round" endcap="flat"/>
                 <v:textbox>
@@ -4547,7 +4691,7 @@
                 </v:textbox>
                 <w10:wrap type="none"/>
               </v:rect>
-              <v:rect id="shape_0" stroked="f" o:allowincell="f" style="position:absolute;left:7991;top:14417;width:771;height:247;mso-wrap-style:square;v-text-anchor:top">
+              <v:rect id="shape_0" stroked="f" o:allowincell="f" style="position:absolute;left:7991;top:14417;width:769;height:245;mso-wrap-style:square;v-text-anchor:top">
                 <v:fill o:detectmouseclick="t" on="false"/>
                 <v:stroke color="#3465a4" joinstyle="round" endcap="flat"/>
                 <v:textbox>
@@ -4572,7 +4716,7 @@
                 </v:textbox>
                 <w10:wrap type="none"/>
               </v:rect>
-              <v:rect id="shape_0" stroked="f" o:allowincell="f" style="position:absolute;left:7991;top:14713;width:771;height:248;mso-wrap-style:square;v-text-anchor:top">
+              <v:rect id="shape_0" stroked="f" o:allowincell="f" style="position:absolute;left:7991;top:14713;width:769;height:246;mso-wrap-style:square;v-text-anchor:top">
                 <v:fill o:detectmouseclick="t" on="false"/>
                 <v:stroke color="#3465a4" joinstyle="round" endcap="flat"/>
                 <v:textbox>
@@ -4598,7 +4742,7 @@
                 </v:textbox>
                 <w10:wrap type="none"/>
               </v:rect>
-              <v:rect id="shape_0" stroked="f" o:allowincell="f" style="position:absolute;left:3710;top:13753;width:6285;height:380;mso-wrap-style:square;v-text-anchor:top">
+              <v:rect id="shape_0" stroked="f" o:allowincell="f" style="position:absolute;left:3710;top:13753;width:6283;height:378;mso-wrap-style:square;v-text-anchor:top">
                 <v:fill o:detectmouseclick="t" on="false"/>
                 <v:stroke color="#3465a4" joinstyle="round" endcap="flat"/>
                 <v:textbox>
@@ -4731,8 +4875,8 @@
                 <v:fill o:detectmouseclick="t" on="false"/>
                 <w10:wrap type="none"/>
               </v:line>
-              <v:group id="shape_0" style="position:absolute;left:-342;top:14399;width:2546;height:288">
-                <v:rect id="shape_0" stroked="f" o:allowincell="f" style="position:absolute;left:-342;top:14424;width:1112;height:248;mso-wrap-style:square;v-text-anchor:top">
+              <v:group id="shape_0" style="position:absolute;left:-342;top:14399;width:2544;height:286">
+                <v:rect id="shape_0" stroked="f" o:allowincell="f" style="position:absolute;left:-342;top:14424;width:1110;height:246;mso-wrap-style:square;v-text-anchor:top">
                   <v:fill o:detectmouseclick="t" on="false"/>
                   <v:stroke color="#3465a4" joinstyle="round" endcap="flat"/>
                   <v:textbox>
@@ -4769,7 +4913,7 @@
                   </v:textbox>
                   <w10:wrap type="none"/>
                 </v:rect>
-                <v:rect id="shape_0" stroked="f" o:allowincell="f" style="position:absolute;left:814;top:14399;width:1389;height:287;mso-wrap-style:square;v-text-anchor:top">
+                <v:rect id="shape_0" stroked="f" o:allowincell="f" style="position:absolute;left:814;top:14399;width:1387;height:285;mso-wrap-style:square;v-text-anchor:top">
                   <v:fill o:detectmouseclick="t" on="false"/>
                   <v:stroke color="#3465a4" joinstyle="round" endcap="flat"/>
                   <v:textbox>
@@ -4815,8 +4959,8 @@
                   <w10:wrap type="none"/>
                 </v:rect>
               </v:group>
-              <v:group id="shape_0" style="position:absolute;left:-342;top:14705;width:2516;height:249">
-                <v:rect id="shape_0" stroked="f" o:allowincell="f" style="position:absolute;left:-342;top:14705;width:1112;height:248;mso-wrap-style:square;v-text-anchor:top">
+              <v:group id="shape_0" style="position:absolute;left:-342;top:14705;width:2513;height:247">
+                <v:rect id="shape_0" stroked="f" o:allowincell="f" style="position:absolute;left:-342;top:14705;width:1110;height:246;mso-wrap-style:square;v-text-anchor:top">
                   <v:fill o:detectmouseclick="t" on="false"/>
                   <v:stroke color="#3465a4" joinstyle="round" endcap="flat"/>
                   <v:textbox>
@@ -4848,7 +4992,7 @@
                   </v:textbox>
                   <w10:wrap type="none"/>
                 </v:rect>
-                <v:rect id="shape_0" stroked="f" o:allowincell="f" style="position:absolute;left:826;top:14705;width:1346;height:248;mso-wrap-style:square;v-text-anchor:top">
+                <v:rect id="shape_0" stroked="f" o:allowincell="f" style="position:absolute;left:826;top:14705;width:1344;height:246;mso-wrap-style:square;v-text-anchor:top">
                   <v:fill o:detectmouseclick="t" on="false"/>
                   <v:stroke color="#3465a4" joinstyle="round" endcap="flat"/>
                   <v:textbox>
@@ -4879,8 +5023,8 @@
                   <w10:wrap type="none"/>
                 </v:rect>
               </v:group>
-              <v:group id="shape_0" style="position:absolute;left:-342;top:14993;width:2516;height:249">
-                <v:rect id="shape_0" stroked="f" o:allowincell="f" style="position:absolute;left:-342;top:14993;width:1112;height:248;mso-wrap-style:square;v-text-anchor:top">
+              <v:group id="shape_0" style="position:absolute;left:-342;top:14993;width:2513;height:247">
+                <v:rect id="shape_0" stroked="f" o:allowincell="f" style="position:absolute;left:-342;top:14993;width:1110;height:246;mso-wrap-style:square;v-text-anchor:top">
                   <v:fill o:detectmouseclick="t" on="false"/>
                   <v:stroke color="#3465a4" joinstyle="round" endcap="flat"/>
                   <v:textbox>
@@ -4909,7 +5053,7 @@
                   </v:textbox>
                   <w10:wrap type="none"/>
                 </v:rect>
-                <v:rect id="shape_0" stroked="f" o:allowincell="f" style="position:absolute;left:826;top:14993;width:1346;height:248;mso-wrap-style:none;v-text-anchor:middle">
+                <v:rect id="shape_0" stroked="f" o:allowincell="f" style="position:absolute;left:826;top:14993;width:1344;height:246;mso-wrap-style:none;v-text-anchor:middle">
                   <v:fill o:detectmouseclick="t" on="false"/>
                   <v:stroke color="#3465a4" joinstyle="round" endcap="flat"/>
                   <v:textbox>
@@ -4928,8 +5072,8 @@
                   <w10:wrap type="none"/>
                 </v:rect>
               </v:group>
-              <v:group id="shape_0" style="position:absolute;left:-342;top:15273;width:2516;height:249">
-                <v:rect id="shape_0" stroked="f" o:allowincell="f" style="position:absolute;left:-342;top:15273;width:1112;height:248;mso-wrap-style:square;v-text-anchor:top">
+              <v:group id="shape_0" style="position:absolute;left:-342;top:15273;width:2513;height:247">
+                <v:rect id="shape_0" stroked="f" o:allowincell="f" style="position:absolute;left:-342;top:15273;width:1110;height:246;mso-wrap-style:square;v-text-anchor:top">
                   <v:fill o:detectmouseclick="t" on="false"/>
                   <v:stroke color="#3465a4" joinstyle="round" endcap="flat"/>
                   <v:textbox>
@@ -4958,7 +5102,7 @@
                   </v:textbox>
                   <w10:wrap type="none"/>
                 </v:rect>
-                <v:rect id="shape_0" stroked="f" o:allowincell="f" style="position:absolute;left:826;top:15273;width:1346;height:248;mso-wrap-style:none;v-text-anchor:middle">
+                <v:rect id="shape_0" stroked="f" o:allowincell="f" style="position:absolute;left:826;top:15273;width:1344;height:246;mso-wrap-style:none;v-text-anchor:middle">
                   <v:fill o:detectmouseclick="t" on="false"/>
                   <v:stroke color="#3465a4" joinstyle="round" endcap="flat"/>
                   <v:textbox>
@@ -4977,8 +5121,8 @@
                   <w10:wrap type="none"/>
                 </v:rect>
               </v:group>
-              <v:group id="shape_0" style="position:absolute;left:-342;top:15553;width:2516;height:249">
-                <v:rect id="shape_0" stroked="f" o:allowincell="f" style="position:absolute;left:-342;top:15553;width:1112;height:248;mso-wrap-style:square;v-text-anchor:top">
+              <v:group id="shape_0" style="position:absolute;left:-342;top:15553;width:2513;height:247">
+                <v:rect id="shape_0" stroked="f" o:allowincell="f" style="position:absolute;left:-342;top:15553;width:1110;height:246;mso-wrap-style:square;v-text-anchor:top">
                   <v:fill o:detectmouseclick="t" on="false"/>
                   <v:stroke color="#3465a4" joinstyle="round" endcap="flat"/>
                   <v:textbox>
@@ -5007,7 +5151,7 @@
                   </v:textbox>
                   <w10:wrap type="none"/>
                 </v:rect>
-                <v:rect id="shape_0" stroked="f" o:allowincell="f" style="position:absolute;left:826;top:15553;width:1346;height:248;mso-wrap-style:none;v-text-anchor:middle">
+                <v:rect id="shape_0" stroked="f" o:allowincell="f" style="position:absolute;left:826;top:15553;width:1344;height:246;mso-wrap-style:none;v-text-anchor:middle">
                   <v:fill o:detectmouseclick="t" on="false"/>
                   <v:stroke color="#3465a4" joinstyle="round" endcap="flat"/>
                   <v:textbox>
@@ -5039,7 +5183,7 @@
                 <v:fill o:detectmouseclick="t" on="false"/>
                 <w10:wrap type="none"/>
               </v:line>
-              <v:rect id="shape_0" stroked="f" o:allowincell="f" style="position:absolute;left:3722;top:14613;width:3309;height:1151;mso-wrap-style:square;v-text-anchor:middle">
+              <v:rect id="shape_0" stroked="f" o:allowincell="f" style="position:absolute;left:3722;top:14613;width:3307;height:1149;mso-wrap-style:square;v-text-anchor:middle">
                 <v:fill o:detectmouseclick="t" on="false"/>
                 <v:stroke color="#3465a4" joinstyle="round" endcap="flat"/>
                 <v:textbox>
@@ -5106,7 +5250,7 @@
                 <v:fill o:detectmouseclick="t" on="false"/>
                 <w10:wrap type="none"/>
               </v:line>
-              <v:rect id="shape_0" stroked="f" o:allowincell="f" style="position:absolute;left:7134;top:14417;width:770;height:247;mso-wrap-style:square;v-text-anchor:top">
+              <v:rect id="shape_0" stroked="f" o:allowincell="f" style="position:absolute;left:7134;top:14417;width:768;height:245;mso-wrap-style:square;v-text-anchor:top">
                 <v:fill o:detectmouseclick="t" on="false"/>
                 <v:stroke color="#3465a4" joinstyle="round" endcap="flat"/>
                 <v:textbox>
@@ -5130,7 +5274,7 @@
                 </v:textbox>
                 <w10:wrap type="none"/>
               </v:rect>
-              <v:rect id="shape_0" stroked="f" o:allowincell="f" style="position:absolute;left:8855;top:14417;width:1218;height:247;mso-wrap-style:square;v-text-anchor:top">
+              <v:rect id="shape_0" stroked="f" o:allowincell="f" style="position:absolute;left:8855;top:14417;width:1216;height:245;mso-wrap-style:square;v-text-anchor:top">
                 <v:fill o:detectmouseclick="t" on="false"/>
                 <v:stroke color="#3465a4" joinstyle="round" endcap="flat"/>
                 <v:textbox>
@@ -5155,7 +5299,7 @@
                 </v:textbox>
                 <w10:wrap type="none"/>
               </v:rect>
-              <v:rect id="shape_0" stroked="f" o:allowincell="f" style="position:absolute;left:8863;top:14705;width:1216;height:247;mso-wrap-style:square;v-text-anchor:top">
+              <v:rect id="shape_0" stroked="f" o:allowincell="f" style="position:absolute;left:8863;top:14705;width:1214;height:245;mso-wrap-style:square;v-text-anchor:top">
                 <v:fill o:detectmouseclick="t" on="false"/>
                 <v:stroke color="#3465a4" joinstyle="round" endcap="flat"/>
                 <v:textbox>
@@ -5174,7 +5318,7 @@
                           <w:sz w:val="20"/>
                           <w:lang w:val="en-US"/>
                         </w:rPr>
-                        <w:t>2</w:t>
+                        <w:t>3</w:t>
                       </w:r>
                     </w:p>
                   </w:txbxContent>
@@ -5191,7 +5335,7 @@
                 <v:fill o:detectmouseclick="t" on="false"/>
                 <w10:wrap type="none"/>
               </v:line>
-              <v:rect id="shape_0" stroked="f" o:allowincell="f" style="position:absolute;left:7134;top:15150;width:2939;height:537;mso-wrap-style:square;v-text-anchor:top">
+              <v:rect id="shape_0" stroked="f" o:allowincell="f" style="position:absolute;left:7134;top:15150;width:2937;height:535;mso-wrap-style:square;v-text-anchor:top">
                 <v:fill o:detectmouseclick="t" on="false"/>
                 <v:stroke color="#3465a4" joinstyle="round" endcap="flat"/>
                 <v:textbox>

</xml_diff>

<commit_message>
feat: add task 3
</commit_message>
<xml_diff>
--- a/lab1.docx
+++ b/lab1.docx
@@ -883,6 +883,249 @@
     </w:p>
     <w:p>
       <w:pPr>
+        <w:pStyle w:val="BodyText"/>
+        <w:widowControl/>
+        <w:tabs>
+          <w:tab w:val="clear" w:pos="567"/>
+        </w:tabs>
+        <w:suppressAutoHyphens w:val="true"/>
+        <w:bidi w:val="0"/>
+        <w:spacing w:lineRule="auto" w:line="360" w:before="0" w:after="140"/>
+        <w:ind w:firstLine="850" w:start="0" w:end="0"/>
+        <w:jc w:val="both"/>
+        <w:rPr>
+          <w:rFonts w:eastAsia="Helvetica-Bold"/>
+          <w:sz w:val="28"/>
+          <w:szCs w:val="28"/>
+          <w:lang w:val="en-US"/>
+        </w:rPr>
+      </w:pPr>
+      <w:r>
+        <w:rPr>
+          <w:rFonts w:eastAsia="Helvetica-Bold"/>
+          <w:b/>
+          <w:bCs/>
+          <w:sz w:val="28"/>
+          <w:szCs w:val="28"/>
+          <w:lang w:val="en-US"/>
+        </w:rPr>
+        <w:t>Завдання 3.</w:t>
+      </w:r>
+      <w:r>
+        <w:rPr>
+          <w:rFonts w:eastAsia="Helvetica-Bold"/>
+          <w:sz w:val="28"/>
+          <w:szCs w:val="28"/>
+          <w:lang w:val="en-US"/>
+        </w:rPr>
+        <w:t xml:space="preserve"> Використовуючи основні принципи і аспекти системного підходу, описати одну із наведених систем у завданні 2.</w:t>
+      </w:r>
+    </w:p>
+    <w:p>
+      <w:pPr>
+        <w:pStyle w:val="BodyText"/>
+        <w:widowControl/>
+        <w:tabs>
+          <w:tab w:val="clear" w:pos="567"/>
+        </w:tabs>
+        <w:suppressAutoHyphens w:val="true"/>
+        <w:bidi w:val="0"/>
+        <w:spacing w:lineRule="auto" w:line="360" w:before="0" w:after="140"/>
+        <w:ind w:firstLine="850" w:start="0" w:end="0"/>
+        <w:jc w:val="both"/>
+        <w:rPr>
+          <w:rFonts w:eastAsia="Helvetica-Bold"/>
+          <w:sz w:val="28"/>
+          <w:szCs w:val="28"/>
+          <w:lang w:val="en-US"/>
+        </w:rPr>
+      </w:pPr>
+      <w:r>
+        <w:rPr>
+          <w:rFonts w:eastAsia="Helvetica-Bold"/>
+          <w:sz w:val="28"/>
+          <w:szCs w:val="28"/>
+          <w:lang w:val="en-US"/>
+        </w:rPr>
+        <w:t>Системний опис Сонячної системи:</w:t>
+      </w:r>
+    </w:p>
+    <w:p>
+      <w:pPr>
+        <w:pStyle w:val="BodyText"/>
+        <w:widowControl/>
+        <w:tabs>
+          <w:tab w:val="clear" w:pos="567"/>
+        </w:tabs>
+        <w:suppressAutoHyphens w:val="true"/>
+        <w:bidi w:val="0"/>
+        <w:spacing w:lineRule="auto" w:line="360" w:before="0" w:after="140"/>
+        <w:ind w:firstLine="850" w:start="0" w:end="0"/>
+        <w:jc w:val="both"/>
+        <w:rPr>
+          <w:rFonts w:eastAsia="Helvetica-Bold"/>
+          <w:sz w:val="28"/>
+          <w:szCs w:val="28"/>
+          <w:lang w:val="en-US"/>
+        </w:rPr>
+      </w:pPr>
+      <w:r>
+        <w:rPr>
+          <w:rFonts w:eastAsia="Helvetica-Bold"/>
+          <w:sz w:val="28"/>
+          <w:szCs w:val="28"/>
+          <w:lang w:val="en-US"/>
+        </w:rPr>
+        <w:t>Принцип кінцевої цілі: Головною метою системи є підтримання гравітаційної рівноваги та забезпечення циклічного руху космічних тіл, що створює стабільні умови для існування об'єктів усередині системи.</w:t>
+      </w:r>
+    </w:p>
+    <w:p>
+      <w:pPr>
+        <w:pStyle w:val="BodyText"/>
+        <w:widowControl/>
+        <w:tabs>
+          <w:tab w:val="clear" w:pos="567"/>
+        </w:tabs>
+        <w:suppressAutoHyphens w:val="true"/>
+        <w:bidi w:val="0"/>
+        <w:spacing w:lineRule="auto" w:line="360" w:before="0" w:after="140"/>
+        <w:ind w:firstLine="850" w:start="0" w:end="0"/>
+        <w:jc w:val="both"/>
+        <w:rPr>
+          <w:rFonts w:eastAsia="Helvetica-Bold"/>
+          <w:sz w:val="28"/>
+          <w:szCs w:val="28"/>
+          <w:lang w:val="en-US"/>
+        </w:rPr>
+      </w:pPr>
+      <w:r>
+        <w:rPr>
+          <w:rFonts w:eastAsia="Helvetica-Bold"/>
+          <w:sz w:val="28"/>
+          <w:szCs w:val="28"/>
+          <w:lang w:val="en-US"/>
+        </w:rPr>
+        <w:t>Принцип ієрархічності: Сонячна система розглядається як підсистема вищого рівня. Водночас вона сама складається з підсистем нижчого рівня, наприклад, планетарних систем або систем супутників газових гігантів.</w:t>
+      </w:r>
+    </w:p>
+    <w:p>
+      <w:pPr>
+        <w:pStyle w:val="BodyText"/>
+        <w:widowControl/>
+        <w:tabs>
+          <w:tab w:val="clear" w:pos="567"/>
+        </w:tabs>
+        <w:suppressAutoHyphens w:val="true"/>
+        <w:bidi w:val="0"/>
+        <w:spacing w:lineRule="auto" w:line="360" w:before="0" w:after="140"/>
+        <w:ind w:firstLine="850" w:start="0" w:end="0"/>
+        <w:jc w:val="both"/>
+        <w:rPr>
+          <w:rFonts w:eastAsia="Helvetica-Bold"/>
+          <w:sz w:val="28"/>
+          <w:szCs w:val="28"/>
+          <w:lang w:val="en-US"/>
+        </w:rPr>
+      </w:pPr>
+      <w:r>
+        <w:rPr>
+          <w:rFonts w:eastAsia="Helvetica-Bold"/>
+          <w:sz w:val="28"/>
+          <w:szCs w:val="28"/>
+          <w:lang w:val="en-US"/>
+        </w:rPr>
+        <w:t>Системно-компонентний аспект: Система складається з таких елементів: центральна зірка, планети земної групи та гіганти, супутники, астероїди, комети та міжпланетне середовище.</w:t>
+      </w:r>
+    </w:p>
+    <w:p>
+      <w:pPr>
+        <w:pStyle w:val="BodyText"/>
+        <w:widowControl/>
+        <w:tabs>
+          <w:tab w:val="clear" w:pos="567"/>
+        </w:tabs>
+        <w:suppressAutoHyphens w:val="true"/>
+        <w:bidi w:val="0"/>
+        <w:spacing w:lineRule="auto" w:line="360" w:before="0" w:after="140"/>
+        <w:ind w:firstLine="850" w:start="0" w:end="0"/>
+        <w:jc w:val="both"/>
+        <w:rPr>
+          <w:rFonts w:eastAsia="Helvetica-Bold"/>
+          <w:sz w:val="28"/>
+          <w:szCs w:val="28"/>
+          <w:lang w:val="en-US"/>
+        </w:rPr>
+      </w:pPr>
+      <w:r>
+        <w:rPr>
+          <w:rFonts w:eastAsia="Helvetica-Bold"/>
+          <w:sz w:val="28"/>
+          <w:szCs w:val="28"/>
+          <w:lang w:val="en-US"/>
+        </w:rPr>
+        <w:t>Системно-структурний аспект: Взаємозв'язок елементів базується на законі всесвітнього тяжіння. Сонце як центр мас визначає орбіти всіх інших об'єктів. Саме ці стійкі гравітаційні зв'язки роблять систему цілісним об'єктом, а не просто випадковим скупченням тіл.</w:t>
+      </w:r>
+    </w:p>
+    <w:p>
+      <w:pPr>
+        <w:pStyle w:val="BodyText"/>
+        <w:widowControl/>
+        <w:tabs>
+          <w:tab w:val="clear" w:pos="567"/>
+        </w:tabs>
+        <w:suppressAutoHyphens w:val="true"/>
+        <w:bidi w:val="0"/>
+        <w:spacing w:lineRule="auto" w:line="360" w:before="0" w:after="140"/>
+        <w:ind w:firstLine="850" w:start="0" w:end="0"/>
+        <w:jc w:val="both"/>
+        <w:rPr>
+          <w:rFonts w:eastAsia="Helvetica-Bold"/>
+          <w:sz w:val="28"/>
+          <w:szCs w:val="28"/>
+          <w:lang w:val="en-US"/>
+        </w:rPr>
+      </w:pPr>
+      <w:r>
+        <w:rPr>
+          <w:rFonts w:eastAsia="Helvetica-Bold"/>
+          <w:sz w:val="28"/>
+          <w:szCs w:val="28"/>
+          <w:lang w:val="en-US"/>
+        </w:rPr>
+        <w:t>Системно-комунікаційний аспект: Система взаємодіє із зовнішнім середовищем через обмін енергією, гравітаційний вплив сусідніх зірок та проходження крізь міжзоряні газові хмари.</w:t>
+      </w:r>
+    </w:p>
+    <w:p>
+      <w:pPr>
+        <w:pStyle w:val="BodyText"/>
+        <w:widowControl/>
+        <w:tabs>
+          <w:tab w:val="clear" w:pos="567"/>
+        </w:tabs>
+        <w:suppressAutoHyphens w:val="true"/>
+        <w:bidi w:val="0"/>
+        <w:spacing w:lineRule="auto" w:line="360" w:before="0" w:after="140"/>
+        <w:ind w:firstLine="850" w:start="0" w:end="0"/>
+        <w:jc w:val="both"/>
+        <w:rPr>
+          <w:rFonts w:eastAsia="Helvetica-Bold"/>
+          <w:sz w:val="28"/>
+          <w:szCs w:val="28"/>
+          <w:lang w:val="en-US"/>
+        </w:rPr>
+      </w:pPr>
+      <w:r>
+        <w:rPr>
+          <w:rFonts w:eastAsia="Helvetica-Bold"/>
+          <w:sz w:val="28"/>
+          <w:szCs w:val="28"/>
+          <w:lang w:val="en-US"/>
+        </w:rPr>
+        <w:t>Системно-інтегративний аспект: Цілісність системи забезпечується балансом між гравітацією та відцентровими силами. Це дозволяє системі зберігати свою структуру та якісну специфіку протягом мільярдів років, попри внутрішні зміни або зовнішні впливи.</w:t>
+      </w:r>
+    </w:p>
+    <w:p>
+      <w:pPr>
         <w:pStyle w:val="Normal"/>
         <w:tabs>
           <w:tab w:val="clear" w:pos="567"/>
@@ -968,7 +1211,7 @@
       <mc:AlternateContent>
         <mc:Choice Requires="wpg">
           <w:drawing>
-            <wp:anchor behindDoc="1" distT="13335" distB="12065" distL="13335" distR="12065" simplePos="0" locked="0" layoutInCell="1" allowOverlap="1" relativeHeight="13" wp14:anchorId="10994A40">
+            <wp:anchor behindDoc="1" distT="13335" distB="12065" distL="13335" distR="12065" simplePos="0" locked="0" layoutInCell="1" allowOverlap="1" relativeHeight="24" wp14:anchorId="10994A40">
               <wp:simplePos x="0" y="0"/>
               <wp:positionH relativeFrom="column">
                 <wp:posOffset>-229235</wp:posOffset>
@@ -976,7 +1219,7 @@
               <wp:positionV relativeFrom="paragraph">
                 <wp:posOffset>-266065</wp:posOffset>
               </wp:positionV>
-              <wp:extent cx="6657340" cy="10293350"/>
+              <wp:extent cx="6656705" cy="10292715"/>
               <wp:effectExtent l="13335" t="13335" r="12065" b="12065"/>
               <wp:wrapNone/>
               <wp:docPr id="1" name="Группа 60"/>
@@ -987,9 +1230,9 @@
                     <wpg:grpSpPr>
                       <a:xfrm>
                         <a:off x="0" y="0"/>
-                        <a:ext cx="6657480" cy="10293480"/>
+                        <a:ext cx="6656760" cy="10292760"/>
                         <a:chOff x="0" y="0"/>
-                        <a:chExt cx="6657480" cy="10293480"/>
+                        <a:chExt cx="6656760" cy="10292760"/>
                       </a:xfrm>
                     </wpg:grpSpPr>
                     <wps:wsp>
@@ -998,7 +1241,7 @@
                       <wps:spPr>
                         <a:xfrm>
                           <a:off x="748080" y="9753120"/>
-                          <a:ext cx="866880" cy="178560"/>
+                          <a:ext cx="866160" cy="177840"/>
                         </a:xfrm>
                         <a:prstGeom prst="rect">
                           <a:avLst/>
@@ -1075,7 +1318,7 @@
                       <wpg:grpSpPr>
                         <a:xfrm>
                           <a:off x="0" y="0"/>
-                          <a:ext cx="6657480" cy="10293480"/>
+                          <a:ext cx="6656760" cy="10292760"/>
                         </a:xfrm>
                       </wpg:grpSpPr>
                       <wpg:grpSp>
@@ -1083,7 +1326,7 @@
                         <wpg:grpSpPr>
                           <a:xfrm>
                             <a:off x="0" y="0"/>
-                            <a:ext cx="6657480" cy="10293480"/>
+                            <a:ext cx="6656760" cy="10292760"/>
                           </a:xfrm>
                         </wpg:grpSpPr>
                         <wps:wsp>
@@ -1092,7 +1335,7 @@
                           <wps:spPr>
                             <a:xfrm>
                               <a:off x="0" y="0"/>
-                              <a:ext cx="6657480" cy="10293480"/>
+                              <a:ext cx="6656760" cy="10292760"/>
                             </a:xfrm>
                             <a:prstGeom prst="rect">
                               <a:avLst/>
@@ -1369,7 +1612,7 @@
                           <wps:spPr>
                             <a:xfrm>
                               <a:off x="17640" y="10120680"/>
-                              <a:ext cx="330840" cy="156960"/>
+                              <a:ext cx="330120" cy="156240"/>
                             </a:xfrm>
                             <a:prstGeom prst="rect">
                               <a:avLst/>
@@ -1416,7 +1659,7 @@
                           <wps:spPr>
                             <a:xfrm>
                               <a:off x="379080" y="10120680"/>
-                              <a:ext cx="330840" cy="156960"/>
+                              <a:ext cx="330120" cy="156240"/>
                             </a:xfrm>
                             <a:prstGeom prst="rect">
                               <a:avLst/>
@@ -1463,7 +1706,7 @@
                           <wps:spPr>
                             <a:xfrm>
                               <a:off x="754920" y="10120680"/>
-                              <a:ext cx="853920" cy="156960"/>
+                              <a:ext cx="853560" cy="156240"/>
                             </a:xfrm>
                             <a:prstGeom prst="rect">
                               <a:avLst/>
@@ -1597,7 +1840,7 @@
                           <wps:spPr>
                             <a:xfrm>
                               <a:off x="1659240" y="10120680"/>
-                              <a:ext cx="508680" cy="156960"/>
+                              <a:ext cx="507960" cy="156240"/>
                             </a:xfrm>
                             <a:prstGeom prst="rect">
                               <a:avLst/>
@@ -1644,7 +1887,7 @@
                           <wps:spPr>
                             <a:xfrm>
                               <a:off x="2198880" y="10120680"/>
-                              <a:ext cx="330840" cy="156960"/>
+                              <a:ext cx="330120" cy="156240"/>
                             </a:xfrm>
                             <a:prstGeom prst="rect">
                               <a:avLst/>
@@ -1691,7 +1934,7 @@
                           <wps:spPr>
                             <a:xfrm>
                               <a:off x="6310080" y="9769320"/>
-                              <a:ext cx="330840" cy="156240"/>
+                              <a:ext cx="330120" cy="155520"/>
                             </a:xfrm>
                             <a:prstGeom prst="rect">
                               <a:avLst/>
@@ -1738,7 +1981,7 @@
                           <wps:spPr>
                             <a:xfrm>
                               <a:off x="6310080" y="10005120"/>
-                              <a:ext cx="330840" cy="215280"/>
+                              <a:ext cx="330120" cy="214560"/>
                             </a:xfrm>
                             <a:prstGeom prst="rect">
                               <a:avLst/>
@@ -1803,7 +2046,7 @@
                                     <w:sz w:val="24"/>
                                     <w:lang w:val="ru-RU"/>
                                   </w:rPr>
-                                  <w:t>3</w:t>
+                                  <w:t>4</w:t>
                                 </w:r>
                                 <w:r>
                                   <w:rPr>
@@ -1826,7 +2069,7 @@
                           <wps:spPr>
                             <a:xfrm>
                               <a:off x="2578680" y="9894600"/>
-                              <a:ext cx="3685680" cy="243360"/>
+                              <a:ext cx="3684960" cy="242640"/>
                             </a:xfrm>
                             <a:prstGeom prst="rect">
                               <a:avLst/>
@@ -1978,7 +2221,7 @@
                         <wps:spPr>
                           <a:xfrm>
                             <a:off x="748080" y="9928080"/>
-                            <a:ext cx="881280" cy="174600"/>
+                            <a:ext cx="880920" cy="173880"/>
                           </a:xfrm>
                           <a:prstGeom prst="rect">
                             <a:avLst/>
@@ -2027,8 +2270,8 @@
         </mc:Choice>
         <mc:Fallback>
           <w:pict>
-            <v:group id="shape_0" alt="Группа 60" style="position:absolute;margin-left:-18.05pt;margin-top:-20.95pt;width:524.2pt;height:810.5pt" coordorigin="-361,-419" coordsize="10484,16210">
-              <v:rect id="shape_0" stroked="f" o:allowincell="f" style="position:absolute;left:817;top:14940;width:1364;height:280;mso-wrap-style:square;v-text-anchor:top">
+            <v:group id="shape_0" alt="Группа 60" style="position:absolute;margin-left:-18.05pt;margin-top:-20.95pt;width:524.15pt;height:810.45pt" coordorigin="-361,-419" coordsize="10483,16209">
+              <v:rect id="shape_0" stroked="f" o:allowincell="f" style="position:absolute;left:817;top:14940;width:1363;height:279;mso-wrap-style:square;v-text-anchor:top">
                 <v:fill o:detectmouseclick="t" on="false"/>
                 <v:stroke color="#3465a4" joinstyle="round" endcap="flat"/>
                 <v:textbox>
@@ -2085,9 +2328,9 @@
                 </v:textbox>
                 <w10:wrap type="none"/>
               </v:rect>
-              <v:group id="shape_0" style="position:absolute;left:-361;top:-419;width:10484;height:16210">
-                <v:group id="shape_0" style="position:absolute;left:-361;top:-419;width:10484;height:16210">
-                  <v:rect id="shape_0" stroked="t" o:allowincell="f" style="position:absolute;left:-361;top:-419;width:10483;height:16209;mso-wrap-style:none;v-text-anchor:middle">
+              <v:group id="shape_0" style="position:absolute;left:-361;top:-419;width:10483;height:16209">
+                <v:group id="shape_0" style="position:absolute;left:-361;top:-419;width:10483;height:16209">
+                  <v:rect id="shape_0" stroked="t" o:allowincell="f" style="position:absolute;left:-361;top:-419;width:10482;height:16208;mso-wrap-style:none;v-text-anchor:middle">
                     <v:fill o:detectmouseclick="t" on="false"/>
                     <v:stroke color="black" weight="25560" joinstyle="miter" endcap="flat"/>
                     <w10:wrap type="none"/>
@@ -2142,7 +2385,7 @@
                     <v:fill o:detectmouseclick="t" on="false"/>
                     <w10:wrap type="none"/>
                   </v:line>
-                  <v:rect id="shape_0" stroked="f" o:allowincell="f" style="position:absolute;left:-333;top:15519;width:520;height:246;mso-wrap-style:square;v-text-anchor:top">
+                  <v:rect id="shape_0" stroked="f" o:allowincell="f" style="position:absolute;left:-333;top:15519;width:519;height:245;mso-wrap-style:square;v-text-anchor:top">
                     <v:fill o:detectmouseclick="t" on="false"/>
                     <v:stroke color="#3465a4" joinstyle="round" endcap="flat"/>
                     <v:textbox>
@@ -2168,7 +2411,7 @@
                     </v:textbox>
                     <w10:wrap type="none"/>
                   </v:rect>
-                  <v:rect id="shape_0" stroked="f" o:allowincell="f" style="position:absolute;left:236;top:15519;width:520;height:246;mso-wrap-style:square;v-text-anchor:top">
+                  <v:rect id="shape_0" stroked="f" o:allowincell="f" style="position:absolute;left:236;top:15519;width:519;height:245;mso-wrap-style:square;v-text-anchor:top">
                     <v:fill o:detectmouseclick="t" on="false"/>
                     <v:stroke color="#3465a4" joinstyle="round" endcap="flat"/>
                     <v:textbox>
@@ -2194,7 +2437,7 @@
                     </v:textbox>
                     <w10:wrap type="none"/>
                   </v:rect>
-                  <v:rect id="shape_0" stroked="f" o:allowincell="f" style="position:absolute;left:828;top:15519;width:1344;height:246;mso-wrap-style:square;v-text-anchor:top">
+                  <v:rect id="shape_0" stroked="f" o:allowincell="f" style="position:absolute;left:828;top:15519;width:1343;height:245;mso-wrap-style:square;v-text-anchor:top">
                     <v:fill o:detectmouseclick="t" on="false"/>
                     <v:stroke color="#3465a4" joinstyle="round" endcap="flat"/>
                     <v:textbox>
@@ -2307,7 +2550,7 @@
                     </v:textbox>
                     <w10:wrap type="none"/>
                   </v:rect>
-                  <v:rect id="shape_0" stroked="f" o:allowincell="f" style="position:absolute;left:2252;top:15519;width:800;height:246;mso-wrap-style:square;v-text-anchor:top">
+                  <v:rect id="shape_0" stroked="f" o:allowincell="f" style="position:absolute;left:2252;top:15519;width:799;height:245;mso-wrap-style:square;v-text-anchor:top">
                     <v:fill o:detectmouseclick="t" on="false"/>
                     <v:stroke color="#3465a4" joinstyle="round" endcap="flat"/>
                     <v:textbox>
@@ -2333,7 +2576,7 @@
                     </v:textbox>
                     <w10:wrap type="none"/>
                   </v:rect>
-                  <v:rect id="shape_0" stroked="f" o:allowincell="f" style="position:absolute;left:3102;top:15519;width:520;height:246;mso-wrap-style:square;v-text-anchor:top">
+                  <v:rect id="shape_0" stroked="f" o:allowincell="f" style="position:absolute;left:3102;top:15519;width:519;height:245;mso-wrap-style:square;v-text-anchor:top">
                     <v:fill o:detectmouseclick="t" on="false"/>
                     <v:stroke color="#3465a4" joinstyle="round" endcap="flat"/>
                     <v:textbox>
@@ -2359,7 +2602,7 @@
                     </v:textbox>
                     <w10:wrap type="none"/>
                   </v:rect>
-                  <v:rect id="shape_0" stroked="f" o:allowincell="f" style="position:absolute;left:9576;top:14966;width:520;height:245;mso-wrap-style:square;v-text-anchor:top">
+                  <v:rect id="shape_0" stroked="f" o:allowincell="f" style="position:absolute;left:9576;top:14966;width:519;height:244;mso-wrap-style:square;v-text-anchor:top">
                     <v:fill o:detectmouseclick="t" on="false"/>
                     <v:stroke color="#3465a4" joinstyle="round" endcap="flat"/>
                     <v:textbox>
@@ -2385,7 +2628,7 @@
                     </v:textbox>
                     <w10:wrap type="none"/>
                   </v:rect>
-                  <v:rect id="shape_0" stroked="f" o:allowincell="f" style="position:absolute;left:9576;top:15337;width:520;height:338;mso-wrap-style:square;v-text-anchor:top">
+                  <v:rect id="shape_0" stroked="f" o:allowincell="f" style="position:absolute;left:9576;top:15337;width:519;height:337;mso-wrap-style:square;v-text-anchor:top">
                     <v:fill o:detectmouseclick="t" on="false"/>
                     <v:stroke color="#3465a4" joinstyle="round" endcap="flat"/>
                     <v:textbox>
@@ -2437,7 +2680,7 @@
                               <w:sz w:val="24"/>
                               <w:lang w:val="ru-RU"/>
                             </w:rPr>
-                            <w:t>3</w:t>
+                            <w:t>4</w:t>
                           </w:r>
                           <w:r>
                             <w:rPr>
@@ -2452,7 +2695,7 @@
                     </v:textbox>
                     <w10:wrap type="none"/>
                   </v:rect>
-                  <v:rect id="shape_0" stroked="f" o:allowincell="f" style="position:absolute;left:3700;top:15163;width:5803;height:382;mso-wrap-style:square;v-text-anchor:top">
+                  <v:rect id="shape_0" stroked="f" o:allowincell="f" style="position:absolute;left:3700;top:15163;width:5802;height:381;mso-wrap-style:square;v-text-anchor:top">
                     <v:fill o:detectmouseclick="t" on="false"/>
                     <v:stroke color="#3465a4" joinstyle="round" endcap="flat"/>
                     <v:textbox>
@@ -2583,7 +2826,7 @@
                     <w10:wrap type="none"/>
                   </v:rect>
                 </v:group>
-                <v:rect id="shape_0" stroked="f" o:allowincell="f" style="position:absolute;left:817;top:15216;width:1387;height:274;mso-wrap-style:none;v-text-anchor:middle">
+                <v:rect id="shape_0" stroked="f" o:allowincell="f" style="position:absolute;left:817;top:15216;width:1386;height:273;mso-wrap-style:none;v-text-anchor:middle">
                   <v:fill o:detectmouseclick="t" on="false"/>
                   <v:stroke color="#3465a4" joinstyle="round" endcap="flat"/>
                   <v:textbox>
@@ -2630,7 +2873,7 @@
       <mc:AlternateContent>
         <mc:Choice Requires="wpg">
           <w:drawing>
-            <wp:anchor behindDoc="1" distT="13335" distB="12065" distL="13335" distR="12065" simplePos="0" locked="0" layoutInCell="1" allowOverlap="1" relativeHeight="24" wp14:anchorId="10994A42">
+            <wp:anchor behindDoc="1" distT="13335" distB="12065" distL="13335" distR="12065" simplePos="0" locked="0" layoutInCell="1" allowOverlap="1" relativeHeight="35" wp14:anchorId="10994A42">
               <wp:simplePos x="0" y="0"/>
               <wp:positionH relativeFrom="column">
                 <wp:posOffset>-229870</wp:posOffset>
@@ -2638,7 +2881,7 @@
               <wp:positionV relativeFrom="paragraph">
                 <wp:posOffset>-244475</wp:posOffset>
               </wp:positionV>
-              <wp:extent cx="6657340" cy="10293350"/>
+              <wp:extent cx="6656705" cy="10292715"/>
               <wp:effectExtent l="13335" t="13335" r="12065" b="12065"/>
               <wp:wrapNone/>
               <wp:docPr id="13" name="Группа 10"/>
@@ -2649,9 +2892,9 @@
                     <wpg:grpSpPr>
                       <a:xfrm>
                         <a:off x="0" y="0"/>
-                        <a:ext cx="6657480" cy="10293480"/>
+                        <a:ext cx="6656760" cy="10292760"/>
                         <a:chOff x="0" y="0"/>
-                        <a:chExt cx="6657480" cy="10293480"/>
+                        <a:chExt cx="6656760" cy="10292760"/>
                       </a:xfrm>
                     </wpg:grpSpPr>
                     <wps:wsp>
@@ -2660,7 +2903,7 @@
                       <wps:spPr>
                         <a:xfrm>
                           <a:off x="0" y="0"/>
-                          <a:ext cx="6657480" cy="10293480"/>
+                          <a:ext cx="6656760" cy="10292760"/>
                         </a:xfrm>
                         <a:prstGeom prst="rect">
                           <a:avLst/>
@@ -2912,7 +3155,7 @@
                       <wps:spPr>
                         <a:xfrm>
                           <a:off x="17640" y="9220680"/>
-                          <a:ext cx="291600" cy="156960"/>
+                          <a:ext cx="290880" cy="156240"/>
                         </a:xfrm>
                         <a:prstGeom prst="rect">
                           <a:avLst/>
@@ -2967,7 +3210,7 @@
                       <wps:spPr>
                         <a:xfrm>
                           <a:off x="349920" y="9220680"/>
-                          <a:ext cx="363960" cy="156960"/>
+                          <a:ext cx="363240" cy="156240"/>
                         </a:xfrm>
                         <a:prstGeom prst="rect">
                           <a:avLst/>
@@ -3016,7 +3259,7 @@
                       <wps:spPr>
                         <a:xfrm>
                           <a:off x="754920" y="9220680"/>
-                          <a:ext cx="853920" cy="156960"/>
+                          <a:ext cx="853560" cy="156240"/>
                         </a:xfrm>
                         <a:prstGeom prst="rect">
                           <a:avLst/>
@@ -3073,7 +3316,7 @@
                       <wps:spPr>
                         <a:xfrm>
                           <a:off x="1659240" y="9220680"/>
-                          <a:ext cx="508680" cy="156960"/>
+                          <a:ext cx="507960" cy="156240"/>
                         </a:xfrm>
                         <a:prstGeom prst="rect">
                           <a:avLst/>
@@ -3122,7 +3365,7 @@
                       <wps:spPr>
                         <a:xfrm>
                           <a:off x="2198880" y="9220680"/>
-                          <a:ext cx="330840" cy="156960"/>
+                          <a:ext cx="330120" cy="156240"/>
                         </a:xfrm>
                         <a:prstGeom prst="rect">
                           <a:avLst/>
@@ -3171,7 +3414,7 @@
                       <wps:spPr>
                         <a:xfrm>
                           <a:off x="5304240" y="9399240"/>
-                          <a:ext cx="488880" cy="156240"/>
+                          <a:ext cx="488160" cy="155520"/>
                         </a:xfrm>
                         <a:prstGeom prst="rect">
                           <a:avLst/>
@@ -3217,7 +3460,7 @@
                       <wps:spPr>
                         <a:xfrm>
                           <a:off x="5304240" y="9587160"/>
-                          <a:ext cx="488880" cy="156960"/>
+                          <a:ext cx="488160" cy="156240"/>
                         </a:xfrm>
                         <a:prstGeom prst="rect">
                           <a:avLst/>
@@ -3264,7 +3507,7 @@
                       <wps:spPr>
                         <a:xfrm>
                           <a:off x="2585880" y="8977680"/>
-                          <a:ext cx="3990240" cy="240840"/>
+                          <a:ext cx="3989880" cy="240120"/>
                         </a:xfrm>
                         <a:prstGeom prst="rect">
                           <a:avLst/>
@@ -3517,7 +3760,7 @@
                       <wpg:grpSpPr>
                         <a:xfrm>
                           <a:off x="12600" y="9387720"/>
-                          <a:ext cx="1615320" cy="181440"/>
+                          <a:ext cx="1614960" cy="181080"/>
                         </a:xfrm>
                       </wpg:grpSpPr>
                       <wps:wsp>
@@ -3526,7 +3769,7 @@
                         <wps:spPr>
                           <a:xfrm>
                             <a:off x="0" y="15840"/>
-                            <a:ext cx="705600" cy="156960"/>
+                            <a:ext cx="704880" cy="156240"/>
                           </a:xfrm>
                           <a:prstGeom prst="rect">
                             <a:avLst/>
@@ -3584,7 +3827,7 @@
                         <wps:spPr>
                           <a:xfrm>
                             <a:off x="734040" y="0"/>
-                            <a:ext cx="881280" cy="181440"/>
+                            <a:ext cx="880920" cy="181080"/>
                           </a:xfrm>
                           <a:prstGeom prst="rect">
                             <a:avLst/>
@@ -3650,7 +3893,7 @@
                       <wpg:grpSpPr>
                         <a:xfrm>
                           <a:off x="12600" y="9582120"/>
-                          <a:ext cx="1595880" cy="156960"/>
+                          <a:ext cx="1595160" cy="156240"/>
                         </a:xfrm>
                       </wpg:grpSpPr>
                       <wps:wsp>
@@ -3659,7 +3902,7 @@
                         <wps:spPr>
                           <a:xfrm>
                             <a:off x="0" y="0"/>
-                            <a:ext cx="705600" cy="156960"/>
+                            <a:ext cx="704880" cy="156240"/>
                           </a:xfrm>
                           <a:prstGeom prst="rect">
                             <a:avLst/>
@@ -3712,7 +3955,7 @@
                         <wps:spPr>
                           <a:xfrm>
                             <a:off x="741960" y="0"/>
-                            <a:ext cx="853920" cy="156960"/>
+                            <a:ext cx="853560" cy="156240"/>
                           </a:xfrm>
                           <a:prstGeom prst="rect">
                             <a:avLst/>
@@ -3763,7 +4006,7 @@
                       <wpg:grpSpPr>
                         <a:xfrm>
                           <a:off x="12600" y="9765000"/>
-                          <a:ext cx="1595880" cy="156960"/>
+                          <a:ext cx="1595160" cy="156240"/>
                         </a:xfrm>
                       </wpg:grpSpPr>
                       <wps:wsp>
@@ -3772,7 +4015,7 @@
                         <wps:spPr>
                           <a:xfrm>
                             <a:off x="0" y="0"/>
-                            <a:ext cx="705600" cy="156960"/>
+                            <a:ext cx="704880" cy="156240"/>
                           </a:xfrm>
                           <a:prstGeom prst="rect">
                             <a:avLst/>
@@ -3822,7 +4065,7 @@
                         <wps:spPr>
                           <a:xfrm>
                             <a:off x="741960" y="0"/>
-                            <a:ext cx="853920" cy="156960"/>
+                            <a:ext cx="853560" cy="156240"/>
                           </a:xfrm>
                           <a:prstGeom prst="rect">
                             <a:avLst/>
@@ -3861,7 +4104,7 @@
                       <wpg:grpSpPr>
                         <a:xfrm>
                           <a:off x="12600" y="9942840"/>
-                          <a:ext cx="1595880" cy="156960"/>
+                          <a:ext cx="1595160" cy="156240"/>
                         </a:xfrm>
                       </wpg:grpSpPr>
                       <wps:wsp>
@@ -3870,7 +4113,7 @@
                         <wps:spPr>
                           <a:xfrm>
                             <a:off x="0" y="0"/>
-                            <a:ext cx="705600" cy="156960"/>
+                            <a:ext cx="704880" cy="156240"/>
                           </a:xfrm>
                           <a:prstGeom prst="rect">
                             <a:avLst/>
@@ -3920,7 +4163,7 @@
                         <wps:spPr>
                           <a:xfrm>
                             <a:off x="741960" y="0"/>
-                            <a:ext cx="853920" cy="156960"/>
+                            <a:ext cx="853560" cy="156240"/>
                           </a:xfrm>
                           <a:prstGeom prst="rect">
                             <a:avLst/>
@@ -3959,7 +4202,7 @@
                       <wpg:grpSpPr>
                         <a:xfrm>
                           <a:off x="12600" y="10120680"/>
-                          <a:ext cx="1595880" cy="156960"/>
+                          <a:ext cx="1595160" cy="156240"/>
                         </a:xfrm>
                       </wpg:grpSpPr>
                       <wps:wsp>
@@ -3968,7 +4211,7 @@
                         <wps:spPr>
                           <a:xfrm>
                             <a:off x="0" y="0"/>
-                            <a:ext cx="705600" cy="156960"/>
+                            <a:ext cx="704880" cy="156240"/>
                           </a:xfrm>
                           <a:prstGeom prst="rect">
                             <a:avLst/>
@@ -4018,7 +4261,7 @@
                         <wps:spPr>
                           <a:xfrm>
                             <a:off x="741960" y="0"/>
-                            <a:ext cx="853920" cy="156960"/>
+                            <a:ext cx="853560" cy="156240"/>
                           </a:xfrm>
                           <a:prstGeom prst="rect">
                             <a:avLst/>
@@ -4091,7 +4334,7 @@
                       <wps:spPr>
                         <a:xfrm>
                           <a:off x="2593440" y="9523800"/>
-                          <a:ext cx="2100600" cy="730080"/>
+                          <a:ext cx="2099880" cy="729720"/>
                         </a:xfrm>
                         <a:prstGeom prst="rect">
                           <a:avLst/>
@@ -4239,7 +4482,7 @@
                       <wps:spPr>
                         <a:xfrm>
                           <a:off x="4759920" y="9399240"/>
-                          <a:ext cx="488160" cy="156240"/>
+                          <a:ext cx="487800" cy="155520"/>
                         </a:xfrm>
                         <a:prstGeom prst="rect">
                           <a:avLst/>
@@ -4284,7 +4527,7 @@
                       <wps:spPr>
                         <a:xfrm>
                           <a:off x="5852880" y="9399240"/>
-                          <a:ext cx="772920" cy="156240"/>
+                          <a:ext cx="772200" cy="155520"/>
                         </a:xfrm>
                         <a:prstGeom prst="rect">
                           <a:avLst/>
@@ -4330,7 +4573,7 @@
                       <wps:spPr>
                         <a:xfrm>
                           <a:off x="5857920" y="9582120"/>
-                          <a:ext cx="771480" cy="156240"/>
+                          <a:ext cx="770760" cy="155520"/>
                         </a:xfrm>
                         <a:prstGeom prst="rect">
                           <a:avLst/>
@@ -4362,7 +4605,7 @@
                                 <w:sz w:val="20"/>
                                 <w:lang w:val="en-US"/>
                               </w:rPr>
-                              <w:t>3</w:t>
+                              <w:t>4</w:t>
                             </w:r>
                           </w:p>
                         </w:txbxContent>
@@ -4427,7 +4670,7 @@
                       <wps:spPr>
                         <a:xfrm>
                           <a:off x="4759920" y="9864720"/>
-                          <a:ext cx="1865520" cy="340200"/>
+                          <a:ext cx="1865160" cy="339840"/>
                         </a:xfrm>
                         <a:prstGeom prst="rect">
                           <a:avLst/>
@@ -4486,8 +4729,8 @@
         </mc:Choice>
         <mc:Fallback>
           <w:pict>
-            <v:group id="shape_0" alt="Группа 10" style="position:absolute;margin-left:-18.1pt;margin-top:-19.25pt;width:524.2pt;height:810.5pt" coordorigin="-362,-385" coordsize="10484,16210">
-              <v:rect id="shape_0" stroked="t" o:allowincell="f" style="position:absolute;left:-362;top:-385;width:10483;height:16209;mso-wrap-style:none;v-text-anchor:middle">
+            <v:group id="shape_0" alt="Группа 10" style="position:absolute;margin-left:-18.1pt;margin-top:-19.25pt;width:524.15pt;height:810.45pt" coordorigin="-362,-385" coordsize="10483,16209">
+              <v:rect id="shape_0" stroked="t" o:allowincell="f" style="position:absolute;left:-362;top:-385;width:10482;height:16208;mso-wrap-style:none;v-text-anchor:middle">
                 <v:fill o:detectmouseclick="t" on="false"/>
                 <v:stroke color="black" weight="25560" joinstyle="miter" endcap="flat"/>
                 <w10:wrap type="none"/>
@@ -4537,7 +4780,7 @@
                 <v:fill o:detectmouseclick="t" on="false"/>
                 <w10:wrap type="none"/>
               </v:line>
-              <v:rect id="shape_0" stroked="f" o:allowincell="f" style="position:absolute;left:-334;top:14136;width:458;height:246;mso-wrap-style:square;v-text-anchor:top">
+              <v:rect id="shape_0" stroked="f" o:allowincell="f" style="position:absolute;left:-334;top:14136;width:457;height:245;mso-wrap-style:square;v-text-anchor:top">
                 <v:fill o:detectmouseclick="t" on="false"/>
                 <v:stroke color="#3465a4" joinstyle="round" endcap="flat"/>
                 <v:textbox>
@@ -4571,7 +4814,7 @@
                 </v:textbox>
                 <w10:wrap type="none"/>
               </v:rect>
-              <v:rect id="shape_0" stroked="f" o:allowincell="f" style="position:absolute;left:189;top:14136;width:572;height:246;mso-wrap-style:square;v-text-anchor:top">
+              <v:rect id="shape_0" stroked="f" o:allowincell="f" style="position:absolute;left:189;top:14136;width:571;height:245;mso-wrap-style:square;v-text-anchor:top">
                 <v:fill o:detectmouseclick="t" on="false"/>
                 <v:stroke color="#3465a4" joinstyle="round" endcap="flat"/>
                 <v:textbox>
@@ -4599,7 +4842,7 @@
                 </v:textbox>
                 <w10:wrap type="none"/>
               </v:rect>
-              <v:rect id="shape_0" stroked="f" o:allowincell="f" style="position:absolute;left:827;top:14136;width:1344;height:246;mso-wrap-style:square;v-text-anchor:top">
+              <v:rect id="shape_0" stroked="f" o:allowincell="f" style="position:absolute;left:827;top:14136;width:1343;height:245;mso-wrap-style:square;v-text-anchor:top">
                 <v:fill o:detectmouseclick="t" on="false"/>
                 <v:stroke color="#3465a4" joinstyle="round" endcap="flat"/>
                 <v:textbox>
@@ -4635,7 +4878,7 @@
                 </v:textbox>
                 <w10:wrap type="none"/>
               </v:rect>
-              <v:rect id="shape_0" stroked="f" o:allowincell="f" style="position:absolute;left:2251;top:14136;width:800;height:246;mso-wrap-style:square;v-text-anchor:top">
+              <v:rect id="shape_0" stroked="f" o:allowincell="f" style="position:absolute;left:2251;top:14136;width:799;height:245;mso-wrap-style:square;v-text-anchor:top">
                 <v:fill o:detectmouseclick="t" on="false"/>
                 <v:stroke color="#3465a4" joinstyle="round" endcap="flat"/>
                 <v:textbox>
@@ -4663,7 +4906,7 @@
                 </v:textbox>
                 <w10:wrap type="none"/>
               </v:rect>
-              <v:rect id="shape_0" stroked="f" o:allowincell="f" style="position:absolute;left:3101;top:14136;width:520;height:246;mso-wrap-style:square;v-text-anchor:top">
+              <v:rect id="shape_0" stroked="f" o:allowincell="f" style="position:absolute;left:3101;top:14136;width:519;height:245;mso-wrap-style:square;v-text-anchor:top">
                 <v:fill o:detectmouseclick="t" on="false"/>
                 <v:stroke color="#3465a4" joinstyle="round" endcap="flat"/>
                 <v:textbox>
@@ -4691,7 +4934,7 @@
                 </v:textbox>
                 <w10:wrap type="none"/>
               </v:rect>
-              <v:rect id="shape_0" stroked="f" o:allowincell="f" style="position:absolute;left:7991;top:14417;width:769;height:245;mso-wrap-style:square;v-text-anchor:top">
+              <v:rect id="shape_0" stroked="f" o:allowincell="f" style="position:absolute;left:7991;top:14417;width:768;height:244;mso-wrap-style:square;v-text-anchor:top">
                 <v:fill o:detectmouseclick="t" on="false"/>
                 <v:stroke color="#3465a4" joinstyle="round" endcap="flat"/>
                 <v:textbox>
@@ -4716,7 +4959,7 @@
                 </v:textbox>
                 <w10:wrap type="none"/>
               </v:rect>
-              <v:rect id="shape_0" stroked="f" o:allowincell="f" style="position:absolute;left:7991;top:14713;width:769;height:246;mso-wrap-style:square;v-text-anchor:top">
+              <v:rect id="shape_0" stroked="f" o:allowincell="f" style="position:absolute;left:7991;top:14713;width:768;height:245;mso-wrap-style:square;v-text-anchor:top">
                 <v:fill o:detectmouseclick="t" on="false"/>
                 <v:stroke color="#3465a4" joinstyle="round" endcap="flat"/>
                 <v:textbox>
@@ -4742,7 +4985,7 @@
                 </v:textbox>
                 <w10:wrap type="none"/>
               </v:rect>
-              <v:rect id="shape_0" stroked="f" o:allowincell="f" style="position:absolute;left:3710;top:13753;width:6283;height:378;mso-wrap-style:square;v-text-anchor:top">
+              <v:rect id="shape_0" stroked="f" o:allowincell="f" style="position:absolute;left:3710;top:13753;width:6282;height:377;mso-wrap-style:square;v-text-anchor:top">
                 <v:fill o:detectmouseclick="t" on="false"/>
                 <v:stroke color="#3465a4" joinstyle="round" endcap="flat"/>
                 <v:textbox>
@@ -4875,8 +5118,8 @@
                 <v:fill o:detectmouseclick="t" on="false"/>
                 <w10:wrap type="none"/>
               </v:line>
-              <v:group id="shape_0" style="position:absolute;left:-342;top:14399;width:2544;height:286">
-                <v:rect id="shape_0" stroked="f" o:allowincell="f" style="position:absolute;left:-342;top:14424;width:1110;height:246;mso-wrap-style:square;v-text-anchor:top">
+              <v:group id="shape_0" style="position:absolute;left:-342;top:14399;width:2543;height:285">
+                <v:rect id="shape_0" stroked="f" o:allowincell="f" style="position:absolute;left:-342;top:14424;width:1109;height:245;mso-wrap-style:square;v-text-anchor:top">
                   <v:fill o:detectmouseclick="t" on="false"/>
                   <v:stroke color="#3465a4" joinstyle="round" endcap="flat"/>
                   <v:textbox>
@@ -4913,7 +5156,7 @@
                   </v:textbox>
                   <w10:wrap type="none"/>
                 </v:rect>
-                <v:rect id="shape_0" stroked="f" o:allowincell="f" style="position:absolute;left:814;top:14399;width:1387;height:285;mso-wrap-style:square;v-text-anchor:top">
+                <v:rect id="shape_0" stroked="f" o:allowincell="f" style="position:absolute;left:814;top:14399;width:1386;height:284;mso-wrap-style:square;v-text-anchor:top">
                   <v:fill o:detectmouseclick="t" on="false"/>
                   <v:stroke color="#3465a4" joinstyle="round" endcap="flat"/>
                   <v:textbox>
@@ -4959,8 +5202,8 @@
                   <w10:wrap type="none"/>
                 </v:rect>
               </v:group>
-              <v:group id="shape_0" style="position:absolute;left:-342;top:14705;width:2513;height:247">
-                <v:rect id="shape_0" stroked="f" o:allowincell="f" style="position:absolute;left:-342;top:14705;width:1110;height:246;mso-wrap-style:square;v-text-anchor:top">
+              <v:group id="shape_0" style="position:absolute;left:-342;top:14705;width:2513;height:246">
+                <v:rect id="shape_0" stroked="f" o:allowincell="f" style="position:absolute;left:-342;top:14705;width:1109;height:245;mso-wrap-style:square;v-text-anchor:top">
                   <v:fill o:detectmouseclick="t" on="false"/>
                   <v:stroke color="#3465a4" joinstyle="round" endcap="flat"/>
                   <v:textbox>
@@ -4992,7 +5235,7 @@
                   </v:textbox>
                   <w10:wrap type="none"/>
                 </v:rect>
-                <v:rect id="shape_0" stroked="f" o:allowincell="f" style="position:absolute;left:826;top:14705;width:1344;height:246;mso-wrap-style:square;v-text-anchor:top">
+                <v:rect id="shape_0" stroked="f" o:allowincell="f" style="position:absolute;left:826;top:14705;width:1343;height:245;mso-wrap-style:square;v-text-anchor:top">
                   <v:fill o:detectmouseclick="t" on="false"/>
                   <v:stroke color="#3465a4" joinstyle="round" endcap="flat"/>
                   <v:textbox>
@@ -5023,8 +5266,8 @@
                   <w10:wrap type="none"/>
                 </v:rect>
               </v:group>
-              <v:group id="shape_0" style="position:absolute;left:-342;top:14993;width:2513;height:247">
-                <v:rect id="shape_0" stroked="f" o:allowincell="f" style="position:absolute;left:-342;top:14993;width:1110;height:246;mso-wrap-style:square;v-text-anchor:top">
+              <v:group id="shape_0" style="position:absolute;left:-342;top:14993;width:2513;height:246">
+                <v:rect id="shape_0" stroked="f" o:allowincell="f" style="position:absolute;left:-342;top:14993;width:1109;height:245;mso-wrap-style:square;v-text-anchor:top">
                   <v:fill o:detectmouseclick="t" on="false"/>
                   <v:stroke color="#3465a4" joinstyle="round" endcap="flat"/>
                   <v:textbox>
@@ -5053,7 +5296,7 @@
                   </v:textbox>
                   <w10:wrap type="none"/>
                 </v:rect>
-                <v:rect id="shape_0" stroked="f" o:allowincell="f" style="position:absolute;left:826;top:14993;width:1344;height:246;mso-wrap-style:none;v-text-anchor:middle">
+                <v:rect id="shape_0" stroked="f" o:allowincell="f" style="position:absolute;left:826;top:14993;width:1343;height:245;mso-wrap-style:none;v-text-anchor:middle">
                   <v:fill o:detectmouseclick="t" on="false"/>
                   <v:stroke color="#3465a4" joinstyle="round" endcap="flat"/>
                   <v:textbox>
@@ -5072,8 +5315,8 @@
                   <w10:wrap type="none"/>
                 </v:rect>
               </v:group>
-              <v:group id="shape_0" style="position:absolute;left:-342;top:15273;width:2513;height:247">
-                <v:rect id="shape_0" stroked="f" o:allowincell="f" style="position:absolute;left:-342;top:15273;width:1110;height:246;mso-wrap-style:square;v-text-anchor:top">
+              <v:group id="shape_0" style="position:absolute;left:-342;top:15273;width:2513;height:246">
+                <v:rect id="shape_0" stroked="f" o:allowincell="f" style="position:absolute;left:-342;top:15273;width:1109;height:245;mso-wrap-style:square;v-text-anchor:top">
                   <v:fill o:detectmouseclick="t" on="false"/>
                   <v:stroke color="#3465a4" joinstyle="round" endcap="flat"/>
                   <v:textbox>
@@ -5102,7 +5345,7 @@
                   </v:textbox>
                   <w10:wrap type="none"/>
                 </v:rect>
-                <v:rect id="shape_0" stroked="f" o:allowincell="f" style="position:absolute;left:826;top:15273;width:1344;height:246;mso-wrap-style:none;v-text-anchor:middle">
+                <v:rect id="shape_0" stroked="f" o:allowincell="f" style="position:absolute;left:826;top:15273;width:1343;height:245;mso-wrap-style:none;v-text-anchor:middle">
                   <v:fill o:detectmouseclick="t" on="false"/>
                   <v:stroke color="#3465a4" joinstyle="round" endcap="flat"/>
                   <v:textbox>
@@ -5121,8 +5364,8 @@
                   <w10:wrap type="none"/>
                 </v:rect>
               </v:group>
-              <v:group id="shape_0" style="position:absolute;left:-342;top:15553;width:2513;height:247">
-                <v:rect id="shape_0" stroked="f" o:allowincell="f" style="position:absolute;left:-342;top:15553;width:1110;height:246;mso-wrap-style:square;v-text-anchor:top">
+              <v:group id="shape_0" style="position:absolute;left:-342;top:15553;width:2513;height:246">
+                <v:rect id="shape_0" stroked="f" o:allowincell="f" style="position:absolute;left:-342;top:15553;width:1109;height:245;mso-wrap-style:square;v-text-anchor:top">
                   <v:fill o:detectmouseclick="t" on="false"/>
                   <v:stroke color="#3465a4" joinstyle="round" endcap="flat"/>
                   <v:textbox>
@@ -5151,7 +5394,7 @@
                   </v:textbox>
                   <w10:wrap type="none"/>
                 </v:rect>
-                <v:rect id="shape_0" stroked="f" o:allowincell="f" style="position:absolute;left:826;top:15553;width:1344;height:246;mso-wrap-style:none;v-text-anchor:middle">
+                <v:rect id="shape_0" stroked="f" o:allowincell="f" style="position:absolute;left:826;top:15553;width:1343;height:245;mso-wrap-style:none;v-text-anchor:middle">
                   <v:fill o:detectmouseclick="t" on="false"/>
                   <v:stroke color="#3465a4" joinstyle="round" endcap="flat"/>
                   <v:textbox>
@@ -5183,7 +5426,7 @@
                 <v:fill o:detectmouseclick="t" on="false"/>
                 <w10:wrap type="none"/>
               </v:line>
-              <v:rect id="shape_0" stroked="f" o:allowincell="f" style="position:absolute;left:3722;top:14613;width:3307;height:1149;mso-wrap-style:square;v-text-anchor:middle">
+              <v:rect id="shape_0" stroked="f" o:allowincell="f" style="position:absolute;left:3722;top:14613;width:3306;height:1148;mso-wrap-style:square;v-text-anchor:middle">
                 <v:fill o:detectmouseclick="t" on="false"/>
                 <v:stroke color="#3465a4" joinstyle="round" endcap="flat"/>
                 <v:textbox>
@@ -5250,7 +5493,7 @@
                 <v:fill o:detectmouseclick="t" on="false"/>
                 <w10:wrap type="none"/>
               </v:line>
-              <v:rect id="shape_0" stroked="f" o:allowincell="f" style="position:absolute;left:7134;top:14417;width:768;height:245;mso-wrap-style:square;v-text-anchor:top">
+              <v:rect id="shape_0" stroked="f" o:allowincell="f" style="position:absolute;left:7134;top:14417;width:767;height:244;mso-wrap-style:square;v-text-anchor:top">
                 <v:fill o:detectmouseclick="t" on="false"/>
                 <v:stroke color="#3465a4" joinstyle="round" endcap="flat"/>
                 <v:textbox>
@@ -5274,7 +5517,7 @@
                 </v:textbox>
                 <w10:wrap type="none"/>
               </v:rect>
-              <v:rect id="shape_0" stroked="f" o:allowincell="f" style="position:absolute;left:8855;top:14417;width:1216;height:245;mso-wrap-style:square;v-text-anchor:top">
+              <v:rect id="shape_0" stroked="f" o:allowincell="f" style="position:absolute;left:8855;top:14417;width:1215;height:244;mso-wrap-style:square;v-text-anchor:top">
                 <v:fill o:detectmouseclick="t" on="false"/>
                 <v:stroke color="#3465a4" joinstyle="round" endcap="flat"/>
                 <v:textbox>
@@ -5299,7 +5542,7 @@
                 </v:textbox>
                 <w10:wrap type="none"/>
               </v:rect>
-              <v:rect id="shape_0" stroked="f" o:allowincell="f" style="position:absolute;left:8863;top:14705;width:1214;height:245;mso-wrap-style:square;v-text-anchor:top">
+              <v:rect id="shape_0" stroked="f" o:allowincell="f" style="position:absolute;left:8863;top:14705;width:1213;height:244;mso-wrap-style:square;v-text-anchor:top">
                 <v:fill o:detectmouseclick="t" on="false"/>
                 <v:stroke color="#3465a4" joinstyle="round" endcap="flat"/>
                 <v:textbox>
@@ -5318,7 +5561,7 @@
                           <w:sz w:val="20"/>
                           <w:lang w:val="en-US"/>
                         </w:rPr>
-                        <w:t>3</w:t>
+                        <w:t>4</w:t>
                       </w:r>
                     </w:p>
                   </w:txbxContent>
@@ -5335,7 +5578,7 @@
                 <v:fill o:detectmouseclick="t" on="false"/>
                 <w10:wrap type="none"/>
               </v:line>
-              <v:rect id="shape_0" stroked="f" o:allowincell="f" style="position:absolute;left:7134;top:15150;width:2937;height:535;mso-wrap-style:square;v-text-anchor:top">
+              <v:rect id="shape_0" stroked="f" o:allowincell="f" style="position:absolute;left:7134;top:15150;width:2936;height:534;mso-wrap-style:square;v-text-anchor:top">
                 <v:fill o:detectmouseclick="t" on="false"/>
                 <v:stroke color="#3465a4" joinstyle="round" endcap="flat"/>
                 <v:textbox>
@@ -6694,8 +6937,8 @@
       <w:szCs w:val="28"/>
     </w:rPr>
   </w:style>
-  <w:style w:type="character" w:styleId="Bulletsuser">
-    <w:name w:val="Bullets (user)"/>
+  <w:style w:type="character" w:styleId="Bullets">
+    <w:name w:val="Bullets"/>
     <w:qFormat/>
     <w:rPr>
       <w:rFonts w:ascii="OpenSymbol" w:hAnsi="OpenSymbol" w:eastAsia="OpenSymbol" w:cs="OpenSymbol"/>
@@ -7022,15 +7265,15 @@
       <w:bCs/>
     </w:rPr>
   </w:style>
-  <w:style w:type="paragraph" w:styleId="FrameContentsuser">
-    <w:name w:val="Frame Contents (user)"/>
+  <w:style w:type="paragraph" w:styleId="FrameContents">
+    <w:name w:val="Frame Contents"/>
     <w:basedOn w:val="Normal"/>
     <w:qFormat/>
     <w:pPr/>
     <w:rPr/>
   </w:style>
-  <w:style w:type="paragraph" w:styleId="FrameContents">
-    <w:name w:val="Frame Contents"/>
+  <w:style w:type="paragraph" w:styleId="FrameContentsuser">
+    <w:name w:val="Frame Contents (user)"/>
     <w:basedOn w:val="Normal"/>
     <w:qFormat/>
     <w:pPr/>

</xml_diff>

<commit_message>
feat: add task 4
</commit_message>
<xml_diff>
--- a/lab1.docx
+++ b/lab1.docx
@@ -216,134 +216,6 @@
           <w:lang w:val="en-US"/>
         </w:rPr>
         <w:t xml:space="preserve"> Відповісти (або продовжити фразу) на теоретичні питання:</w:t>
-      </w:r>
-    </w:p>
-    <w:p>
-      <w:pPr>
-        <w:pStyle w:val="Normal"/>
-        <w:widowControl/>
-        <w:numPr>
-          <w:ilvl w:val="0"/>
-          <w:numId w:val="1"/>
-        </w:numPr>
-        <w:tabs>
-          <w:tab w:val="clear" w:pos="567"/>
-        </w:tabs>
-        <w:bidi w:val="0"/>
-        <w:spacing w:lineRule="auto" w:line="360" w:before="0" w:after="0"/>
-        <w:ind w:firstLine="850" w:start="0" w:end="0"/>
-        <w:jc w:val="both"/>
-        <w:rPr/>
-      </w:pPr>
-      <w:r>
-        <w:rPr>
-          <w:rStyle w:val="qv3wpe"/>
-          <w:rFonts w:eastAsia="Helvetica-Bold"/>
-          <w:sz w:val="28"/>
-          <w:szCs w:val="28"/>
-          <w:lang w:val="en-US"/>
-        </w:rPr>
-        <w:t>Основні ієрархії системності Світу:</w:t>
-      </w:r>
-    </w:p>
-    <w:p>
-      <w:pPr>
-        <w:pStyle w:val="Normal"/>
-        <w:widowControl/>
-        <w:tabs>
-          <w:tab w:val="clear" w:pos="567"/>
-        </w:tabs>
-        <w:bidi w:val="0"/>
-        <w:spacing w:lineRule="auto" w:line="360" w:before="0" w:after="0"/>
-        <w:ind w:firstLine="850" w:start="0" w:end="0"/>
-        <w:jc w:val="both"/>
-        <w:rPr/>
-      </w:pPr>
-      <w:r>
-        <w:rPr>
-          <w:rStyle w:val="qv3wpe"/>
-          <w:rFonts w:eastAsia="Helvetica-Bold"/>
-          <w:sz w:val="28"/>
-          <w:szCs w:val="28"/>
-          <w:lang w:val="en-US"/>
-        </w:rPr>
-        <w:t>ієрархії (системи), які виникли природно:</w:t>
-      </w:r>
-    </w:p>
-    <w:p>
-      <w:pPr>
-        <w:pStyle w:val="Normal"/>
-        <w:widowControl/>
-        <w:tabs>
-          <w:tab w:val="clear" w:pos="567"/>
-        </w:tabs>
-        <w:bidi w:val="0"/>
-        <w:spacing w:lineRule="auto" w:line="360" w:before="0" w:after="0"/>
-        <w:ind w:firstLine="850" w:start="0" w:end="0"/>
-        <w:jc w:val="both"/>
-        <w:rPr/>
-      </w:pPr>
-      <w:r>
-        <w:rPr>
-          <w:rStyle w:val="qv3wpe"/>
-          <w:rFonts w:eastAsia="Helvetica-Bold"/>
-          <w:sz w:val="28"/>
-          <w:szCs w:val="28"/>
-          <w:lang w:val="en-US"/>
-        </w:rPr>
-        <w:t>фізико – біологічна (А – В) та соціальна (С);</w:t>
-      </w:r>
-    </w:p>
-    <w:p>
-      <w:pPr>
-        <w:pStyle w:val="Normal"/>
-        <w:widowControl/>
-        <w:tabs>
-          <w:tab w:val="clear" w:pos="567"/>
-        </w:tabs>
-        <w:bidi w:val="0"/>
-        <w:spacing w:lineRule="auto" w:line="360" w:before="0" w:after="0"/>
-        <w:ind w:firstLine="850" w:start="0" w:end="0"/>
-        <w:jc w:val="both"/>
-        <w:rPr/>
-      </w:pPr>
-      <w:r>
-        <w:rPr>
-          <w:rStyle w:val="qv3wpe"/>
-          <w:rFonts w:eastAsia="Helvetica-Bold"/>
-          <w:sz w:val="28"/>
-          <w:szCs w:val="28"/>
-          <w:lang w:val="en-US"/>
-        </w:rPr>
-        <w:t>штучна ієрархія (система): технічна (D)</w:t>
-      </w:r>
-    </w:p>
-    <w:p>
-      <w:pPr>
-        <w:pStyle w:val="Normal"/>
-        <w:widowControl/>
-        <w:numPr>
-          <w:ilvl w:val="0"/>
-          <w:numId w:val="1"/>
-        </w:numPr>
-        <w:tabs>
-          <w:tab w:val="clear" w:pos="567"/>
-        </w:tabs>
-        <w:bidi w:val="0"/>
-        <w:spacing w:lineRule="auto" w:line="360" w:before="0" w:after="0"/>
-        <w:ind w:firstLine="850" w:start="0" w:end="0"/>
-        <w:jc w:val="both"/>
-        <w:rPr/>
-      </w:pPr>
-      <w:r>
-        <w:rPr>
-          <w:rStyle w:val="qv3wpe"/>
-          <w:rFonts w:eastAsia="Helvetica-Bold"/>
-          <w:sz w:val="28"/>
-          <w:szCs w:val="28"/>
-          <w:lang w:val="en-US"/>
-        </w:rPr>
-        <w:t>Основні тенденції розвитку теорії систем за Берталанфі:</w:t>
       </w:r>
     </w:p>
     <w:p>
@@ -361,17 +233,89 @@
         <w:spacing w:lineRule="auto" w:line="360" w:before="0" w:after="0"/>
         <w:ind w:firstLine="850" w:start="0" w:end="0"/>
         <w:jc w:val="both"/>
-        <w:rPr>
-          <w:sz w:val="28"/>
-          <w:szCs w:val="28"/>
-        </w:rPr>
-      </w:pPr>
-      <w:r>
-        <w:rPr>
-          <w:sz w:val="28"/>
-          <w:szCs w:val="28"/>
-        </w:rPr>
-        <w:t>наука про системи, що досліджує застосування системних концепцій у природних (фізичних) та суспільних науках. Увага зосереджується на науковому вивченні цілісного на противагу поелементного, оцінюванні способів взаємодії між компонентами системи, широкого використання методів математичного моделювання для визначення ізоморфізму в системах;</w:t>
+        <w:rPr/>
+      </w:pPr>
+      <w:r>
+        <w:rPr>
+          <w:rStyle w:val="qv3wpe"/>
+          <w:rFonts w:eastAsia="Helvetica-Bold"/>
+          <w:sz w:val="28"/>
+          <w:szCs w:val="28"/>
+          <w:lang w:val="en-US"/>
+        </w:rPr>
+        <w:t>Основні ієрархії системності Світу:</w:t>
+      </w:r>
+    </w:p>
+    <w:p>
+      <w:pPr>
+        <w:pStyle w:val="Normal"/>
+        <w:widowControl/>
+        <w:tabs>
+          <w:tab w:val="clear" w:pos="567"/>
+        </w:tabs>
+        <w:bidi w:val="0"/>
+        <w:spacing w:lineRule="auto" w:line="360" w:before="0" w:after="0"/>
+        <w:ind w:firstLine="850" w:start="0" w:end="0"/>
+        <w:jc w:val="both"/>
+        <w:rPr/>
+      </w:pPr>
+      <w:r>
+        <w:rPr>
+          <w:rStyle w:val="qv3wpe"/>
+          <w:rFonts w:eastAsia="Helvetica-Bold"/>
+          <w:sz w:val="28"/>
+          <w:szCs w:val="28"/>
+          <w:lang w:val="en-US"/>
+        </w:rPr>
+        <w:t>ієрархії (системи), які виникли природно:</w:t>
+      </w:r>
+    </w:p>
+    <w:p>
+      <w:pPr>
+        <w:pStyle w:val="Normal"/>
+        <w:widowControl/>
+        <w:tabs>
+          <w:tab w:val="clear" w:pos="567"/>
+        </w:tabs>
+        <w:bidi w:val="0"/>
+        <w:spacing w:lineRule="auto" w:line="360" w:before="0" w:after="0"/>
+        <w:ind w:firstLine="850" w:start="0" w:end="0"/>
+        <w:jc w:val="both"/>
+        <w:rPr/>
+      </w:pPr>
+      <w:r>
+        <w:rPr>
+          <w:rStyle w:val="qv3wpe"/>
+          <w:rFonts w:eastAsia="Helvetica-Bold"/>
+          <w:sz w:val="28"/>
+          <w:szCs w:val="28"/>
+          <w:lang w:val="en-US"/>
+        </w:rPr>
+        <w:t>фізико – біологічна (А – В) та соціальна (С);</w:t>
+      </w:r>
+    </w:p>
+    <w:p>
+      <w:pPr>
+        <w:pStyle w:val="Normal"/>
+        <w:widowControl/>
+        <w:tabs>
+          <w:tab w:val="clear" w:pos="567"/>
+        </w:tabs>
+        <w:bidi w:val="0"/>
+        <w:spacing w:lineRule="auto" w:line="360" w:before="0" w:after="0"/>
+        <w:ind w:firstLine="850" w:start="0" w:end="0"/>
+        <w:jc w:val="both"/>
+        <w:rPr/>
+      </w:pPr>
+      <w:r>
+        <w:rPr>
+          <w:rStyle w:val="qv3wpe"/>
+          <w:rFonts w:eastAsia="Helvetica-Bold"/>
+          <w:sz w:val="28"/>
+          <w:szCs w:val="28"/>
+          <w:lang w:val="en-US"/>
+        </w:rPr>
+        <w:t>штучна ієрархія (система): технічна (D)</w:t>
       </w:r>
     </w:p>
     <w:p>
@@ -389,6 +333,62 @@
         <w:spacing w:lineRule="auto" w:line="360" w:before="0" w:after="0"/>
         <w:ind w:firstLine="850" w:start="0" w:end="0"/>
         <w:jc w:val="both"/>
+        <w:rPr/>
+      </w:pPr>
+      <w:r>
+        <w:rPr>
+          <w:rStyle w:val="qv3wpe"/>
+          <w:rFonts w:eastAsia="Helvetica-Bold"/>
+          <w:sz w:val="28"/>
+          <w:szCs w:val="28"/>
+          <w:lang w:val="en-US"/>
+        </w:rPr>
+        <w:t>Основні тенденції розвитку теорії систем за Берталанфі:</w:t>
+      </w:r>
+    </w:p>
+    <w:p>
+      <w:pPr>
+        <w:pStyle w:val="Normal"/>
+        <w:widowControl/>
+        <w:numPr>
+          <w:ilvl w:val="0"/>
+          <w:numId w:val="3"/>
+        </w:numPr>
+        <w:tabs>
+          <w:tab w:val="clear" w:pos="567"/>
+        </w:tabs>
+        <w:bidi w:val="0"/>
+        <w:spacing w:lineRule="auto" w:line="360" w:before="0" w:after="0"/>
+        <w:ind w:firstLine="850" w:start="0" w:end="0"/>
+        <w:jc w:val="both"/>
+        <w:rPr>
+          <w:sz w:val="28"/>
+          <w:szCs w:val="28"/>
+        </w:rPr>
+      </w:pPr>
+      <w:r>
+        <w:rPr>
+          <w:sz w:val="28"/>
+          <w:szCs w:val="28"/>
+        </w:rPr>
+        <w:t>наука про системи, що досліджує застосування системних концепцій у природних (фізичних) та суспільних науках. Увага зосереджується на науковому вивченні цілісного на противагу поелементного, оцінюванні способів взаємодії між компонентами системи, широкого використання методів математичного моделювання для визначення ізоморфізму в системах;</w:t>
+      </w:r>
+    </w:p>
+    <w:p>
+      <w:pPr>
+        <w:pStyle w:val="Normal"/>
+        <w:widowControl/>
+        <w:numPr>
+          <w:ilvl w:val="0"/>
+          <w:numId w:val="3"/>
+        </w:numPr>
+        <w:tabs>
+          <w:tab w:val="clear" w:pos="567"/>
+        </w:tabs>
+        <w:bidi w:val="0"/>
+        <w:spacing w:lineRule="auto" w:line="360" w:before="0" w:after="0"/>
+        <w:ind w:firstLine="850" w:start="0" w:end="0"/>
+        <w:jc w:val="both"/>
         <w:rPr>
           <w:sz w:val="28"/>
           <w:szCs w:val="28"/>
@@ -400,6 +400,34 @@
           <w:szCs w:val="28"/>
         </w:rPr>
         <w:t>системна технологія, яка призначення для розв’язку проблем з використанням методології системного підходу і сьогодні використовується в системному аналізі, в управлінні, інженерії різного напрямку та ін.;</w:t>
+      </w:r>
+    </w:p>
+    <w:p>
+      <w:pPr>
+        <w:pStyle w:val="Normal"/>
+        <w:widowControl/>
+        <w:numPr>
+          <w:ilvl w:val="0"/>
+          <w:numId w:val="3"/>
+        </w:numPr>
+        <w:tabs>
+          <w:tab w:val="clear" w:pos="567"/>
+        </w:tabs>
+        <w:bidi w:val="0"/>
+        <w:spacing w:lineRule="auto" w:line="360" w:before="0" w:after="0"/>
+        <w:ind w:firstLine="850" w:start="0" w:end="0"/>
+        <w:jc w:val="both"/>
+        <w:rPr>
+          <w:sz w:val="28"/>
+          <w:szCs w:val="28"/>
+        </w:rPr>
+      </w:pPr>
+      <w:r>
+        <w:rPr>
+          <w:sz w:val="28"/>
+          <w:szCs w:val="28"/>
+        </w:rPr>
+        <w:t>системна філософія намагається об’єднати традиційні науки різних галузей і знань в рамки філософських концепцій системності.</w:t>
       </w:r>
     </w:p>
     <w:p>
@@ -417,34 +445,6 @@
         <w:spacing w:lineRule="auto" w:line="360" w:before="0" w:after="0"/>
         <w:ind w:firstLine="850" w:start="0" w:end="0"/>
         <w:jc w:val="both"/>
-        <w:rPr>
-          <w:sz w:val="28"/>
-          <w:szCs w:val="28"/>
-        </w:rPr>
-      </w:pPr>
-      <w:r>
-        <w:rPr>
-          <w:sz w:val="28"/>
-          <w:szCs w:val="28"/>
-        </w:rPr>
-        <w:t>системна філософія намагається об’єднати традиційні науки різних галузей і знань в рамки філософських концепцій системності.</w:t>
-      </w:r>
-    </w:p>
-    <w:p>
-      <w:pPr>
-        <w:pStyle w:val="Normal"/>
-        <w:widowControl/>
-        <w:numPr>
-          <w:ilvl w:val="0"/>
-          <w:numId w:val="1"/>
-        </w:numPr>
-        <w:tabs>
-          <w:tab w:val="clear" w:pos="567"/>
-        </w:tabs>
-        <w:bidi w:val="0"/>
-        <w:spacing w:lineRule="auto" w:line="360" w:before="0" w:after="0"/>
-        <w:ind w:firstLine="850" w:start="0" w:end="0"/>
-        <w:jc w:val="both"/>
         <w:rPr/>
       </w:pPr>
       <w:r>
@@ -495,7 +495,7 @@
         <w:widowControl/>
         <w:numPr>
           <w:ilvl w:val="0"/>
-          <w:numId w:val="1"/>
+          <w:numId w:val="2"/>
         </w:numPr>
         <w:tabs>
           <w:tab w:val="clear" w:pos="567"/>
@@ -523,7 +523,7 @@
         <w:widowControl/>
         <w:numPr>
           <w:ilvl w:val="0"/>
-          <w:numId w:val="1"/>
+          <w:numId w:val="2"/>
         </w:numPr>
         <w:tabs>
           <w:tab w:val="clear" w:pos="567"/>
@@ -551,7 +551,7 @@
         <w:widowControl/>
         <w:numPr>
           <w:ilvl w:val="0"/>
-          <w:numId w:val="1"/>
+          <w:numId w:val="2"/>
         </w:numPr>
         <w:tabs>
           <w:tab w:val="clear" w:pos="567"/>
@@ -603,7 +603,7 @@
         <w:widowControl/>
         <w:numPr>
           <w:ilvl w:val="0"/>
-          <w:numId w:val="1"/>
+          <w:numId w:val="2"/>
         </w:numPr>
         <w:tabs>
           <w:tab w:val="clear" w:pos="567"/>
@@ -631,7 +631,7 @@
         <w:widowControl/>
         <w:numPr>
           <w:ilvl w:val="0"/>
-          <w:numId w:val="1"/>
+          <w:numId w:val="2"/>
         </w:numPr>
         <w:tabs>
           <w:tab w:val="clear" w:pos="567"/>
@@ -659,7 +659,7 @@
         <w:widowControl/>
         <w:numPr>
           <w:ilvl w:val="0"/>
-          <w:numId w:val="3"/>
+          <w:numId w:val="4"/>
         </w:numPr>
         <w:tabs>
           <w:tab w:val="clear" w:pos="567"/>
@@ -687,7 +687,7 @@
         <w:widowControl/>
         <w:numPr>
           <w:ilvl w:val="0"/>
-          <w:numId w:val="3"/>
+          <w:numId w:val="4"/>
         </w:numPr>
         <w:tabs>
           <w:tab w:val="clear" w:pos="567"/>
@@ -715,7 +715,7 @@
         <w:widowControl/>
         <w:numPr>
           <w:ilvl w:val="0"/>
-          <w:numId w:val="3"/>
+          <w:numId w:val="4"/>
         </w:numPr>
         <w:tabs>
           <w:tab w:val="clear" w:pos="567"/>
@@ -952,7 +952,7 @@
     </w:p>
     <w:p>
       <w:pPr>
-        <w:pStyle w:val="BodyText"/>
+        <w:pStyle w:val="Normal"/>
         <w:widowControl/>
         <w:tabs>
           <w:tab w:val="clear" w:pos="567"/>
@@ -976,7 +976,14 @@
           <w:szCs w:val="28"/>
           <w:lang w:val="en-US"/>
         </w:rPr>
-        <w:t>Принцип кінцевої цілі: Головною метою системи є підтримання гравітаційної рівноваги та забезпечення циклічного руху космічних тіл, що створює стабільні умови для існування об'єктів усередині системи.</w:t>
+        <w:t xml:space="preserve">Сонячна система — це цілий всесвіт, що обертається навколо Сонця. Тут не просто планети, супутники, астероїди й комети — все це працює разом, як єдиний організм. Важливо розглядати всі ці об’єкти не окремо, а у зв’язку з їхньою роллю у загальній картині. Усі процеси тут підкоряються одній меті: підтримувати стабільність і гравітаційну рівновагу. Щоб розібратися в цій системі, треба дивитися на неї з різних боків — як на окремий світ, як на частину Галактики, і як на взаємодію її складових. </w:t>
+      </w:r>
+      <w:r>
+        <w:rPr>
+          <w:sz w:val="28"/>
+          <w:szCs w:val="28"/>
+        </w:rPr>
+        <w:t>Поєднання елементів породжує нові властивості, наприклад стабільність орбіт, а функції окремих об’єктів визначають загальну структуру системи.</w:t>
       </w:r>
     </w:p>
     <w:p>
@@ -1001,11 +1008,337 @@
       <w:r>
         <w:rPr>
           <w:rFonts w:eastAsia="Helvetica-Bold"/>
+          <w:b w:val="false"/>
+          <w:bCs w:val="false"/>
           <w:sz w:val="28"/>
           <w:szCs w:val="28"/>
           <w:lang w:val="en-US"/>
         </w:rPr>
-        <w:t>Принцип ієрархічності: Сонячна система розглядається як підсистема вищого рівня. Водночас вона сама складається з підсистем нижчого рівня, наприклад, планетарних систем або систем супутників газових гігантів.</w:t>
+        <w:t xml:space="preserve">Застосування </w:t>
+      </w:r>
+      <w:r>
+        <w:rPr>
+          <w:rStyle w:val="Strong"/>
+          <w:rFonts w:eastAsia="Helvetica-Bold"/>
+          <w:b w:val="false"/>
+          <w:bCs w:val="false"/>
+          <w:sz w:val="28"/>
+          <w:szCs w:val="28"/>
+          <w:lang w:val="en-US"/>
+        </w:rPr>
+        <w:t>аспектів системного підходу</w:t>
+      </w:r>
+      <w:r>
+        <w:rPr>
+          <w:rFonts w:eastAsia="Helvetica-Bold"/>
+          <w:b w:val="false"/>
+          <w:bCs w:val="false"/>
+          <w:sz w:val="28"/>
+          <w:szCs w:val="28"/>
+          <w:lang w:val="en-US"/>
+        </w:rPr>
+        <w:t xml:space="preserve"> дає </w:t>
+      </w:r>
+      <w:r>
+        <w:rPr>
+          <w:rFonts w:eastAsia="Helvetica-Bold"/>
+          <w:b w:val="false"/>
+          <w:bCs w:val="false"/>
+          <w:sz w:val="28"/>
+          <w:szCs w:val="28"/>
+          <w:lang w:val="en-US"/>
+        </w:rPr>
+        <w:t>повний</w:t>
+      </w:r>
+      <w:r>
+        <w:rPr>
+          <w:rFonts w:eastAsia="Helvetica-Bold"/>
+          <w:b w:val="false"/>
+          <w:bCs w:val="false"/>
+          <w:sz w:val="28"/>
+          <w:szCs w:val="28"/>
+          <w:lang w:val="en-US"/>
+        </w:rPr>
+        <w:t xml:space="preserve"> аналіз:</w:t>
+      </w:r>
+    </w:p>
+    <w:p>
+      <w:pPr>
+        <w:pStyle w:val="BodyText"/>
+        <w:widowControl/>
+        <w:numPr>
+          <w:ilvl w:val="0"/>
+          <w:numId w:val="5"/>
+        </w:numPr>
+        <w:tabs>
+          <w:tab w:val="clear" w:pos="567"/>
+        </w:tabs>
+        <w:suppressAutoHyphens w:val="true"/>
+        <w:bidi w:val="0"/>
+        <w:spacing w:lineRule="auto" w:line="360" w:before="0" w:after="140"/>
+        <w:jc w:val="both"/>
+        <w:rPr>
+          <w:rFonts w:eastAsia="Helvetica-Bold"/>
+          <w:sz w:val="28"/>
+          <w:szCs w:val="28"/>
+          <w:lang w:val="en-US"/>
+        </w:rPr>
+      </w:pPr>
+      <w:r>
+        <w:rPr>
+          <w:rStyle w:val="Strong"/>
+          <w:rFonts w:eastAsia="Helvetica-Bold"/>
+          <w:b w:val="false"/>
+          <w:bCs w:val="false"/>
+          <w:sz w:val="28"/>
+          <w:szCs w:val="28"/>
+          <w:lang w:val="en-US"/>
+        </w:rPr>
+        <w:t>Системно-історичний</w:t>
+      </w:r>
+      <w:r>
+        <w:rPr>
+          <w:rFonts w:eastAsia="Helvetica-Bold"/>
+          <w:b w:val="false"/>
+          <w:bCs w:val="false"/>
+          <w:sz w:val="28"/>
+          <w:szCs w:val="28"/>
+          <w:lang w:val="en-US"/>
+        </w:rPr>
+        <w:t xml:space="preserve"> — еволюція системи від протопланетного диска;</w:t>
+      </w:r>
+    </w:p>
+    <w:p>
+      <w:pPr>
+        <w:pStyle w:val="BodyText"/>
+        <w:widowControl/>
+        <w:numPr>
+          <w:ilvl w:val="0"/>
+          <w:numId w:val="5"/>
+        </w:numPr>
+        <w:tabs>
+          <w:tab w:val="clear" w:pos="567"/>
+        </w:tabs>
+        <w:suppressAutoHyphens w:val="true"/>
+        <w:bidi w:val="0"/>
+        <w:spacing w:lineRule="auto" w:line="360" w:before="0" w:after="140"/>
+        <w:jc w:val="both"/>
+        <w:rPr>
+          <w:rFonts w:eastAsia="Helvetica-Bold"/>
+          <w:sz w:val="28"/>
+          <w:szCs w:val="28"/>
+          <w:lang w:val="en-US"/>
+        </w:rPr>
+      </w:pPr>
+      <w:r>
+        <w:rPr>
+          <w:rStyle w:val="Strong"/>
+          <w:rFonts w:eastAsia="Helvetica-Bold"/>
+          <w:b w:val="false"/>
+          <w:bCs w:val="false"/>
+          <w:sz w:val="28"/>
+          <w:szCs w:val="28"/>
+          <w:lang w:val="en-US"/>
+        </w:rPr>
+        <w:t>Системно-компонентний</w:t>
+      </w:r>
+      <w:r>
+        <w:rPr>
+          <w:rFonts w:eastAsia="Helvetica-Bold"/>
+          <w:b w:val="false"/>
+          <w:bCs w:val="false"/>
+          <w:sz w:val="28"/>
+          <w:szCs w:val="28"/>
+          <w:lang w:val="en-US"/>
+        </w:rPr>
+        <w:t xml:space="preserve"> — склад елементів;</w:t>
+      </w:r>
+    </w:p>
+    <w:p>
+      <w:pPr>
+        <w:pStyle w:val="BodyText"/>
+        <w:widowControl/>
+        <w:numPr>
+          <w:ilvl w:val="0"/>
+          <w:numId w:val="5"/>
+        </w:numPr>
+        <w:tabs>
+          <w:tab w:val="clear" w:pos="567"/>
+        </w:tabs>
+        <w:suppressAutoHyphens w:val="true"/>
+        <w:bidi w:val="0"/>
+        <w:spacing w:lineRule="auto" w:line="360" w:before="0" w:after="140"/>
+        <w:jc w:val="both"/>
+        <w:rPr>
+          <w:rFonts w:eastAsia="Helvetica-Bold"/>
+          <w:sz w:val="28"/>
+          <w:szCs w:val="28"/>
+          <w:lang w:val="en-US"/>
+        </w:rPr>
+      </w:pPr>
+      <w:r>
+        <w:rPr>
+          <w:rStyle w:val="Strong"/>
+          <w:rFonts w:eastAsia="Helvetica-Bold"/>
+          <w:b w:val="false"/>
+          <w:bCs w:val="false"/>
+          <w:sz w:val="28"/>
+          <w:szCs w:val="28"/>
+          <w:lang w:val="en-US"/>
+        </w:rPr>
+        <w:t>Системно-структурний</w:t>
+      </w:r>
+      <w:r>
+        <w:rPr>
+          <w:rFonts w:eastAsia="Helvetica-Bold"/>
+          <w:b w:val="false"/>
+          <w:bCs w:val="false"/>
+          <w:sz w:val="28"/>
+          <w:szCs w:val="28"/>
+          <w:lang w:val="en-US"/>
+        </w:rPr>
+        <w:t xml:space="preserve"> — організація та взаємодія елементів;</w:t>
+      </w:r>
+    </w:p>
+    <w:p>
+      <w:pPr>
+        <w:pStyle w:val="BodyText"/>
+        <w:widowControl/>
+        <w:numPr>
+          <w:ilvl w:val="0"/>
+          <w:numId w:val="5"/>
+        </w:numPr>
+        <w:tabs>
+          <w:tab w:val="clear" w:pos="567"/>
+        </w:tabs>
+        <w:suppressAutoHyphens w:val="true"/>
+        <w:bidi w:val="0"/>
+        <w:spacing w:lineRule="auto" w:line="360" w:before="0" w:after="140"/>
+        <w:jc w:val="both"/>
+        <w:rPr>
+          <w:rFonts w:eastAsia="Helvetica-Bold"/>
+          <w:sz w:val="28"/>
+          <w:szCs w:val="28"/>
+          <w:lang w:val="en-US"/>
+        </w:rPr>
+      </w:pPr>
+      <w:r>
+        <w:rPr>
+          <w:rStyle w:val="Strong"/>
+          <w:rFonts w:eastAsia="Helvetica-Bold"/>
+          <w:b w:val="false"/>
+          <w:bCs w:val="false"/>
+          <w:sz w:val="28"/>
+          <w:szCs w:val="28"/>
+          <w:lang w:val="en-US"/>
+        </w:rPr>
+        <w:t>Системно-функціональний</w:t>
+      </w:r>
+      <w:r>
+        <w:rPr>
+          <w:rFonts w:eastAsia="Helvetica-Bold"/>
+          <w:b w:val="false"/>
+          <w:bCs w:val="false"/>
+          <w:sz w:val="28"/>
+          <w:szCs w:val="28"/>
+          <w:lang w:val="en-US"/>
+        </w:rPr>
+        <w:t xml:space="preserve"> — узгоджені рухи для стабільності;</w:t>
+      </w:r>
+    </w:p>
+    <w:p>
+      <w:pPr>
+        <w:pStyle w:val="BodyText"/>
+        <w:widowControl/>
+        <w:numPr>
+          <w:ilvl w:val="0"/>
+          <w:numId w:val="5"/>
+        </w:numPr>
+        <w:tabs>
+          <w:tab w:val="clear" w:pos="567"/>
+        </w:tabs>
+        <w:suppressAutoHyphens w:val="true"/>
+        <w:bidi w:val="0"/>
+        <w:spacing w:lineRule="auto" w:line="360" w:before="0" w:after="140"/>
+        <w:jc w:val="both"/>
+        <w:rPr>
+          <w:rFonts w:eastAsia="Helvetica-Bold"/>
+          <w:sz w:val="28"/>
+          <w:szCs w:val="28"/>
+          <w:lang w:val="en-US"/>
+        </w:rPr>
+      </w:pPr>
+      <w:r>
+        <w:rPr>
+          <w:rStyle w:val="Strong"/>
+          <w:rFonts w:eastAsia="Helvetica-Bold"/>
+          <w:b w:val="false"/>
+          <w:bCs w:val="false"/>
+          <w:sz w:val="28"/>
+          <w:szCs w:val="28"/>
+          <w:lang w:val="en-US"/>
+        </w:rPr>
+        <w:t>Системно-комунікаційний</w:t>
+      </w:r>
+      <w:r>
+        <w:rPr>
+          <w:rFonts w:eastAsia="Helvetica-Bold"/>
+          <w:b w:val="false"/>
+          <w:bCs w:val="false"/>
+          <w:sz w:val="28"/>
+          <w:szCs w:val="28"/>
+          <w:lang w:val="en-US"/>
+        </w:rPr>
+        <w:t xml:space="preserve"> — взаємодія із зовнішнім середовищем;</w:t>
+      </w:r>
+    </w:p>
+    <w:p>
+      <w:pPr>
+        <w:pStyle w:val="BodyText"/>
+        <w:widowControl/>
+        <w:numPr>
+          <w:ilvl w:val="0"/>
+          <w:numId w:val="5"/>
+        </w:numPr>
+        <w:tabs>
+          <w:tab w:val="clear" w:pos="567"/>
+        </w:tabs>
+        <w:suppressAutoHyphens w:val="true"/>
+        <w:bidi w:val="0"/>
+        <w:spacing w:lineRule="auto" w:line="360" w:before="0" w:after="140"/>
+        <w:jc w:val="both"/>
+        <w:rPr>
+          <w:rFonts w:eastAsia="Helvetica-Bold"/>
+          <w:sz w:val="28"/>
+          <w:szCs w:val="28"/>
+          <w:lang w:val="en-US"/>
+        </w:rPr>
+      </w:pPr>
+      <w:r>
+        <w:rPr>
+          <w:rStyle w:val="Strong"/>
+          <w:rFonts w:eastAsia="Helvetica-Bold"/>
+          <w:b w:val="false"/>
+          <w:bCs w:val="false"/>
+          <w:sz w:val="28"/>
+          <w:szCs w:val="28"/>
+          <w:lang w:val="en-US"/>
+        </w:rPr>
+        <w:t>Системно-інтегративний</w:t>
+      </w:r>
+      <w:r>
+        <w:rPr>
+          <w:rFonts w:eastAsia="Helvetica-Bold"/>
+          <w:b w:val="false"/>
+          <w:bCs w:val="false"/>
+          <w:sz w:val="28"/>
+          <w:szCs w:val="28"/>
+          <w:lang w:val="en-US"/>
+        </w:rPr>
+        <w:t xml:space="preserve"> — збереження цілісності системи.</w:t>
+      </w:r>
+      <w:r>
+        <w:br w:type="page"/>
       </w:r>
     </w:p>
     <w:p>
@@ -1030,11 +1363,108 @@
       <w:r>
         <w:rPr>
           <w:rFonts w:eastAsia="Helvetica-Bold"/>
+          <w:b/>
+          <w:bCs/>
           <w:sz w:val="28"/>
           <w:szCs w:val="28"/>
           <w:lang w:val="en-US"/>
         </w:rPr>
-        <w:t>Системно-компонентний аспект: Система складається з таких елементів: центральна зірка, планети земної групи та гіганти, супутники, астероїди, комети та міжпланетне середовище.</w:t>
+        <w:t>Завдання 4.</w:t>
+      </w:r>
+      <w:r>
+        <w:rPr>
+          <w:rFonts w:eastAsia="Helvetica-Bold"/>
+          <w:sz w:val="28"/>
+          <w:szCs w:val="28"/>
+          <w:lang w:val="en-US"/>
+        </w:rPr>
+        <w:t xml:space="preserve"> </w:t>
+      </w:r>
+      <w:r>
+        <w:rPr>
+          <w:rFonts w:eastAsia="Helvetica-Bold"/>
+          <w:sz w:val="28"/>
+          <w:szCs w:val="28"/>
+          <w:lang w:val="en-US"/>
+        </w:rPr>
+        <w:t>Виконати побудову графіка складної функції (включити декілька простих, наприклад: cos, sin, Ln, exp тощо) одного аргументу з самостійно вибраними параметрами. Розрахунки можна виконати в будь-якому середовищі.</w:t>
+      </w:r>
+    </w:p>
+    <w:p>
+      <w:pPr>
+        <w:pStyle w:val="BodyText"/>
+        <w:widowControl/>
+        <w:tabs>
+          <w:tab w:val="clear" w:pos="567"/>
+        </w:tabs>
+        <w:suppressAutoHyphens w:val="true"/>
+        <w:bidi w:val="0"/>
+        <w:spacing w:lineRule="auto" w:line="360" w:before="0" w:after="140"/>
+        <w:ind w:hanging="0" w:start="0" w:end="0"/>
+        <w:jc w:val="center"/>
+        <w:rPr>
+          <w:rFonts w:eastAsia="Helvetica-Bold"/>
+          <w:sz w:val="28"/>
+          <w:szCs w:val="28"/>
+          <w:lang w:val="en-US"/>
+        </w:rPr>
+      </w:pPr>
+      <w:r>
+        <w:drawing>
+          <wp:anchor behindDoc="0" distT="0" distB="0" distL="0" distR="0" simplePos="0" locked="0" layoutInCell="0" allowOverlap="1" relativeHeight="59">
+            <wp:simplePos x="0" y="0"/>
+            <wp:positionH relativeFrom="column">
+              <wp:align>center</wp:align>
+            </wp:positionH>
+            <wp:positionV relativeFrom="paragraph">
+              <wp:posOffset>635</wp:posOffset>
+            </wp:positionV>
+            <wp:extent cx="6299835" cy="3235960"/>
+            <wp:effectExtent l="0" t="0" r="0" b="0"/>
+            <wp:wrapSquare wrapText="largest"/>
+            <wp:docPr id="1" name="Image1"/>
+            <wp:cNvGraphicFramePr>
+              <a:graphicFrameLocks xmlns:a="http://schemas.openxmlformats.org/drawingml/2006/main" noChangeAspect="1"/>
+            </wp:cNvGraphicFramePr>
+            <a:graphic xmlns:a="http://schemas.openxmlformats.org/drawingml/2006/main">
+              <a:graphicData uri="http://schemas.openxmlformats.org/drawingml/2006/picture">
+                <pic:pic xmlns:pic="http://schemas.openxmlformats.org/drawingml/2006/picture">
+                  <pic:nvPicPr>
+                    <pic:cNvPr id="1" name="Image1"/>
+                    <pic:cNvPicPr>
+                      <a:picLocks noChangeAspect="1" noChangeArrowheads="1"/>
+                    </pic:cNvPicPr>
+                  </pic:nvPicPr>
+                  <pic:blipFill>
+                    <a:blip r:embed="rId2"/>
+                    <a:stretch>
+                      <a:fillRect/>
+                    </a:stretch>
+                  </pic:blipFill>
+                  <pic:spPr bwMode="auto">
+                    <a:xfrm>
+                      <a:off x="0" y="0"/>
+                      <a:ext cx="6299835" cy="3235960"/>
+                    </a:xfrm>
+                    <a:prstGeom prst="rect">
+                      <a:avLst/>
+                    </a:prstGeom>
+                    <a:noFill/>
+                  </pic:spPr>
+                </pic:pic>
+              </a:graphicData>
+            </a:graphic>
+          </wp:anchor>
+        </w:drawing>
+      </w:r>
+      <w:r>
+        <w:rPr>
+          <w:rFonts w:eastAsia="Helvetica-Bold"/>
+          <w:sz w:val="28"/>
+          <w:szCs w:val="28"/>
+          <w:lang w:val="en-US"/>
+        </w:rPr>
+        <w:t>Рис. 1. Побудований графік</w:t>
       </w:r>
     </w:p>
     <w:p>
@@ -1048,7 +1478,7 @@
         <w:bidi w:val="0"/>
         <w:spacing w:lineRule="auto" w:line="360" w:before="0" w:after="140"/>
         <w:ind w:firstLine="850" w:start="0" w:end="0"/>
-        <w:jc w:val="both"/>
+        <w:jc w:val="start"/>
         <w:rPr>
           <w:rFonts w:eastAsia="Helvetica-Bold"/>
           <w:sz w:val="28"/>
@@ -1063,74 +1493,171 @@
           <w:szCs w:val="28"/>
           <w:lang w:val="en-US"/>
         </w:rPr>
-        <w:t>Системно-структурний аспект: Взаємозв'язок елементів базується на законі всесвітнього тяжіння. Сонце як центр мас визначає орбіти всіх інших об'єктів. Саме ці стійкі гравітаційні зв'язки роблять систему цілісним об'єктом, а не просто випадковим скупченням тіл.</w:t>
+        <w:t>Лістинг програми:</w:t>
       </w:r>
     </w:p>
     <w:p>
       <w:pPr>
-        <w:pStyle w:val="BodyText"/>
-        <w:widowControl/>
-        <w:tabs>
-          <w:tab w:val="clear" w:pos="567"/>
-        </w:tabs>
-        <w:suppressAutoHyphens w:val="true"/>
-        <w:bidi w:val="0"/>
-        <w:spacing w:lineRule="auto" w:line="360" w:before="0" w:after="140"/>
-        <w:ind w:firstLine="850" w:start="0" w:end="0"/>
-        <w:jc w:val="both"/>
-        <w:rPr>
-          <w:rFonts w:eastAsia="Helvetica-Bold"/>
-          <w:sz w:val="28"/>
-          <w:szCs w:val="28"/>
-          <w:lang w:val="en-US"/>
-        </w:rPr>
-      </w:pPr>
-      <w:r>
-        <w:rPr>
-          <w:rFonts w:eastAsia="Helvetica-Bold"/>
-          <w:sz w:val="28"/>
-          <w:szCs w:val="28"/>
-          <w:lang w:val="en-US"/>
-        </w:rPr>
-        <w:t>Системно-комунікаційний аспект: Система взаємодіє із зовнішнім середовищем через обмін енергією, гравітаційний вплив сусідніх зірок та проходження крізь міжзоряні газові хмари.</w:t>
+        <w:pStyle w:val="PreformattedText"/>
+        <w:rPr/>
+      </w:pPr>
+      <w:r>
+        <w:rPr/>
+        <w:t>import matplotlib.pyplot as plot</w:t>
       </w:r>
     </w:p>
     <w:p>
       <w:pPr>
-        <w:pStyle w:val="BodyText"/>
-        <w:widowControl/>
-        <w:tabs>
-          <w:tab w:val="clear" w:pos="567"/>
-        </w:tabs>
-        <w:suppressAutoHyphens w:val="true"/>
-        <w:bidi w:val="0"/>
-        <w:spacing w:lineRule="auto" w:line="360" w:before="0" w:after="140"/>
-        <w:ind w:firstLine="850" w:start="0" w:end="0"/>
-        <w:jc w:val="both"/>
-        <w:rPr>
-          <w:rFonts w:eastAsia="Helvetica-Bold"/>
-          <w:sz w:val="28"/>
-          <w:szCs w:val="28"/>
-          <w:lang w:val="en-US"/>
-        </w:rPr>
-      </w:pPr>
-      <w:r>
-        <w:rPr>
-          <w:rFonts w:eastAsia="Helvetica-Bold"/>
-          <w:sz w:val="28"/>
-          <w:szCs w:val="28"/>
-          <w:lang w:val="en-US"/>
-        </w:rPr>
-        <w:t>Системно-інтегративний аспект: Цілісність системи забезпечується балансом між гравітацією та відцентровими силами. Це дозволяє системі зберігати свою структуру та якісну специфіку протягом мільярдів років, попри внутрішні зміни або зовнішні впливи.</w:t>
+        <w:pStyle w:val="PreformattedText"/>
+        <w:rPr/>
+      </w:pPr>
+      <w:r>
+        <w:rPr/>
+        <w:t>import numpy</w:t>
       </w:r>
     </w:p>
     <w:p>
       <w:pPr>
+        <w:pStyle w:val="PreformattedText"/>
+        <w:rPr/>
+      </w:pPr>
+      <w:r>
+        <w:rPr/>
+      </w:r>
+    </w:p>
+    <w:p>
+      <w:pPr>
+        <w:pStyle w:val="PreformattedText"/>
+        <w:rPr/>
+      </w:pPr>
+      <w:r>
+        <w:rPr/>
+        <w:t>x = numpy.linspace(-5, 100, 1000)</w:t>
+      </w:r>
+    </w:p>
+    <w:p>
+      <w:pPr>
+        <w:pStyle w:val="PreformattedText"/>
+        <w:rPr/>
+      </w:pPr>
+      <w:r>
+        <w:rPr/>
+        <w:t>y = numpy.exp(-0.1 * x) * (numpy.sin(x) + numpy.cos(2 * x)) + numpy.log(x + 4)</w:t>
+      </w:r>
+    </w:p>
+    <w:p>
+      <w:pPr>
+        <w:pStyle w:val="PreformattedText"/>
+        <w:rPr/>
+      </w:pPr>
+      <w:r>
+        <w:rPr/>
+      </w:r>
+    </w:p>
+    <w:p>
+      <w:pPr>
+        <w:pStyle w:val="PreformattedText"/>
+        <w:rPr/>
+      </w:pPr>
+      <w:r>
+        <w:rPr/>
+        <w:t>plot.plot(x, y, label=r"$f(x)=e^{-0.1x}(\sin x+\cos 2x)+\ln(x+4)$")</w:t>
+      </w:r>
+    </w:p>
+    <w:p>
+      <w:pPr>
+        <w:pStyle w:val="PreformattedText"/>
+        <w:rPr/>
+      </w:pPr>
+      <w:r>
+        <w:rPr/>
+      </w:r>
+    </w:p>
+    <w:p>
+      <w:pPr>
+        <w:pStyle w:val="PreformattedText"/>
+        <w:rPr/>
+      </w:pPr>
+      <w:r>
+        <w:rPr/>
+        <w:t>plot.axhline(0, color="black", linewidth=0.8)</w:t>
+      </w:r>
+    </w:p>
+    <w:p>
+      <w:pPr>
+        <w:pStyle w:val="PreformattedText"/>
+        <w:rPr/>
+      </w:pPr>
+      <w:r>
+        <w:rPr/>
+        <w:t>plot.axvline(0, color="black", linewidth=0.8)</w:t>
+      </w:r>
+    </w:p>
+    <w:p>
+      <w:pPr>
+        <w:pStyle w:val="PreformattedText"/>
+        <w:rPr/>
+      </w:pPr>
+      <w:r>
+        <w:rPr/>
+      </w:r>
+    </w:p>
+    <w:p>
+      <w:pPr>
+        <w:pStyle w:val="PreformattedText"/>
+        <w:rPr/>
+      </w:pPr>
+      <w:r>
+        <w:rPr/>
+        <w:t>plot.xlabel("x")</w:t>
+      </w:r>
+    </w:p>
+    <w:p>
+      <w:pPr>
+        <w:pStyle w:val="PreformattedText"/>
+        <w:rPr/>
+      </w:pPr>
+      <w:r>
+        <w:rPr/>
+        <w:t>plot.ylabel("f(x)")</w:t>
+      </w:r>
+    </w:p>
+    <w:p>
+      <w:pPr>
+        <w:pStyle w:val="PreformattedText"/>
+        <w:rPr/>
+      </w:pPr>
+      <w:r>
+        <w:rPr/>
+        <w:t>plot.legend()</w:t>
+      </w:r>
+    </w:p>
+    <w:p>
+      <w:pPr>
+        <w:pStyle w:val="PreformattedText"/>
+        <w:rPr/>
+      </w:pPr>
+      <w:r>
+        <w:rPr/>
+      </w:r>
+    </w:p>
+    <w:p>
+      <w:pPr>
+        <w:pStyle w:val="PreformattedText"/>
+        <w:rPr/>
+      </w:pPr>
+      <w:r>
+        <w:rPr/>
+        <w:t>plot.show()</w:t>
+      </w:r>
+    </w:p>
+    <w:p>
+      <w:pPr>
         <w:pStyle w:val="Normal"/>
         <w:tabs>
           <w:tab w:val="clear" w:pos="567"/>
         </w:tabs>
-        <w:spacing w:lineRule="auto" w:line="360" w:before="0" w:after="0"/>
+        <w:spacing w:lineRule="auto" w:line="360" w:before="170" w:after="0"/>
         <w:ind w:firstLine="709"/>
         <w:jc w:val="both"/>
         <w:rPr/>
@@ -1169,9 +1696,9 @@
       </w:r>
     </w:p>
     <w:sectPr>
-      <w:headerReference w:type="even" r:id="rId2"/>
-      <w:headerReference w:type="default" r:id="rId3"/>
-      <w:headerReference w:type="first" r:id="rId4"/>
+      <w:headerReference w:type="even" r:id="rId3"/>
+      <w:headerReference w:type="default" r:id="rId4"/>
+      <w:headerReference w:type="first" r:id="rId5"/>
       <w:type w:val="nextPage"/>
       <w:pgSz w:w="11906" w:h="16838"/>
       <w:pgMar w:left="1418" w:right="567" w:gutter="0" w:header="709" w:top="766" w:footer="0" w:bottom="1701"/>
@@ -1211,7 +1738,7 @@
       <mc:AlternateContent>
         <mc:Choice Requires="wpg">
           <w:drawing>
-            <wp:anchor behindDoc="1" distT="13335" distB="12065" distL="13335" distR="12065" simplePos="0" locked="0" layoutInCell="1" allowOverlap="1" relativeHeight="24" wp14:anchorId="10994A40">
+            <wp:anchor behindDoc="1" distT="13335" distB="12065" distL="13335" distR="12065" simplePos="0" locked="0" layoutInCell="1" allowOverlap="1" relativeHeight="22" wp14:anchorId="10994A40">
               <wp:simplePos x="0" y="0"/>
               <wp:positionH relativeFrom="column">
                 <wp:posOffset>-229235</wp:posOffset>
@@ -1219,10 +1746,10 @@
               <wp:positionV relativeFrom="paragraph">
                 <wp:posOffset>-266065</wp:posOffset>
               </wp:positionV>
-              <wp:extent cx="6656705" cy="10292715"/>
-              <wp:effectExtent l="13335" t="13335" r="12065" b="12065"/>
+              <wp:extent cx="6656705" cy="10291445"/>
+              <wp:effectExtent l="13335" t="13335" r="10795" b="12065"/>
               <wp:wrapNone/>
-              <wp:docPr id="1" name="Группа 60"/>
+              <wp:docPr id="2" name="Группа 60"/>
               <a:graphic xmlns:a="http://schemas.openxmlformats.org/drawingml/2006/main">
                 <a:graphicData uri="http://schemas.microsoft.com/office/word/2010/wordprocessingGroup">
                   <wpg:wgp>
@@ -1230,18 +1757,18 @@
                     <wpg:grpSpPr>
                       <a:xfrm>
                         <a:off x="0" y="0"/>
-                        <a:ext cx="6656760" cy="10292760"/>
+                        <a:ext cx="6656760" cy="10291320"/>
                         <a:chOff x="0" y="0"/>
-                        <a:chExt cx="6656760" cy="10292760"/>
+                        <a:chExt cx="6656760" cy="10291320"/>
                       </a:xfrm>
                     </wpg:grpSpPr>
                     <wps:wsp>
-                      <wps:cNvPr id="2" name="Rectangle 2"/>
+                      <wps:cNvPr id="3" name="Rectangle 2"/>
                       <wps:cNvSpPr/>
                       <wps:spPr>
                         <a:xfrm>
                           <a:off x="748080" y="9753120"/>
-                          <a:ext cx="866160" cy="177840"/>
+                          <a:ext cx="864720" cy="176400"/>
                         </a:xfrm>
                         <a:prstGeom prst="rect">
                           <a:avLst/>
@@ -1318,7 +1845,7 @@
                       <wpg:grpSpPr>
                         <a:xfrm>
                           <a:off x="0" y="0"/>
-                          <a:ext cx="6656760" cy="10292760"/>
+                          <a:ext cx="6656760" cy="10291320"/>
                         </a:xfrm>
                       </wpg:grpSpPr>
                       <wpg:grpSp>
@@ -1326,16 +1853,16 @@
                         <wpg:grpSpPr>
                           <a:xfrm>
                             <a:off x="0" y="0"/>
-                            <a:ext cx="6656760" cy="10292760"/>
+                            <a:ext cx="6656760" cy="10291320"/>
                           </a:xfrm>
                         </wpg:grpSpPr>
                         <wps:wsp>
-                          <wps:cNvPr id="3" name="Rectangle 5"/>
+                          <wps:cNvPr id="4" name="Rectangle 5"/>
                           <wps:cNvSpPr/>
                           <wps:spPr>
                             <a:xfrm>
                               <a:off x="0" y="0"/>
-                              <a:ext cx="6656760" cy="10292760"/>
+                              <a:ext cx="6655320" cy="10291320"/>
                             </a:xfrm>
                             <a:prstGeom prst="rect">
                               <a:avLst/>
@@ -1607,12 +2134,12 @@
                           <wps:bodyPr/>
                         </wps:wsp>
                         <wps:wsp>
-                          <wps:cNvPr id="4" name="Rectangle 16"/>
+                          <wps:cNvPr id="5" name="Rectangle 16"/>
                           <wps:cNvSpPr/>
                           <wps:spPr>
                             <a:xfrm>
                               <a:off x="17640" y="10120680"/>
-                              <a:ext cx="330120" cy="156240"/>
+                              <a:ext cx="329040" cy="154800"/>
                             </a:xfrm>
                             <a:prstGeom prst="rect">
                               <a:avLst/>
@@ -1654,12 +2181,12 @@
                           </wps:bodyPr>
                         </wps:wsp>
                         <wps:wsp>
-                          <wps:cNvPr id="5" name="Rectangle 17"/>
+                          <wps:cNvPr id="6" name="Rectangle 17"/>
                           <wps:cNvSpPr/>
                           <wps:spPr>
                             <a:xfrm>
                               <a:off x="379080" y="10120680"/>
-                              <a:ext cx="330120" cy="156240"/>
+                              <a:ext cx="329040" cy="154800"/>
                             </a:xfrm>
                             <a:prstGeom prst="rect">
                               <a:avLst/>
@@ -1701,12 +2228,12 @@
                           </wps:bodyPr>
                         </wps:wsp>
                         <wps:wsp>
-                          <wps:cNvPr id="6" name="Rectangle 18"/>
+                          <wps:cNvPr id="7" name="Rectangle 18"/>
                           <wps:cNvSpPr/>
                           <wps:spPr>
                             <a:xfrm>
                               <a:off x="754920" y="10120680"/>
-                              <a:ext cx="853560" cy="156240"/>
+                              <a:ext cx="852120" cy="154800"/>
                             </a:xfrm>
                             <a:prstGeom prst="rect">
                               <a:avLst/>
@@ -1835,12 +2362,12 @@
                           </wps:bodyPr>
                         </wps:wsp>
                         <wps:wsp>
-                          <wps:cNvPr id="7" name="Rectangle 19"/>
+                          <wps:cNvPr id="8" name="Rectangle 19"/>
                           <wps:cNvSpPr/>
                           <wps:spPr>
                             <a:xfrm>
                               <a:off x="1659240" y="10120680"/>
-                              <a:ext cx="507960" cy="156240"/>
+                              <a:ext cx="506880" cy="154800"/>
                             </a:xfrm>
                             <a:prstGeom prst="rect">
                               <a:avLst/>
@@ -1882,12 +2409,12 @@
                           </wps:bodyPr>
                         </wps:wsp>
                         <wps:wsp>
-                          <wps:cNvPr id="8" name="Rectangle 20"/>
+                          <wps:cNvPr id="9" name="Rectangle 20"/>
                           <wps:cNvSpPr/>
                           <wps:spPr>
                             <a:xfrm>
                               <a:off x="2198880" y="10120680"/>
-                              <a:ext cx="330120" cy="156240"/>
+                              <a:ext cx="329040" cy="154800"/>
                             </a:xfrm>
                             <a:prstGeom prst="rect">
                               <a:avLst/>
@@ -1929,12 +2456,12 @@
                           </wps:bodyPr>
                         </wps:wsp>
                         <wps:wsp>
-                          <wps:cNvPr id="9" name="Rectangle 21"/>
+                          <wps:cNvPr id="10" name="Rectangle 21"/>
                           <wps:cNvSpPr/>
                           <wps:spPr>
                             <a:xfrm>
                               <a:off x="6310080" y="9769320"/>
-                              <a:ext cx="330120" cy="155520"/>
+                              <a:ext cx="329040" cy="154440"/>
                             </a:xfrm>
                             <a:prstGeom prst="rect">
                               <a:avLst/>
@@ -1976,12 +2503,12 @@
                           </wps:bodyPr>
                         </wps:wsp>
                         <wps:wsp>
-                          <wps:cNvPr id="10" name="Rectangle 22"/>
+                          <wps:cNvPr id="11" name="Rectangle 22"/>
                           <wps:cNvSpPr/>
                           <wps:spPr>
                             <a:xfrm>
                               <a:off x="6310080" y="10005120"/>
-                              <a:ext cx="330120" cy="214560"/>
+                              <a:ext cx="329040" cy="213480"/>
                             </a:xfrm>
                             <a:prstGeom prst="rect">
                               <a:avLst/>
@@ -2064,12 +2591,12 @@
                           </wps:bodyPr>
                         </wps:wsp>
                         <wps:wsp>
-                          <wps:cNvPr id="11" name="Rectangle 23"/>
+                          <wps:cNvPr id="12" name="Rectangle 23"/>
                           <wps:cNvSpPr/>
                           <wps:spPr>
                             <a:xfrm>
                               <a:off x="2578680" y="9894600"/>
-                              <a:ext cx="3684960" cy="242640"/>
+                              <a:ext cx="3683520" cy="241200"/>
                             </a:xfrm>
                             <a:prstGeom prst="rect">
                               <a:avLst/>
@@ -2216,12 +2743,12 @@
                         </wps:wsp>
                       </wpg:grpSp>
                       <wps:wsp>
-                        <wps:cNvPr id="12" name="Rectangle 24"/>
+                        <wps:cNvPr id="13" name="Rectangle 24"/>
                         <wps:cNvSpPr/>
                         <wps:spPr>
                           <a:xfrm>
                             <a:off x="748080" y="9928080"/>
-                            <a:ext cx="880920" cy="173880"/>
+                            <a:ext cx="879480" cy="172800"/>
                           </a:xfrm>
                           <a:prstGeom prst="rect">
                             <a:avLst/>
@@ -2270,8 +2797,8 @@
         </mc:Choice>
         <mc:Fallback>
           <w:pict>
-            <v:group id="shape_0" alt="Группа 60" style="position:absolute;margin-left:-18.05pt;margin-top:-20.95pt;width:524.15pt;height:810.45pt" coordorigin="-361,-419" coordsize="10483,16209">
-              <v:rect id="shape_0" stroked="f" o:allowincell="f" style="position:absolute;left:817;top:14940;width:1363;height:279;mso-wrap-style:square;v-text-anchor:top">
+            <v:group id="shape_0" alt="Группа 60" style="position:absolute;margin-left:-18.05pt;margin-top:-20.95pt;width:524.1pt;height:810.35pt" coordorigin="-361,-419" coordsize="10482,16207">
+              <v:rect id="shape_0" stroked="f" o:allowincell="f" style="position:absolute;left:817;top:14940;width:1361;height:277;mso-wrap-style:square;v-text-anchor:top">
                 <v:fill o:detectmouseclick="t" on="false"/>
                 <v:stroke color="#3465a4" joinstyle="round" endcap="flat"/>
                 <v:textbox>
@@ -2328,9 +2855,9 @@
                 </v:textbox>
                 <w10:wrap type="none"/>
               </v:rect>
-              <v:group id="shape_0" style="position:absolute;left:-361;top:-419;width:10483;height:16209">
-                <v:group id="shape_0" style="position:absolute;left:-361;top:-419;width:10483;height:16209">
-                  <v:rect id="shape_0" stroked="t" o:allowincell="f" style="position:absolute;left:-361;top:-419;width:10482;height:16208;mso-wrap-style:none;v-text-anchor:middle">
+              <v:group id="shape_0" style="position:absolute;left:-361;top:-419;width:10482;height:16207">
+                <v:group id="shape_0" style="position:absolute;left:-361;top:-419;width:10482;height:16207">
+                  <v:rect id="shape_0" stroked="t" o:allowincell="f" style="position:absolute;left:-361;top:-419;width:10480;height:16206;mso-wrap-style:none;v-text-anchor:middle">
                     <v:fill o:detectmouseclick="t" on="false"/>
                     <v:stroke color="black" weight="25560" joinstyle="miter" endcap="flat"/>
                     <w10:wrap type="none"/>
@@ -2385,7 +2912,7 @@
                     <v:fill o:detectmouseclick="t" on="false"/>
                     <w10:wrap type="none"/>
                   </v:line>
-                  <v:rect id="shape_0" stroked="f" o:allowincell="f" style="position:absolute;left:-333;top:15519;width:519;height:245;mso-wrap-style:square;v-text-anchor:top">
+                  <v:rect id="shape_0" stroked="f" o:allowincell="f" style="position:absolute;left:-333;top:15519;width:517;height:243;mso-wrap-style:square;v-text-anchor:top">
                     <v:fill o:detectmouseclick="t" on="false"/>
                     <v:stroke color="#3465a4" joinstyle="round" endcap="flat"/>
                     <v:textbox>
@@ -2411,7 +2938,7 @@
                     </v:textbox>
                     <w10:wrap type="none"/>
                   </v:rect>
-                  <v:rect id="shape_0" stroked="f" o:allowincell="f" style="position:absolute;left:236;top:15519;width:519;height:245;mso-wrap-style:square;v-text-anchor:top">
+                  <v:rect id="shape_0" stroked="f" o:allowincell="f" style="position:absolute;left:236;top:15519;width:517;height:243;mso-wrap-style:square;v-text-anchor:top">
                     <v:fill o:detectmouseclick="t" on="false"/>
                     <v:stroke color="#3465a4" joinstyle="round" endcap="flat"/>
                     <v:textbox>
@@ -2437,7 +2964,7 @@
                     </v:textbox>
                     <w10:wrap type="none"/>
                   </v:rect>
-                  <v:rect id="shape_0" stroked="f" o:allowincell="f" style="position:absolute;left:828;top:15519;width:1343;height:245;mso-wrap-style:square;v-text-anchor:top">
+                  <v:rect id="shape_0" stroked="f" o:allowincell="f" style="position:absolute;left:828;top:15519;width:1341;height:243;mso-wrap-style:square;v-text-anchor:top">
                     <v:fill o:detectmouseclick="t" on="false"/>
                     <v:stroke color="#3465a4" joinstyle="round" endcap="flat"/>
                     <v:textbox>
@@ -2550,7 +3077,7 @@
                     </v:textbox>
                     <w10:wrap type="none"/>
                   </v:rect>
-                  <v:rect id="shape_0" stroked="f" o:allowincell="f" style="position:absolute;left:2252;top:15519;width:799;height:245;mso-wrap-style:square;v-text-anchor:top">
+                  <v:rect id="shape_0" stroked="f" o:allowincell="f" style="position:absolute;left:2252;top:15519;width:797;height:243;mso-wrap-style:square;v-text-anchor:top">
                     <v:fill o:detectmouseclick="t" on="false"/>
                     <v:stroke color="#3465a4" joinstyle="round" endcap="flat"/>
                     <v:textbox>
@@ -2576,7 +3103,7 @@
                     </v:textbox>
                     <w10:wrap type="none"/>
                   </v:rect>
-                  <v:rect id="shape_0" stroked="f" o:allowincell="f" style="position:absolute;left:3102;top:15519;width:519;height:245;mso-wrap-style:square;v-text-anchor:top">
+                  <v:rect id="shape_0" stroked="f" o:allowincell="f" style="position:absolute;left:3102;top:15519;width:517;height:243;mso-wrap-style:square;v-text-anchor:top">
                     <v:fill o:detectmouseclick="t" on="false"/>
                     <v:stroke color="#3465a4" joinstyle="round" endcap="flat"/>
                     <v:textbox>
@@ -2602,7 +3129,7 @@
                     </v:textbox>
                     <w10:wrap type="none"/>
                   </v:rect>
-                  <v:rect id="shape_0" stroked="f" o:allowincell="f" style="position:absolute;left:9576;top:14966;width:519;height:244;mso-wrap-style:square;v-text-anchor:top">
+                  <v:rect id="shape_0" stroked="f" o:allowincell="f" style="position:absolute;left:9576;top:14966;width:517;height:242;mso-wrap-style:square;v-text-anchor:top">
                     <v:fill o:detectmouseclick="t" on="false"/>
                     <v:stroke color="#3465a4" joinstyle="round" endcap="flat"/>
                     <v:textbox>
@@ -2628,7 +3155,7 @@
                     </v:textbox>
                     <w10:wrap type="none"/>
                   </v:rect>
-                  <v:rect id="shape_0" stroked="f" o:allowincell="f" style="position:absolute;left:9576;top:15337;width:519;height:337;mso-wrap-style:square;v-text-anchor:top">
+                  <v:rect id="shape_0" stroked="f" o:allowincell="f" style="position:absolute;left:9576;top:15337;width:517;height:335;mso-wrap-style:square;v-text-anchor:top">
                     <v:fill o:detectmouseclick="t" on="false"/>
                     <v:stroke color="#3465a4" joinstyle="round" endcap="flat"/>
                     <v:textbox>
@@ -2695,7 +3222,7 @@
                     </v:textbox>
                     <w10:wrap type="none"/>
                   </v:rect>
-                  <v:rect id="shape_0" stroked="f" o:allowincell="f" style="position:absolute;left:3700;top:15163;width:5802;height:381;mso-wrap-style:square;v-text-anchor:top">
+                  <v:rect id="shape_0" stroked="f" o:allowincell="f" style="position:absolute;left:3700;top:15163;width:5800;height:379;mso-wrap-style:square;v-text-anchor:top">
                     <v:fill o:detectmouseclick="t" on="false"/>
                     <v:stroke color="#3465a4" joinstyle="round" endcap="flat"/>
                     <v:textbox>
@@ -2826,7 +3353,7 @@
                     <w10:wrap type="none"/>
                   </v:rect>
                 </v:group>
-                <v:rect id="shape_0" stroked="f" o:allowincell="f" style="position:absolute;left:817;top:15216;width:1386;height:273;mso-wrap-style:none;v-text-anchor:middle">
+                <v:rect id="shape_0" stroked="f" o:allowincell="f" style="position:absolute;left:817;top:15216;width:1384;height:271;mso-wrap-style:none;v-text-anchor:middle">
                   <v:fill o:detectmouseclick="t" on="false"/>
                   <v:stroke color="#3465a4" joinstyle="round" endcap="flat"/>
                   <v:textbox>
@@ -2881,10 +3408,10 @@
               <wp:positionV relativeFrom="paragraph">
                 <wp:posOffset>-244475</wp:posOffset>
               </wp:positionV>
-              <wp:extent cx="6656705" cy="10292715"/>
+              <wp:extent cx="6656070" cy="10291445"/>
               <wp:effectExtent l="13335" t="13335" r="12065" b="12065"/>
               <wp:wrapNone/>
-              <wp:docPr id="13" name="Группа 10"/>
+              <wp:docPr id="14" name="Группа 10"/>
               <a:graphic xmlns:a="http://schemas.openxmlformats.org/drawingml/2006/main">
                 <a:graphicData uri="http://schemas.microsoft.com/office/word/2010/wordprocessingGroup">
                   <wpg:wgp>
@@ -2892,18 +3419,18 @@
                     <wpg:grpSpPr>
                       <a:xfrm>
                         <a:off x="0" y="0"/>
-                        <a:ext cx="6656760" cy="10292760"/>
+                        <a:ext cx="6656040" cy="10291320"/>
                         <a:chOff x="0" y="0"/>
-                        <a:chExt cx="6656760" cy="10292760"/>
+                        <a:chExt cx="6656040" cy="10291320"/>
                       </a:xfrm>
                     </wpg:grpSpPr>
                     <wps:wsp>
-                      <wps:cNvPr id="14" name="Rectangle 26"/>
+                      <wps:cNvPr id="15" name="Rectangle 26"/>
                       <wps:cNvSpPr/>
                       <wps:spPr>
                         <a:xfrm>
                           <a:off x="0" y="0"/>
-                          <a:ext cx="6656760" cy="10292760"/>
+                          <a:ext cx="6655320" cy="10291320"/>
                         </a:xfrm>
                         <a:prstGeom prst="rect">
                           <a:avLst/>
@@ -3150,12 +3677,12 @@
                       <wps:bodyPr/>
                     </wps:wsp>
                     <wps:wsp>
-                      <wps:cNvPr id="15" name="Rectangle 36"/>
+                      <wps:cNvPr id="16" name="Rectangle 36"/>
                       <wps:cNvSpPr/>
                       <wps:spPr>
                         <a:xfrm>
                           <a:off x="17640" y="9220680"/>
-                          <a:ext cx="290880" cy="156240"/>
+                          <a:ext cx="289440" cy="154800"/>
                         </a:xfrm>
                         <a:prstGeom prst="rect">
                           <a:avLst/>
@@ -3205,12 +3732,12 @@
                       </wps:bodyPr>
                     </wps:wsp>
                     <wps:wsp>
-                      <wps:cNvPr id="16" name="Rectangle 37"/>
+                      <wps:cNvPr id="17" name="Rectangle 37"/>
                       <wps:cNvSpPr/>
                       <wps:spPr>
                         <a:xfrm>
                           <a:off x="349920" y="9220680"/>
-                          <a:ext cx="363240" cy="156240"/>
+                          <a:ext cx="361800" cy="154800"/>
                         </a:xfrm>
                         <a:prstGeom prst="rect">
                           <a:avLst/>
@@ -3254,12 +3781,12 @@
                       </wps:bodyPr>
                     </wps:wsp>
                     <wps:wsp>
-                      <wps:cNvPr id="17" name="Rectangle 38"/>
+                      <wps:cNvPr id="18" name="Rectangle 38"/>
                       <wps:cNvSpPr/>
                       <wps:spPr>
                         <a:xfrm>
                           <a:off x="754920" y="9220680"/>
-                          <a:ext cx="853560" cy="156240"/>
+                          <a:ext cx="852120" cy="154800"/>
                         </a:xfrm>
                         <a:prstGeom prst="rect">
                           <a:avLst/>
@@ -3311,12 +3838,12 @@
                       </wps:bodyPr>
                     </wps:wsp>
                     <wps:wsp>
-                      <wps:cNvPr id="18" name="Rectangle 39"/>
+                      <wps:cNvPr id="19" name="Rectangle 39"/>
                       <wps:cNvSpPr/>
                       <wps:spPr>
                         <a:xfrm>
                           <a:off x="1659240" y="9220680"/>
-                          <a:ext cx="507960" cy="156240"/>
+                          <a:ext cx="506880" cy="154800"/>
                         </a:xfrm>
                         <a:prstGeom prst="rect">
                           <a:avLst/>
@@ -3360,12 +3887,12 @@
                       </wps:bodyPr>
                     </wps:wsp>
                     <wps:wsp>
-                      <wps:cNvPr id="19" name="Rectangle 40"/>
+                      <wps:cNvPr id="20" name="Rectangle 40"/>
                       <wps:cNvSpPr/>
                       <wps:spPr>
                         <a:xfrm>
                           <a:off x="2198880" y="9220680"/>
-                          <a:ext cx="330120" cy="156240"/>
+                          <a:ext cx="329040" cy="154800"/>
                         </a:xfrm>
                         <a:prstGeom prst="rect">
                           <a:avLst/>
@@ -3409,12 +3936,12 @@
                       </wps:bodyPr>
                     </wps:wsp>
                     <wps:wsp>
-                      <wps:cNvPr id="20" name="Rectangle 41"/>
+                      <wps:cNvPr id="21" name="Rectangle 41"/>
                       <wps:cNvSpPr/>
                       <wps:spPr>
                         <a:xfrm>
                           <a:off x="5304240" y="9399240"/>
-                          <a:ext cx="488160" cy="155520"/>
+                          <a:ext cx="487080" cy="154440"/>
                         </a:xfrm>
                         <a:prstGeom prst="rect">
                           <a:avLst/>
@@ -3455,12 +3982,12 @@
                       </wps:bodyPr>
                     </wps:wsp>
                     <wps:wsp>
-                      <wps:cNvPr id="21" name="Rectangle 42"/>
+                      <wps:cNvPr id="22" name="Rectangle 42"/>
                       <wps:cNvSpPr/>
                       <wps:spPr>
                         <a:xfrm>
                           <a:off x="5304240" y="9587160"/>
-                          <a:ext cx="488160" cy="156240"/>
+                          <a:ext cx="487080" cy="154800"/>
                         </a:xfrm>
                         <a:prstGeom prst="rect">
                           <a:avLst/>
@@ -3502,12 +4029,12 @@
                       </wps:bodyPr>
                     </wps:wsp>
                     <wps:wsp>
-                      <wps:cNvPr id="22" name="Rectangle 43"/>
+                      <wps:cNvPr id="23" name="Rectangle 43"/>
                       <wps:cNvSpPr/>
                       <wps:spPr>
                         <a:xfrm>
                           <a:off x="2585880" y="8977680"/>
-                          <a:ext cx="3989880" cy="240120"/>
+                          <a:ext cx="3988440" cy="238680"/>
                         </a:xfrm>
                         <a:prstGeom prst="rect">
                           <a:avLst/>
@@ -3760,16 +4287,16 @@
                       <wpg:grpSpPr>
                         <a:xfrm>
                           <a:off x="12600" y="9387720"/>
-                          <a:ext cx="1614960" cy="181080"/>
+                          <a:ext cx="1613520" cy="179640"/>
                         </a:xfrm>
                       </wpg:grpSpPr>
                       <wps:wsp>
-                        <wps:cNvPr id="23" name="Rectangle 50"/>
+                        <wps:cNvPr id="24" name="Rectangle 50"/>
                         <wps:cNvSpPr/>
                         <wps:spPr>
                           <a:xfrm>
                             <a:off x="0" y="15840"/>
-                            <a:ext cx="704880" cy="156240"/>
+                            <a:ext cx="703440" cy="154800"/>
                           </a:xfrm>
                           <a:prstGeom prst="rect">
                             <a:avLst/>
@@ -3822,12 +4349,12 @@
                         </wps:bodyPr>
                       </wps:wsp>
                       <wps:wsp>
-                        <wps:cNvPr id="24" name="Rectangle 51"/>
+                        <wps:cNvPr id="25" name="Rectangle 51"/>
                         <wps:cNvSpPr/>
                         <wps:spPr>
                           <a:xfrm>
                             <a:off x="734040" y="0"/>
-                            <a:ext cx="880920" cy="181080"/>
+                            <a:ext cx="879480" cy="179640"/>
                           </a:xfrm>
                           <a:prstGeom prst="rect">
                             <a:avLst/>
@@ -3893,16 +4420,16 @@
                       <wpg:grpSpPr>
                         <a:xfrm>
                           <a:off x="12600" y="9582120"/>
-                          <a:ext cx="1595160" cy="156240"/>
+                          <a:ext cx="1593720" cy="154800"/>
                         </a:xfrm>
                       </wpg:grpSpPr>
                       <wps:wsp>
-                        <wps:cNvPr id="25" name="Rectangle 53"/>
+                        <wps:cNvPr id="26" name="Rectangle 53"/>
                         <wps:cNvSpPr/>
                         <wps:spPr>
                           <a:xfrm>
                             <a:off x="0" y="0"/>
-                            <a:ext cx="704880" cy="156240"/>
+                            <a:ext cx="703440" cy="154800"/>
                           </a:xfrm>
                           <a:prstGeom prst="rect">
                             <a:avLst/>
@@ -3950,12 +4477,12 @@
                         </wps:bodyPr>
                       </wps:wsp>
                       <wps:wsp>
-                        <wps:cNvPr id="26" name="Rectangle 54"/>
+                        <wps:cNvPr id="27" name="Rectangle 54"/>
                         <wps:cNvSpPr/>
                         <wps:spPr>
                           <a:xfrm>
                             <a:off x="741960" y="0"/>
-                            <a:ext cx="853560" cy="156240"/>
+                            <a:ext cx="852120" cy="154800"/>
                           </a:xfrm>
                           <a:prstGeom prst="rect">
                             <a:avLst/>
@@ -4006,16 +4533,16 @@
                       <wpg:grpSpPr>
                         <a:xfrm>
                           <a:off x="12600" y="9765000"/>
-                          <a:ext cx="1595160" cy="156240"/>
+                          <a:ext cx="1593720" cy="154800"/>
                         </a:xfrm>
                       </wpg:grpSpPr>
                       <wps:wsp>
-                        <wps:cNvPr id="27" name="Rectangle 56"/>
+                        <wps:cNvPr id="28" name="Rectangle 56"/>
                         <wps:cNvSpPr/>
                         <wps:spPr>
                           <a:xfrm>
                             <a:off x="0" y="0"/>
-                            <a:ext cx="704880" cy="156240"/>
+                            <a:ext cx="703440" cy="154800"/>
                           </a:xfrm>
                           <a:prstGeom prst="rect">
                             <a:avLst/>
@@ -4060,12 +4587,12 @@
                         </wps:bodyPr>
                       </wps:wsp>
                       <wps:wsp>
-                        <wps:cNvPr id="28" name="Rectangle 57"/>
+                        <wps:cNvPr id="29" name="Rectangle 57"/>
                         <wps:cNvSpPr/>
                         <wps:spPr>
                           <a:xfrm>
                             <a:off x="741960" y="0"/>
-                            <a:ext cx="853560" cy="156240"/>
+                            <a:ext cx="852120" cy="154800"/>
                           </a:xfrm>
                           <a:prstGeom prst="rect">
                             <a:avLst/>
@@ -4104,16 +4631,16 @@
                       <wpg:grpSpPr>
                         <a:xfrm>
                           <a:off x="12600" y="9942840"/>
-                          <a:ext cx="1595160" cy="156240"/>
+                          <a:ext cx="1593720" cy="154800"/>
                         </a:xfrm>
                       </wpg:grpSpPr>
                       <wps:wsp>
-                        <wps:cNvPr id="29" name="Rectangle 59"/>
+                        <wps:cNvPr id="30" name="Rectangle 59"/>
                         <wps:cNvSpPr/>
                         <wps:spPr>
                           <a:xfrm>
                             <a:off x="0" y="0"/>
-                            <a:ext cx="704880" cy="156240"/>
+                            <a:ext cx="703440" cy="154800"/>
                           </a:xfrm>
                           <a:prstGeom prst="rect">
                             <a:avLst/>
@@ -4158,12 +4685,12 @@
                         </wps:bodyPr>
                       </wps:wsp>
                       <wps:wsp>
-                        <wps:cNvPr id="30" name="Rectangle 60"/>
+                        <wps:cNvPr id="31" name="Rectangle 60"/>
                         <wps:cNvSpPr/>
                         <wps:spPr>
                           <a:xfrm>
                             <a:off x="741960" y="0"/>
-                            <a:ext cx="853560" cy="156240"/>
+                            <a:ext cx="852120" cy="154800"/>
                           </a:xfrm>
                           <a:prstGeom prst="rect">
                             <a:avLst/>
@@ -4202,16 +4729,16 @@
                       <wpg:grpSpPr>
                         <a:xfrm>
                           <a:off x="12600" y="10120680"/>
-                          <a:ext cx="1595160" cy="156240"/>
+                          <a:ext cx="1593720" cy="154800"/>
                         </a:xfrm>
                       </wpg:grpSpPr>
                       <wps:wsp>
-                        <wps:cNvPr id="31" name="Rectangle 62"/>
+                        <wps:cNvPr id="32" name="Rectangle 62"/>
                         <wps:cNvSpPr/>
                         <wps:spPr>
                           <a:xfrm>
                             <a:off x="0" y="0"/>
-                            <a:ext cx="704880" cy="156240"/>
+                            <a:ext cx="703440" cy="154800"/>
                           </a:xfrm>
                           <a:prstGeom prst="rect">
                             <a:avLst/>
@@ -4256,12 +4783,12 @@
                         </wps:bodyPr>
                       </wps:wsp>
                       <wps:wsp>
-                        <wps:cNvPr id="32" name="Rectangle 63"/>
+                        <wps:cNvPr id="33" name="Rectangle 63"/>
                         <wps:cNvSpPr/>
                         <wps:spPr>
                           <a:xfrm>
                             <a:off x="741960" y="0"/>
-                            <a:ext cx="853560" cy="156240"/>
+                            <a:ext cx="852120" cy="154800"/>
                           </a:xfrm>
                           <a:prstGeom prst="rect">
                             <a:avLst/>
@@ -4329,12 +4856,12 @@
                       <wps:bodyPr/>
                     </wps:wsp>
                     <wps:wsp>
-                      <wps:cNvPr id="33" name="Rectangle 65"/>
+                      <wps:cNvPr id="34" name="Rectangle 65"/>
                       <wps:cNvSpPr/>
                       <wps:spPr>
                         <a:xfrm>
                           <a:off x="2593440" y="9523800"/>
-                          <a:ext cx="2099880" cy="729720"/>
+                          <a:ext cx="2098800" cy="728280"/>
                         </a:xfrm>
                         <a:prstGeom prst="rect">
                           <a:avLst/>
@@ -4477,12 +5004,12 @@
                       <wps:bodyPr/>
                     </wps:wsp>
                     <wps:wsp>
-                      <wps:cNvPr id="34" name="Rectangle 69"/>
+                      <wps:cNvPr id="35" name="Rectangle 69"/>
                       <wps:cNvSpPr/>
                       <wps:spPr>
                         <a:xfrm>
                           <a:off x="4759920" y="9399240"/>
-                          <a:ext cx="487800" cy="155520"/>
+                          <a:ext cx="486360" cy="154440"/>
                         </a:xfrm>
                         <a:prstGeom prst="rect">
                           <a:avLst/>
@@ -4522,12 +5049,12 @@
                       </wps:bodyPr>
                     </wps:wsp>
                     <wps:wsp>
-                      <wps:cNvPr id="35" name="Rectangle 70"/>
+                      <wps:cNvPr id="36" name="Rectangle 70"/>
                       <wps:cNvSpPr/>
                       <wps:spPr>
                         <a:xfrm>
                           <a:off x="5852880" y="9399240"/>
-                          <a:ext cx="772200" cy="155520"/>
+                          <a:ext cx="770760" cy="154440"/>
                         </a:xfrm>
                         <a:prstGeom prst="rect">
                           <a:avLst/>
@@ -4568,12 +5095,12 @@
                       </wps:bodyPr>
                     </wps:wsp>
                     <wps:wsp>
-                      <wps:cNvPr id="36" name="Rectangle 71"/>
+                      <wps:cNvPr id="37" name="Rectangle 71"/>
                       <wps:cNvSpPr/>
                       <wps:spPr>
                         <a:xfrm>
                           <a:off x="5857920" y="9582120"/>
-                          <a:ext cx="770760" cy="155520"/>
+                          <a:ext cx="769680" cy="154440"/>
                         </a:xfrm>
                         <a:prstGeom prst="rect">
                           <a:avLst/>
@@ -4665,12 +5192,12 @@
                       <wps:bodyPr/>
                     </wps:wsp>
                     <wps:wsp>
-                      <wps:cNvPr id="37" name="Rectangle 74"/>
+                      <wps:cNvPr id="38" name="Rectangle 74"/>
                       <wps:cNvSpPr/>
                       <wps:spPr>
                         <a:xfrm>
                           <a:off x="4759920" y="9864720"/>
-                          <a:ext cx="1865160" cy="339840"/>
+                          <a:ext cx="1863720" cy="338400"/>
                         </a:xfrm>
                         <a:prstGeom prst="rect">
                           <a:avLst/>
@@ -4729,8 +5256,8 @@
         </mc:Choice>
         <mc:Fallback>
           <w:pict>
-            <v:group id="shape_0" alt="Группа 10" style="position:absolute;margin-left:-18.1pt;margin-top:-19.25pt;width:524.15pt;height:810.45pt" coordorigin="-362,-385" coordsize="10483,16209">
-              <v:rect id="shape_0" stroked="t" o:allowincell="f" style="position:absolute;left:-362;top:-385;width:10482;height:16208;mso-wrap-style:none;v-text-anchor:middle">
+            <v:group id="shape_0" alt="Группа 10" style="position:absolute;margin-left:-18.1pt;margin-top:-19.25pt;width:524.05pt;height:810.35pt" coordorigin="-362,-385" coordsize="10481,16207">
+              <v:rect id="shape_0" stroked="t" o:allowincell="f" style="position:absolute;left:-362;top:-385;width:10480;height:16206;mso-wrap-style:none;v-text-anchor:middle">
                 <v:fill o:detectmouseclick="t" on="false"/>
                 <v:stroke color="black" weight="25560" joinstyle="miter" endcap="flat"/>
                 <w10:wrap type="none"/>
@@ -4780,7 +5307,7 @@
                 <v:fill o:detectmouseclick="t" on="false"/>
                 <w10:wrap type="none"/>
               </v:line>
-              <v:rect id="shape_0" stroked="f" o:allowincell="f" style="position:absolute;left:-334;top:14136;width:457;height:245;mso-wrap-style:square;v-text-anchor:top">
+              <v:rect id="shape_0" stroked="f" o:allowincell="f" style="position:absolute;left:-334;top:14136;width:455;height:243;mso-wrap-style:square;v-text-anchor:top">
                 <v:fill o:detectmouseclick="t" on="false"/>
                 <v:stroke color="#3465a4" joinstyle="round" endcap="flat"/>
                 <v:textbox>
@@ -4814,7 +5341,7 @@
                 </v:textbox>
                 <w10:wrap type="none"/>
               </v:rect>
-              <v:rect id="shape_0" stroked="f" o:allowincell="f" style="position:absolute;left:189;top:14136;width:571;height:245;mso-wrap-style:square;v-text-anchor:top">
+              <v:rect id="shape_0" stroked="f" o:allowincell="f" style="position:absolute;left:189;top:14136;width:569;height:243;mso-wrap-style:square;v-text-anchor:top">
                 <v:fill o:detectmouseclick="t" on="false"/>
                 <v:stroke color="#3465a4" joinstyle="round" endcap="flat"/>
                 <v:textbox>
@@ -4842,7 +5369,7 @@
                 </v:textbox>
                 <w10:wrap type="none"/>
               </v:rect>
-              <v:rect id="shape_0" stroked="f" o:allowincell="f" style="position:absolute;left:827;top:14136;width:1343;height:245;mso-wrap-style:square;v-text-anchor:top">
+              <v:rect id="shape_0" stroked="f" o:allowincell="f" style="position:absolute;left:827;top:14136;width:1341;height:243;mso-wrap-style:square;v-text-anchor:top">
                 <v:fill o:detectmouseclick="t" on="false"/>
                 <v:stroke color="#3465a4" joinstyle="round" endcap="flat"/>
                 <v:textbox>
@@ -4878,7 +5405,7 @@
                 </v:textbox>
                 <w10:wrap type="none"/>
               </v:rect>
-              <v:rect id="shape_0" stroked="f" o:allowincell="f" style="position:absolute;left:2251;top:14136;width:799;height:245;mso-wrap-style:square;v-text-anchor:top">
+              <v:rect id="shape_0" stroked="f" o:allowincell="f" style="position:absolute;left:2251;top:14136;width:797;height:243;mso-wrap-style:square;v-text-anchor:top">
                 <v:fill o:detectmouseclick="t" on="false"/>
                 <v:stroke color="#3465a4" joinstyle="round" endcap="flat"/>
                 <v:textbox>
@@ -4906,7 +5433,7 @@
                 </v:textbox>
                 <w10:wrap type="none"/>
               </v:rect>
-              <v:rect id="shape_0" stroked="f" o:allowincell="f" style="position:absolute;left:3101;top:14136;width:519;height:245;mso-wrap-style:square;v-text-anchor:top">
+              <v:rect id="shape_0" stroked="f" o:allowincell="f" style="position:absolute;left:3101;top:14136;width:517;height:243;mso-wrap-style:square;v-text-anchor:top">
                 <v:fill o:detectmouseclick="t" on="false"/>
                 <v:stroke color="#3465a4" joinstyle="round" endcap="flat"/>
                 <v:textbox>
@@ -4934,7 +5461,7 @@
                 </v:textbox>
                 <w10:wrap type="none"/>
               </v:rect>
-              <v:rect id="shape_0" stroked="f" o:allowincell="f" style="position:absolute;left:7991;top:14417;width:768;height:244;mso-wrap-style:square;v-text-anchor:top">
+              <v:rect id="shape_0" stroked="f" o:allowincell="f" style="position:absolute;left:7991;top:14417;width:766;height:242;mso-wrap-style:square;v-text-anchor:top">
                 <v:fill o:detectmouseclick="t" on="false"/>
                 <v:stroke color="#3465a4" joinstyle="round" endcap="flat"/>
                 <v:textbox>
@@ -4959,7 +5486,7 @@
                 </v:textbox>
                 <w10:wrap type="none"/>
               </v:rect>
-              <v:rect id="shape_0" stroked="f" o:allowincell="f" style="position:absolute;left:7991;top:14713;width:768;height:245;mso-wrap-style:square;v-text-anchor:top">
+              <v:rect id="shape_0" stroked="f" o:allowincell="f" style="position:absolute;left:7991;top:14713;width:766;height:243;mso-wrap-style:square;v-text-anchor:top">
                 <v:fill o:detectmouseclick="t" on="false"/>
                 <v:stroke color="#3465a4" joinstyle="round" endcap="flat"/>
                 <v:textbox>
@@ -4985,7 +5512,7 @@
                 </v:textbox>
                 <w10:wrap type="none"/>
               </v:rect>
-              <v:rect id="shape_0" stroked="f" o:allowincell="f" style="position:absolute;left:3710;top:13753;width:6282;height:377;mso-wrap-style:square;v-text-anchor:top">
+              <v:rect id="shape_0" stroked="f" o:allowincell="f" style="position:absolute;left:3710;top:13753;width:6280;height:375;mso-wrap-style:square;v-text-anchor:top">
                 <v:fill o:detectmouseclick="t" on="false"/>
                 <v:stroke color="#3465a4" joinstyle="round" endcap="flat"/>
                 <v:textbox>
@@ -5118,8 +5645,8 @@
                 <v:fill o:detectmouseclick="t" on="false"/>
                 <w10:wrap type="none"/>
               </v:line>
-              <v:group id="shape_0" style="position:absolute;left:-342;top:14399;width:2543;height:285">
-                <v:rect id="shape_0" stroked="f" o:allowincell="f" style="position:absolute;left:-342;top:14424;width:1109;height:245;mso-wrap-style:square;v-text-anchor:top">
+              <v:group id="shape_0" style="position:absolute;left:-342;top:14399;width:2541;height:283">
+                <v:rect id="shape_0" stroked="f" o:allowincell="f" style="position:absolute;left:-342;top:14424;width:1107;height:243;mso-wrap-style:square;v-text-anchor:top">
                   <v:fill o:detectmouseclick="t" on="false"/>
                   <v:stroke color="#3465a4" joinstyle="round" endcap="flat"/>
                   <v:textbox>
@@ -5156,7 +5683,7 @@
                   </v:textbox>
                   <w10:wrap type="none"/>
                 </v:rect>
-                <v:rect id="shape_0" stroked="f" o:allowincell="f" style="position:absolute;left:814;top:14399;width:1386;height:284;mso-wrap-style:square;v-text-anchor:top">
+                <v:rect id="shape_0" stroked="f" o:allowincell="f" style="position:absolute;left:814;top:14399;width:1384;height:282;mso-wrap-style:square;v-text-anchor:top">
                   <v:fill o:detectmouseclick="t" on="false"/>
                   <v:stroke color="#3465a4" joinstyle="round" endcap="flat"/>
                   <v:textbox>
@@ -5202,8 +5729,8 @@
                   <w10:wrap type="none"/>
                 </v:rect>
               </v:group>
-              <v:group id="shape_0" style="position:absolute;left:-342;top:14705;width:2513;height:246">
-                <v:rect id="shape_0" stroked="f" o:allowincell="f" style="position:absolute;left:-342;top:14705;width:1109;height:245;mso-wrap-style:square;v-text-anchor:top">
+              <v:group id="shape_0" style="position:absolute;left:-342;top:14705;width:2510;height:244">
+                <v:rect id="shape_0" stroked="f" o:allowincell="f" style="position:absolute;left:-342;top:14705;width:1107;height:243;mso-wrap-style:square;v-text-anchor:top">
                   <v:fill o:detectmouseclick="t" on="false"/>
                   <v:stroke color="#3465a4" joinstyle="round" endcap="flat"/>
                   <v:textbox>
@@ -5235,7 +5762,7 @@
                   </v:textbox>
                   <w10:wrap type="none"/>
                 </v:rect>
-                <v:rect id="shape_0" stroked="f" o:allowincell="f" style="position:absolute;left:826;top:14705;width:1343;height:245;mso-wrap-style:square;v-text-anchor:top">
+                <v:rect id="shape_0" stroked="f" o:allowincell="f" style="position:absolute;left:826;top:14705;width:1341;height:243;mso-wrap-style:square;v-text-anchor:top">
                   <v:fill o:detectmouseclick="t" on="false"/>
                   <v:stroke color="#3465a4" joinstyle="round" endcap="flat"/>
                   <v:textbox>
@@ -5266,8 +5793,8 @@
                   <w10:wrap type="none"/>
                 </v:rect>
               </v:group>
-              <v:group id="shape_0" style="position:absolute;left:-342;top:14993;width:2513;height:246">
-                <v:rect id="shape_0" stroked="f" o:allowincell="f" style="position:absolute;left:-342;top:14993;width:1109;height:245;mso-wrap-style:square;v-text-anchor:top">
+              <v:group id="shape_0" style="position:absolute;left:-342;top:14993;width:2510;height:244">
+                <v:rect id="shape_0" stroked="f" o:allowincell="f" style="position:absolute;left:-342;top:14993;width:1107;height:243;mso-wrap-style:square;v-text-anchor:top">
                   <v:fill o:detectmouseclick="t" on="false"/>
                   <v:stroke color="#3465a4" joinstyle="round" endcap="flat"/>
                   <v:textbox>
@@ -5296,7 +5823,7 @@
                   </v:textbox>
                   <w10:wrap type="none"/>
                 </v:rect>
-                <v:rect id="shape_0" stroked="f" o:allowincell="f" style="position:absolute;left:826;top:14993;width:1343;height:245;mso-wrap-style:none;v-text-anchor:middle">
+                <v:rect id="shape_0" stroked="f" o:allowincell="f" style="position:absolute;left:826;top:14993;width:1341;height:243;mso-wrap-style:none;v-text-anchor:middle">
                   <v:fill o:detectmouseclick="t" on="false"/>
                   <v:stroke color="#3465a4" joinstyle="round" endcap="flat"/>
                   <v:textbox>
@@ -5315,8 +5842,8 @@
                   <w10:wrap type="none"/>
                 </v:rect>
               </v:group>
-              <v:group id="shape_0" style="position:absolute;left:-342;top:15273;width:2513;height:246">
-                <v:rect id="shape_0" stroked="f" o:allowincell="f" style="position:absolute;left:-342;top:15273;width:1109;height:245;mso-wrap-style:square;v-text-anchor:top">
+              <v:group id="shape_0" style="position:absolute;left:-342;top:15273;width:2510;height:244">
+                <v:rect id="shape_0" stroked="f" o:allowincell="f" style="position:absolute;left:-342;top:15273;width:1107;height:243;mso-wrap-style:square;v-text-anchor:top">
                   <v:fill o:detectmouseclick="t" on="false"/>
                   <v:stroke color="#3465a4" joinstyle="round" endcap="flat"/>
                   <v:textbox>
@@ -5345,7 +5872,7 @@
                   </v:textbox>
                   <w10:wrap type="none"/>
                 </v:rect>
-                <v:rect id="shape_0" stroked="f" o:allowincell="f" style="position:absolute;left:826;top:15273;width:1343;height:245;mso-wrap-style:none;v-text-anchor:middle">
+                <v:rect id="shape_0" stroked="f" o:allowincell="f" style="position:absolute;left:826;top:15273;width:1341;height:243;mso-wrap-style:none;v-text-anchor:middle">
                   <v:fill o:detectmouseclick="t" on="false"/>
                   <v:stroke color="#3465a4" joinstyle="round" endcap="flat"/>
                   <v:textbox>
@@ -5364,8 +5891,8 @@
                   <w10:wrap type="none"/>
                 </v:rect>
               </v:group>
-              <v:group id="shape_0" style="position:absolute;left:-342;top:15553;width:2513;height:246">
-                <v:rect id="shape_0" stroked="f" o:allowincell="f" style="position:absolute;left:-342;top:15553;width:1109;height:245;mso-wrap-style:square;v-text-anchor:top">
+              <v:group id="shape_0" style="position:absolute;left:-342;top:15553;width:2510;height:244">
+                <v:rect id="shape_0" stroked="f" o:allowincell="f" style="position:absolute;left:-342;top:15553;width:1107;height:243;mso-wrap-style:square;v-text-anchor:top">
                   <v:fill o:detectmouseclick="t" on="false"/>
                   <v:stroke color="#3465a4" joinstyle="round" endcap="flat"/>
                   <v:textbox>
@@ -5394,7 +5921,7 @@
                   </v:textbox>
                   <w10:wrap type="none"/>
                 </v:rect>
-                <v:rect id="shape_0" stroked="f" o:allowincell="f" style="position:absolute;left:826;top:15553;width:1343;height:245;mso-wrap-style:none;v-text-anchor:middle">
+                <v:rect id="shape_0" stroked="f" o:allowincell="f" style="position:absolute;left:826;top:15553;width:1341;height:243;mso-wrap-style:none;v-text-anchor:middle">
                   <v:fill o:detectmouseclick="t" on="false"/>
                   <v:stroke color="#3465a4" joinstyle="round" endcap="flat"/>
                   <v:textbox>
@@ -5426,7 +5953,7 @@
                 <v:fill o:detectmouseclick="t" on="false"/>
                 <w10:wrap type="none"/>
               </v:line>
-              <v:rect id="shape_0" stroked="f" o:allowincell="f" style="position:absolute;left:3722;top:14613;width:3306;height:1148;mso-wrap-style:square;v-text-anchor:middle">
+              <v:rect id="shape_0" stroked="f" o:allowincell="f" style="position:absolute;left:3722;top:14613;width:3304;height:1146;mso-wrap-style:square;v-text-anchor:middle">
                 <v:fill o:detectmouseclick="t" on="false"/>
                 <v:stroke color="#3465a4" joinstyle="round" endcap="flat"/>
                 <v:textbox>
@@ -5493,7 +6020,7 @@
                 <v:fill o:detectmouseclick="t" on="false"/>
                 <w10:wrap type="none"/>
               </v:line>
-              <v:rect id="shape_0" stroked="f" o:allowincell="f" style="position:absolute;left:7134;top:14417;width:767;height:244;mso-wrap-style:square;v-text-anchor:top">
+              <v:rect id="shape_0" stroked="f" o:allowincell="f" style="position:absolute;left:7134;top:14417;width:765;height:242;mso-wrap-style:square;v-text-anchor:top">
                 <v:fill o:detectmouseclick="t" on="false"/>
                 <v:stroke color="#3465a4" joinstyle="round" endcap="flat"/>
                 <v:textbox>
@@ -5517,7 +6044,7 @@
                 </v:textbox>
                 <w10:wrap type="none"/>
               </v:rect>
-              <v:rect id="shape_0" stroked="f" o:allowincell="f" style="position:absolute;left:8855;top:14417;width:1215;height:244;mso-wrap-style:square;v-text-anchor:top">
+              <v:rect id="shape_0" stroked="f" o:allowincell="f" style="position:absolute;left:8855;top:14417;width:1213;height:242;mso-wrap-style:square;v-text-anchor:top">
                 <v:fill o:detectmouseclick="t" on="false"/>
                 <v:stroke color="#3465a4" joinstyle="round" endcap="flat"/>
                 <v:textbox>
@@ -5542,7 +6069,7 @@
                 </v:textbox>
                 <w10:wrap type="none"/>
               </v:rect>
-              <v:rect id="shape_0" stroked="f" o:allowincell="f" style="position:absolute;left:8863;top:14705;width:1213;height:244;mso-wrap-style:square;v-text-anchor:top">
+              <v:rect id="shape_0" stroked="f" o:allowincell="f" style="position:absolute;left:8863;top:14705;width:1211;height:242;mso-wrap-style:square;v-text-anchor:top">
                 <v:fill o:detectmouseclick="t" on="false"/>
                 <v:stroke color="#3465a4" joinstyle="round" endcap="flat"/>
                 <v:textbox>
@@ -5578,7 +6105,7 @@
                 <v:fill o:detectmouseclick="t" on="false"/>
                 <w10:wrap type="none"/>
               </v:line>
-              <v:rect id="shape_0" stroked="f" o:allowincell="f" style="position:absolute;left:7134;top:15150;width:2936;height:534;mso-wrap-style:square;v-text-anchor:top">
+              <v:rect id="shape_0" stroked="f" o:allowincell="f" style="position:absolute;left:7134;top:15150;width:2934;height:532;mso-wrap-style:square;v-text-anchor:top">
                 <v:fill o:detectmouseclick="t" on="false"/>
                 <v:stroke color="#3465a4" joinstyle="round" endcap="flat"/>
                 <v:textbox>
@@ -5628,6 +6155,125 @@
   <w:abstractNum w:abstractNumId="1">
     <w:lvl w:ilvl="0">
       <w:start w:val="1"/>
+      <w:numFmt w:val="none"/>
+      <w:suff w:val="nothing"/>
+      <w:lvlText w:val=""/>
+      <w:lvlJc w:val="start"/>
+      <w:pPr>
+        <w:tabs>
+          <w:tab w:val="num" w:pos="0"/>
+        </w:tabs>
+        <w:ind w:start="0" w:hanging="0"/>
+      </w:pPr>
+    </w:lvl>
+    <w:lvl w:ilvl="1">
+      <w:start w:val="1"/>
+      <w:numFmt w:val="none"/>
+      <w:suff w:val="nothing"/>
+      <w:lvlText w:val=""/>
+      <w:lvlJc w:val="start"/>
+      <w:pPr>
+        <w:tabs>
+          <w:tab w:val="num" w:pos="0"/>
+        </w:tabs>
+        <w:ind w:start="0" w:hanging="0"/>
+      </w:pPr>
+    </w:lvl>
+    <w:lvl w:ilvl="2">
+      <w:start w:val="1"/>
+      <w:numFmt w:val="none"/>
+      <w:suff w:val="nothing"/>
+      <w:lvlText w:val=""/>
+      <w:lvlJc w:val="start"/>
+      <w:pPr>
+        <w:tabs>
+          <w:tab w:val="num" w:pos="0"/>
+        </w:tabs>
+        <w:ind w:start="0" w:hanging="0"/>
+      </w:pPr>
+    </w:lvl>
+    <w:lvl w:ilvl="3">
+      <w:start w:val="1"/>
+      <w:numFmt w:val="none"/>
+      <w:suff w:val="nothing"/>
+      <w:lvlText w:val=""/>
+      <w:lvlJc w:val="start"/>
+      <w:pPr>
+        <w:tabs>
+          <w:tab w:val="num" w:pos="0"/>
+        </w:tabs>
+        <w:ind w:start="0" w:hanging="0"/>
+      </w:pPr>
+    </w:lvl>
+    <w:lvl w:ilvl="4">
+      <w:start w:val="1"/>
+      <w:numFmt w:val="none"/>
+      <w:suff w:val="nothing"/>
+      <w:lvlText w:val=""/>
+      <w:lvlJc w:val="start"/>
+      <w:pPr>
+        <w:tabs>
+          <w:tab w:val="num" w:pos="0"/>
+        </w:tabs>
+        <w:ind w:start="0" w:hanging="0"/>
+      </w:pPr>
+    </w:lvl>
+    <w:lvl w:ilvl="5">
+      <w:start w:val="1"/>
+      <w:numFmt w:val="none"/>
+      <w:suff w:val="nothing"/>
+      <w:lvlText w:val=""/>
+      <w:lvlJc w:val="start"/>
+      <w:pPr>
+        <w:tabs>
+          <w:tab w:val="num" w:pos="0"/>
+        </w:tabs>
+        <w:ind w:start="0" w:hanging="0"/>
+      </w:pPr>
+    </w:lvl>
+    <w:lvl w:ilvl="6">
+      <w:start w:val="1"/>
+      <w:numFmt w:val="none"/>
+      <w:suff w:val="nothing"/>
+      <w:lvlText w:val=""/>
+      <w:lvlJc w:val="start"/>
+      <w:pPr>
+        <w:tabs>
+          <w:tab w:val="num" w:pos="0"/>
+        </w:tabs>
+        <w:ind w:start="0" w:hanging="0"/>
+      </w:pPr>
+    </w:lvl>
+    <w:lvl w:ilvl="7">
+      <w:start w:val="1"/>
+      <w:numFmt w:val="none"/>
+      <w:suff w:val="nothing"/>
+      <w:lvlText w:val=""/>
+      <w:lvlJc w:val="start"/>
+      <w:pPr>
+        <w:tabs>
+          <w:tab w:val="num" w:pos="0"/>
+        </w:tabs>
+        <w:ind w:start="0" w:hanging="0"/>
+      </w:pPr>
+    </w:lvl>
+    <w:lvl w:ilvl="8">
+      <w:start w:val="1"/>
+      <w:numFmt w:val="none"/>
+      <w:suff w:val="nothing"/>
+      <w:lvlText w:val=""/>
+      <w:lvlJc w:val="start"/>
+      <w:pPr>
+        <w:tabs>
+          <w:tab w:val="num" w:pos="0"/>
+        </w:tabs>
+        <w:ind w:start="0" w:hanging="0"/>
+      </w:pPr>
+    </w:lvl>
+  </w:abstractNum>
+  <w:abstractNum w:abstractNumId="2">
+    <w:lvl w:ilvl="0">
+      <w:start w:val="1"/>
       <w:numFmt w:val="decimal"/>
       <w:lvlText w:val="%1."/>
       <w:lvlJc w:val="start"/>
@@ -5771,7 +6417,7 @@
       </w:rPr>
     </w:lvl>
   </w:abstractNum>
-  <w:abstractNum w:abstractNumId="2">
+  <w:abstractNum w:abstractNumId="3">
     <w:lvl w:ilvl="0">
       <w:start w:val="1"/>
       <w:numFmt w:val="bullet"/>
@@ -5926,7 +6572,7 @@
       </w:rPr>
     </w:lvl>
   </w:abstractNum>
-  <w:abstractNum w:abstractNumId="3">
+  <w:abstractNum w:abstractNumId="4">
     <w:lvl w:ilvl="0">
       <w:start w:val="1"/>
       <w:numFmt w:val="bullet"/>
@@ -6081,123 +6727,159 @@
       </w:rPr>
     </w:lvl>
   </w:abstractNum>
-  <w:abstractNum w:abstractNumId="4">
+  <w:abstractNum w:abstractNumId="5">
     <w:lvl w:ilvl="0">
       <w:start w:val="1"/>
-      <w:numFmt w:val="none"/>
-      <w:suff w:val="nothing"/>
-      <w:lvlText w:val=""/>
+      <w:numFmt w:val="bullet"/>
+      <w:lvlText w:val=""/>
       <w:lvlJc w:val="start"/>
       <w:pPr>
         <w:tabs>
-          <w:tab w:val="num" w:pos="0"/>
-        </w:tabs>
-        <w:ind w:start="0" w:hanging="0"/>
-      </w:pPr>
+          <w:tab w:val="num" w:pos="720"/>
+        </w:tabs>
+        <w:ind w:start="720" w:hanging="360"/>
+      </w:pPr>
+      <w:rPr>
+        <w:rFonts w:ascii="Symbol" w:hAnsi="Symbol" w:cs="Symbol" w:hint="default"/>
+        <w:sz w:val="28"/>
+        <w:szCs w:val="28"/>
+      </w:rPr>
     </w:lvl>
     <w:lvl w:ilvl="1">
       <w:start w:val="1"/>
-      <w:numFmt w:val="none"/>
-      <w:suff w:val="nothing"/>
-      <w:lvlText w:val=""/>
+      <w:numFmt w:val="bullet"/>
+      <w:lvlText w:val="◦"/>
       <w:lvlJc w:val="start"/>
       <w:pPr>
         <w:tabs>
-          <w:tab w:val="num" w:pos="0"/>
-        </w:tabs>
-        <w:ind w:start="0" w:hanging="0"/>
-      </w:pPr>
+          <w:tab w:val="num" w:pos="1080"/>
+        </w:tabs>
+        <w:ind w:start="1080" w:hanging="360"/>
+      </w:pPr>
+      <w:rPr>
+        <w:rFonts w:ascii="OpenSymbol" w:hAnsi="OpenSymbol" w:cs="OpenSymbol" w:hint="default"/>
+        <w:sz w:val="28"/>
+        <w:szCs w:val="28"/>
+      </w:rPr>
     </w:lvl>
     <w:lvl w:ilvl="2">
       <w:start w:val="1"/>
-      <w:numFmt w:val="none"/>
-      <w:suff w:val="nothing"/>
-      <w:lvlText w:val=""/>
+      <w:numFmt w:val="bullet"/>
+      <w:lvlText w:val="▪"/>
       <w:lvlJc w:val="start"/>
       <w:pPr>
         <w:tabs>
-          <w:tab w:val="num" w:pos="0"/>
-        </w:tabs>
-        <w:ind w:start="0" w:hanging="0"/>
-      </w:pPr>
+          <w:tab w:val="num" w:pos="1440"/>
+        </w:tabs>
+        <w:ind w:start="1440" w:hanging="360"/>
+      </w:pPr>
+      <w:rPr>
+        <w:rFonts w:ascii="OpenSymbol" w:hAnsi="OpenSymbol" w:cs="OpenSymbol" w:hint="default"/>
+        <w:sz w:val="28"/>
+        <w:szCs w:val="28"/>
+      </w:rPr>
     </w:lvl>
     <w:lvl w:ilvl="3">
       <w:start w:val="1"/>
-      <w:numFmt w:val="none"/>
-      <w:suff w:val="nothing"/>
-      <w:lvlText w:val=""/>
+      <w:numFmt w:val="bullet"/>
+      <w:lvlText w:val=""/>
       <w:lvlJc w:val="start"/>
       <w:pPr>
         <w:tabs>
-          <w:tab w:val="num" w:pos="0"/>
-        </w:tabs>
-        <w:ind w:start="0" w:hanging="0"/>
-      </w:pPr>
+          <w:tab w:val="num" w:pos="1800"/>
+        </w:tabs>
+        <w:ind w:start="1800" w:hanging="360"/>
+      </w:pPr>
+      <w:rPr>
+        <w:rFonts w:ascii="Symbol" w:hAnsi="Symbol" w:cs="Symbol" w:hint="default"/>
+        <w:sz w:val="28"/>
+        <w:szCs w:val="28"/>
+      </w:rPr>
     </w:lvl>
     <w:lvl w:ilvl="4">
       <w:start w:val="1"/>
-      <w:numFmt w:val="none"/>
-      <w:suff w:val="nothing"/>
-      <w:lvlText w:val=""/>
+      <w:numFmt w:val="bullet"/>
+      <w:lvlText w:val="◦"/>
       <w:lvlJc w:val="start"/>
       <w:pPr>
         <w:tabs>
-          <w:tab w:val="num" w:pos="0"/>
-        </w:tabs>
-        <w:ind w:start="0" w:hanging="0"/>
-      </w:pPr>
+          <w:tab w:val="num" w:pos="2160"/>
+        </w:tabs>
+        <w:ind w:start="2160" w:hanging="360"/>
+      </w:pPr>
+      <w:rPr>
+        <w:rFonts w:ascii="OpenSymbol" w:hAnsi="OpenSymbol" w:cs="OpenSymbol" w:hint="default"/>
+        <w:sz w:val="28"/>
+        <w:szCs w:val="28"/>
+      </w:rPr>
     </w:lvl>
     <w:lvl w:ilvl="5">
       <w:start w:val="1"/>
-      <w:numFmt w:val="none"/>
-      <w:suff w:val="nothing"/>
-      <w:lvlText w:val=""/>
+      <w:numFmt w:val="bullet"/>
+      <w:lvlText w:val="▪"/>
       <w:lvlJc w:val="start"/>
       <w:pPr>
         <w:tabs>
-          <w:tab w:val="num" w:pos="0"/>
-        </w:tabs>
-        <w:ind w:start="0" w:hanging="0"/>
-      </w:pPr>
+          <w:tab w:val="num" w:pos="2520"/>
+        </w:tabs>
+        <w:ind w:start="2520" w:hanging="360"/>
+      </w:pPr>
+      <w:rPr>
+        <w:rFonts w:ascii="OpenSymbol" w:hAnsi="OpenSymbol" w:cs="OpenSymbol" w:hint="default"/>
+        <w:sz w:val="28"/>
+        <w:szCs w:val="28"/>
+      </w:rPr>
     </w:lvl>
     <w:lvl w:ilvl="6">
       <w:start w:val="1"/>
-      <w:numFmt w:val="none"/>
-      <w:suff w:val="nothing"/>
-      <w:lvlText w:val=""/>
+      <w:numFmt w:val="bullet"/>
+      <w:lvlText w:val=""/>
       <w:lvlJc w:val="start"/>
       <w:pPr>
         <w:tabs>
-          <w:tab w:val="num" w:pos="0"/>
-        </w:tabs>
-        <w:ind w:start="0" w:hanging="0"/>
-      </w:pPr>
+          <w:tab w:val="num" w:pos="2880"/>
+        </w:tabs>
+        <w:ind w:start="2880" w:hanging="360"/>
+      </w:pPr>
+      <w:rPr>
+        <w:rFonts w:ascii="Symbol" w:hAnsi="Symbol" w:cs="Symbol" w:hint="default"/>
+        <w:sz w:val="28"/>
+        <w:szCs w:val="28"/>
+      </w:rPr>
     </w:lvl>
     <w:lvl w:ilvl="7">
       <w:start w:val="1"/>
-      <w:numFmt w:val="none"/>
-      <w:suff w:val="nothing"/>
-      <w:lvlText w:val=""/>
+      <w:numFmt w:val="bullet"/>
+      <w:lvlText w:val="◦"/>
       <w:lvlJc w:val="start"/>
       <w:pPr>
         <w:tabs>
-          <w:tab w:val="num" w:pos="0"/>
-        </w:tabs>
-        <w:ind w:start="0" w:hanging="0"/>
-      </w:pPr>
+          <w:tab w:val="num" w:pos="3240"/>
+        </w:tabs>
+        <w:ind w:start="3240" w:hanging="360"/>
+      </w:pPr>
+      <w:rPr>
+        <w:rFonts w:ascii="OpenSymbol" w:hAnsi="OpenSymbol" w:cs="OpenSymbol" w:hint="default"/>
+        <w:sz w:val="28"/>
+        <w:szCs w:val="28"/>
+      </w:rPr>
     </w:lvl>
     <w:lvl w:ilvl="8">
       <w:start w:val="1"/>
-      <w:numFmt w:val="none"/>
-      <w:suff w:val="nothing"/>
-      <w:lvlText w:val=""/>
+      <w:numFmt w:val="bullet"/>
+      <w:lvlText w:val="▪"/>
       <w:lvlJc w:val="start"/>
       <w:pPr>
         <w:tabs>
-          <w:tab w:val="num" w:pos="0"/>
-        </w:tabs>
-        <w:ind w:start="0" w:hanging="0"/>
-      </w:pPr>
+          <w:tab w:val="num" w:pos="3600"/>
+        </w:tabs>
+        <w:ind w:start="3600" w:hanging="360"/>
+      </w:pPr>
+      <w:rPr>
+        <w:rFonts w:ascii="OpenSymbol" w:hAnsi="OpenSymbol" w:cs="OpenSymbol" w:hint="default"/>
+        <w:sz w:val="28"/>
+        <w:szCs w:val="28"/>
+      </w:rPr>
     </w:lvl>
   </w:abstractNum>
   <w:num w:numId="1">
@@ -6211,6 +6893,9 @@
   </w:num>
   <w:num w:numId="4">
     <w:abstractNumId w:val="4"/>
+  </w:num>
+  <w:num w:numId="5">
+    <w:abstractNumId w:val="5"/>
   </w:num>
 </w:numbering>
 </file>
@@ -7279,6 +7964,19 @@
     <w:pPr/>
     <w:rPr/>
   </w:style>
+  <w:style w:type="paragraph" w:styleId="PreformattedText">
+    <w:name w:val="Preformatted Text"/>
+    <w:basedOn w:val="Normal"/>
+    <w:qFormat/>
+    <w:pPr>
+      <w:spacing w:before="0" w:after="0"/>
+    </w:pPr>
+    <w:rPr>
+      <w:rFonts w:ascii="Liberation Mono" w:hAnsi="Liberation Mono" w:eastAsia="Liberation Mono" w:cs="Liberation Mono"/>
+      <w:sz w:val="20"/>
+      <w:szCs w:val="20"/>
+    </w:rPr>
+  </w:style>
   <w:style w:type="numbering" w:styleId="NoList" w:default="1">
     <w:name w:val="No List"/>
     <w:uiPriority w:val="99"/>

</xml_diff>